<commit_message>
VTS59 review typo fixes
</commit_message>
<xml_diff>
--- a/Service-Specification-for-VTS-Traffic-Clearance-1.6.docx
+++ b/Service-Specification-for-VTS-Traffic-Clearance-1.6.docx
@@ -6092,16 +6092,38 @@
               <w:contextualSpacing w:val="0"/>
             </w:pPr>
             <w:proofErr w:type="gramStart"/>
-            <w:ins w:id="24" w:author="Ramin Miraftabi" w:date="2026-03-03T17:11:00Z" w16du:dateUtc="2026-03-03T16:11:00Z">
+            <w:ins w:id="24" w:author="Ramin Miraftabi" w:date="2026-03-05T11:57:00Z" w16du:dateUtc="2026-03-05T10:57:00Z">
               <w:r>
-                <w:t>urn.mrn.iala</w:t>
-              </w:r>
-              <w:proofErr w:type="gramEnd"/>
-              <w:r>
-                <w:t>:techsvc:ss0001:ed1.6</w:t>
+                <w:t>u</w:t>
               </w:r>
             </w:ins>
-            <w:del w:id="25" w:author="Ramin Miraftabi" w:date="2026-03-03T17:11:00Z" w16du:dateUtc="2026-03-03T16:11:00Z">
+            <w:ins w:id="25" w:author="Ramin Miraftabi" w:date="2026-03-03T17:11:00Z" w16du:dateUtc="2026-03-03T16:11:00Z">
+              <w:r>
+                <w:t>rn</w:t>
+              </w:r>
+            </w:ins>
+            <w:ins w:id="26" w:author="Ramin Miraftabi" w:date="2026-03-05T11:57:00Z" w16du:dateUtc="2026-03-05T10:57:00Z">
+              <w:r>
+                <w:t>:</w:t>
+              </w:r>
+            </w:ins>
+            <w:ins w:id="27" w:author="Ramin Miraftabi" w:date="2026-03-03T17:11:00Z" w16du:dateUtc="2026-03-03T16:11:00Z">
+              <w:r>
+                <w:t>mrn</w:t>
+              </w:r>
+            </w:ins>
+            <w:proofErr w:type="gramEnd"/>
+            <w:ins w:id="28" w:author="Ramin Miraftabi" w:date="2026-03-05T11:57:00Z" w16du:dateUtc="2026-03-05T10:57:00Z">
+              <w:r>
+                <w:t>:</w:t>
+              </w:r>
+            </w:ins>
+            <w:ins w:id="29" w:author="Ramin Miraftabi" w:date="2026-03-03T17:11:00Z" w16du:dateUtc="2026-03-03T16:11:00Z">
+              <w:r>
+                <w:t>iala:techsvc:ss0001:ed1.6</w:t>
+              </w:r>
+            </w:ins>
+            <w:del w:id="30" w:author="Ramin Miraftabi" w:date="2026-03-03T17:11:00Z" w16du:dateUtc="2026-03-03T16:11:00Z">
               <w:r>
                 <w:delText>urn:mrn:iala:techsvc:ss:vts:tcs:1.5</w:delText>
               </w:r>
@@ -6158,12 +6180,12 @@
             <w:r>
               <w:t>1.</w:t>
             </w:r>
-            <w:del w:id="26" w:author="Ramin Miraftabi" w:date="2026-03-03T17:11:00Z" w16du:dateUtc="2026-03-03T16:11:00Z">
+            <w:del w:id="31" w:author="Ramin Miraftabi" w:date="2026-03-03T17:11:00Z" w16du:dateUtc="2026-03-03T16:11:00Z">
               <w:r>
                 <w:delText>5</w:delText>
               </w:r>
             </w:del>
-            <w:ins w:id="27" w:author="Ramin Miraftabi" w:date="2026-03-03T17:11:00Z" w16du:dateUtc="2026-03-03T16:11:00Z">
+            <w:ins w:id="32" w:author="Ramin Miraftabi" w:date="2026-03-03T17:11:00Z" w16du:dateUtc="2026-03-03T16:11:00Z">
               <w:r>
                 <w:t>6</w:t>
               </w:r>
@@ -6381,13 +6403,13 @@
       <w:pPr>
         <w:pStyle w:val="Heading1"/>
       </w:pPr>
-      <w:bookmarkStart w:id="28" w:name="_Toc196547457"/>
+      <w:bookmarkStart w:id="33" w:name="_Toc196547457"/>
       <w:bookmarkEnd w:id="23"/>
       <w:r>
         <w:lastRenderedPageBreak/>
         <w:t>Operational context</w:t>
       </w:r>
-      <w:bookmarkEnd w:id="28"/>
+      <w:bookmarkEnd w:id="33"/>
     </w:p>
     <w:p>
       <w:pPr>
@@ -6401,12 +6423,12 @@
       <w:pPr>
         <w:pStyle w:val="BodyText"/>
         <w:rPr>
-          <w:del w:id="29" w:author="Pitkänen Juho" w:date="2026-03-03T16:03:00Z" w16du:dateUtc="2026-03-03T15:03:00Z"/>
-          <w:lang w:val="en-US"/>
-        </w:rPr>
-      </w:pPr>
-      <w:bookmarkStart w:id="30" w:name="_Hlk196363732"/>
-      <w:del w:id="31" w:author="Pitkänen Juho" w:date="2026-03-03T16:03:00Z" w16du:dateUtc="2026-03-03T15:03:00Z">
+          <w:del w:id="34" w:author="Pitkänen Juho" w:date="2026-03-03T16:03:00Z" w16du:dateUtc="2026-03-03T15:03:00Z"/>
+          <w:lang w:val="en-US"/>
+        </w:rPr>
+      </w:pPr>
+      <w:bookmarkStart w:id="35" w:name="_Hlk196363732"/>
+      <w:del w:id="36" w:author="Pitkänen Juho" w:date="2026-03-03T16:03:00Z" w16du:dateUtc="2026-03-03T15:03:00Z">
         <w:r>
           <w:rPr>
             <w:lang w:val="en-US"/>
@@ -6481,7 +6503,7 @@
           <w:lang w:val="en-US"/>
         </w:rPr>
       </w:pPr>
-      <w:del w:id="32" w:author="Pitkänen Juho" w:date="2026-03-03T16:03:00Z" w16du:dateUtc="2026-03-03T15:03:00Z">
+      <w:del w:id="37" w:author="Pitkänen Juho" w:date="2026-03-03T16:03:00Z" w16du:dateUtc="2026-03-03T15:03:00Z">
         <w:r>
           <w:rPr>
             <w:lang w:val="en-US"/>
@@ -6620,7 +6642,7 @@
         </w:rPr>
         <w:t xml:space="preserve">entering </w:t>
       </w:r>
-      <w:del w:id="33" w:author="Pitkänen Juho" w:date="2026-03-03T16:03:00Z" w16du:dateUtc="2026-03-03T15:03:00Z">
+      <w:del w:id="38" w:author="Pitkänen Juho" w:date="2026-03-03T16:03:00Z" w16du:dateUtc="2026-03-03T15:03:00Z">
         <w:r>
           <w:rPr>
             <w:lang w:val="en-US"/>
@@ -6664,7 +6686,7 @@
           <w:lang w:val="en-US"/>
         </w:rPr>
       </w:pPr>
-      <w:del w:id="34" w:author="Pitkänen Juho" w:date="2026-03-03T16:03:00Z" w16du:dateUtc="2026-03-03T15:03:00Z">
+      <w:del w:id="39" w:author="Pitkänen Juho" w:date="2026-03-03T16:03:00Z" w16du:dateUtc="2026-03-03T15:03:00Z">
         <w:r>
           <w:rPr>
             <w:lang w:val="en-US"/>
@@ -6700,7 +6722,7 @@
           <w:lang w:val="en-US"/>
         </w:rPr>
       </w:pPr>
-      <w:del w:id="35" w:author="Pitkänen Juho" w:date="2026-03-03T16:03:00Z" w16du:dateUtc="2026-03-03T15:03:00Z">
+      <w:del w:id="40" w:author="Pitkänen Juho" w:date="2026-03-03T16:03:00Z" w16du:dateUtc="2026-03-03T15:03:00Z">
         <w:r>
           <w:rPr>
             <w:lang w:val="en-US"/>
@@ -6756,7 +6778,7 @@
           <w:lang w:val="en-US"/>
         </w:rPr>
       </w:pPr>
-      <w:del w:id="36" w:author="Pitkänen Juho" w:date="2026-03-03T16:03:00Z" w16du:dateUtc="2026-03-03T15:03:00Z">
+      <w:del w:id="41" w:author="Pitkänen Juho" w:date="2026-03-03T16:03:00Z" w16du:dateUtc="2026-03-03T15:03:00Z">
         <w:r>
           <w:rPr>
             <w:lang w:val="en-US"/>
@@ -6940,15 +6962,15 @@
           <w:lang w:val="en-US"/>
         </w:rPr>
       </w:pPr>
-      <w:bookmarkStart w:id="37" w:name="_Toc196547458"/>
-      <w:bookmarkEnd w:id="30"/>
+      <w:bookmarkStart w:id="42" w:name="_Toc196547458"/>
+      <w:bookmarkEnd w:id="35"/>
       <w:r>
         <w:rPr>
           <w:lang w:val="en-US"/>
         </w:rPr>
         <w:t>Use cases for service</w:t>
       </w:r>
-      <w:bookmarkEnd w:id="37"/>
+      <w:bookmarkEnd w:id="42"/>
     </w:p>
     <w:p>
       <w:pPr>
@@ -7023,7 +7045,7 @@
       <w:pPr>
         <w:pStyle w:val="Caption"/>
       </w:pPr>
-      <w:bookmarkStart w:id="38" w:name="_Toc196547569"/>
+      <w:bookmarkStart w:id="43" w:name="_Toc196547569"/>
       <w:r>
         <w:t xml:space="preserve">Figure </w:t>
       </w:r>
@@ -7038,7 +7060,7 @@
       <w:r>
         <w:t xml:space="preserve"> Traffic Clearance Service Use Cases</w:t>
       </w:r>
-      <w:bookmarkEnd w:id="38"/>
+      <w:bookmarkEnd w:id="43"/>
     </w:p>
     <w:p>
       <w:pPr>
@@ -7067,7 +7089,7 @@
           <w:lang w:val="en-US"/>
         </w:rPr>
       </w:pPr>
-      <w:bookmarkStart w:id="39" w:name="_Toc196547459"/>
+      <w:bookmarkStart w:id="44" w:name="_Toc196547459"/>
       <w:r>
         <w:rPr>
           <w:lang w:val="en-US"/>
@@ -7080,7 +7102,7 @@
         </w:rPr>
         <w:t>Departing vessels from berth or anchorage.</w:t>
       </w:r>
-      <w:bookmarkEnd w:id="39"/>
+      <w:bookmarkEnd w:id="44"/>
     </w:p>
     <w:p>
       <w:pPr>
@@ -7258,14 +7280,14 @@
           <w:lang w:val="en-US"/>
         </w:rPr>
       </w:pPr>
-      <w:bookmarkStart w:id="40" w:name="_Toc196547460"/>
+      <w:bookmarkStart w:id="45" w:name="_Toc196547460"/>
       <w:r>
         <w:rPr>
           <w:lang w:val="en-US"/>
         </w:rPr>
         <w:t>Use Case 2 – Entering, leaving or passing through VTS area</w:t>
       </w:r>
-      <w:bookmarkEnd w:id="40"/>
+      <w:bookmarkEnd w:id="45"/>
     </w:p>
     <w:p>
       <w:pPr>
@@ -7281,14 +7303,14 @@
           <w:lang w:val="en-US"/>
         </w:rPr>
       </w:pPr>
-      <w:bookmarkStart w:id="41" w:name="_Hlk146193039"/>
+      <w:bookmarkStart w:id="46" w:name="_Hlk146193039"/>
       <w:r>
         <w:rPr>
           <w:lang w:val="en-US"/>
         </w:rPr>
         <w:t xml:space="preserve">Vessel is about to enter or pass through the VTS area </w:t>
       </w:r>
-      <w:bookmarkEnd w:id="41"/>
+      <w:bookmarkEnd w:id="46"/>
     </w:p>
     <w:p>
       <w:pPr>
@@ -7405,7 +7427,7 @@
           <w:lang w:val="en-US"/>
         </w:rPr>
       </w:pPr>
-      <w:bookmarkStart w:id="42" w:name="_Hlk146185398"/>
+      <w:bookmarkStart w:id="47" w:name="_Hlk146185398"/>
       <w:r>
         <w:rPr>
           <w:lang w:val="en-US"/>
@@ -7426,7 +7448,7 @@
         </w:rPr>
         <w:t xml:space="preserve"> acknowledged by the VTS and sends permission to proceed through the VTS area</w:t>
       </w:r>
-      <w:bookmarkEnd w:id="42"/>
+      <w:bookmarkEnd w:id="47"/>
     </w:p>
     <w:p>
       <w:pPr>
@@ -7456,14 +7478,14 @@
           <w:lang w:val="en-US"/>
         </w:rPr>
       </w:pPr>
-      <w:bookmarkStart w:id="43" w:name="_Toc196547461"/>
+      <w:bookmarkStart w:id="48" w:name="_Toc196547461"/>
       <w:r>
         <w:rPr>
           <w:lang w:val="en-US"/>
         </w:rPr>
         <w:t>Use Case 3 - Arriving vessels taking berth</w:t>
       </w:r>
-      <w:bookmarkEnd w:id="43"/>
+      <w:bookmarkEnd w:id="48"/>
     </w:p>
     <w:p>
       <w:pPr>
@@ -7647,14 +7669,14 @@
           <w:lang w:val="en-US"/>
         </w:rPr>
       </w:pPr>
-      <w:bookmarkStart w:id="44" w:name="_Toc196547462"/>
+      <w:bookmarkStart w:id="49" w:name="_Toc196547462"/>
       <w:r>
         <w:rPr>
           <w:lang w:val="en-US"/>
         </w:rPr>
         <w:t>Use Case 4 – Arriving vessel heading for anchorage</w:t>
       </w:r>
-      <w:bookmarkEnd w:id="44"/>
+      <w:bookmarkEnd w:id="49"/>
     </w:p>
     <w:p>
       <w:pPr>
@@ -7847,7 +7869,7 @@
           <w:lang w:val="en-US"/>
         </w:rPr>
       </w:pPr>
-      <w:bookmarkStart w:id="45" w:name="_Toc196547463"/>
+      <w:bookmarkStart w:id="50" w:name="_Toc196547463"/>
       <w:r>
         <w:rPr>
           <w:lang w:val="en-US"/>
@@ -7860,7 +7882,7 @@
         </w:rPr>
         <w:t>Transiting within a VTS Area.</w:t>
       </w:r>
-      <w:bookmarkEnd w:id="45"/>
+      <w:bookmarkEnd w:id="50"/>
     </w:p>
     <w:p>
       <w:pPr>
@@ -8029,9 +8051,9 @@
           <w:lang w:val="en-US"/>
         </w:rPr>
       </w:pPr>
-      <w:bookmarkStart w:id="46" w:name="_Toc196547464"/>
-      <w:commentRangeStart w:id="47"/>
-      <w:commentRangeStart w:id="48"/>
+      <w:bookmarkStart w:id="51" w:name="_Toc196547464"/>
+      <w:commentRangeStart w:id="52"/>
+      <w:commentRangeStart w:id="53"/>
       <w:r>
         <w:rPr>
           <w:lang w:val="en-US"/>
@@ -8051,24 +8073,24 @@
         </w:rPr>
         <w:t>xternal influence to change Traffic Clearance</w:t>
       </w:r>
-      <w:bookmarkEnd w:id="46"/>
-      <w:commentRangeEnd w:id="47"/>
+      <w:bookmarkEnd w:id="51"/>
+      <w:commentRangeEnd w:id="52"/>
       <w:r>
         <w:rPr>
           <w:rStyle w:val="CommentReference"/>
           <w:i w:val="0"/>
           <w:color w:val="auto"/>
         </w:rPr>
-        <w:commentReference w:id="47"/>
-      </w:r>
-      <w:commentRangeEnd w:id="48"/>
+        <w:commentReference w:id="52"/>
+      </w:r>
+      <w:commentRangeEnd w:id="53"/>
       <w:r>
         <w:rPr>
           <w:rStyle w:val="CommentReference"/>
           <w:i w:val="0"/>
           <w:color w:val="auto"/>
         </w:rPr>
-        <w:commentReference w:id="48"/>
+        <w:commentReference w:id="53"/>
       </w:r>
     </w:p>
     <w:p>
@@ -8135,11 +8157,11 @@
       <w:pPr>
         <w:pStyle w:val="Heading3"/>
         <w:rPr>
-          <w:ins w:id="49" w:author="Pitkänen Juho" w:date="2026-03-03T16:07:00Z" w16du:dateUtc="2026-03-03T15:07:00Z"/>
-          <w:lang w:val="en-US"/>
-        </w:rPr>
-      </w:pPr>
-      <w:ins w:id="50" w:author="Pitkänen Juho" w:date="2026-03-03T16:07:00Z" w16du:dateUtc="2026-03-03T15:07:00Z">
+          <w:ins w:id="54" w:author="Pitkänen Juho" w:date="2026-03-03T16:07:00Z" w16du:dateUtc="2026-03-03T15:07:00Z"/>
+          <w:lang w:val="en-US"/>
+        </w:rPr>
+      </w:pPr>
+      <w:ins w:id="55" w:author="Pitkänen Juho" w:date="2026-03-03T16:07:00Z" w16du:dateUtc="2026-03-03T15:07:00Z">
         <w:r>
           <w:rPr>
             <w:lang w:val="en-US"/>
@@ -8147,7 +8169,7 @@
           <w:t xml:space="preserve">Use Case </w:t>
         </w:r>
       </w:ins>
-      <w:ins w:id="51" w:author="Pitkänen Juho" w:date="2026-03-03T16:08:00Z" w16du:dateUtc="2026-03-03T15:08:00Z">
+      <w:ins w:id="56" w:author="Pitkänen Juho" w:date="2026-03-03T16:08:00Z" w16du:dateUtc="2026-03-03T15:08:00Z">
         <w:r>
           <w:rPr>
             <w:lang w:val="en-US"/>
@@ -8155,7 +8177,7 @@
           <w:t>7</w:t>
         </w:r>
       </w:ins>
-      <w:ins w:id="52" w:author="Pitkänen Juho" w:date="2026-03-03T16:07:00Z" w16du:dateUtc="2026-03-03T15:07:00Z">
+      <w:ins w:id="57" w:author="Pitkänen Juho" w:date="2026-03-03T16:07:00Z" w16du:dateUtc="2026-03-03T15:07:00Z">
         <w:r>
           <w:rPr>
             <w:lang w:val="en-US"/>
@@ -8163,7 +8185,7 @@
           <w:t xml:space="preserve"> </w:t>
         </w:r>
       </w:ins>
-      <w:ins w:id="53" w:author="Pitkänen Juho" w:date="2026-03-03T16:08:00Z" w16du:dateUtc="2026-03-03T15:08:00Z">
+      <w:ins w:id="58" w:author="Pitkänen Juho" w:date="2026-03-03T16:08:00Z" w16du:dateUtc="2026-03-03T15:08:00Z">
         <w:r>
           <w:rPr>
             <w:lang w:val="en-US"/>
@@ -8171,7 +8193,7 @@
           <w:t>–</w:t>
         </w:r>
       </w:ins>
-      <w:ins w:id="54" w:author="Pitkänen Juho" w:date="2026-03-03T16:07:00Z" w16du:dateUtc="2026-03-03T15:07:00Z">
+      <w:ins w:id="59" w:author="Pitkänen Juho" w:date="2026-03-03T16:07:00Z" w16du:dateUtc="2026-03-03T15:07:00Z">
         <w:r>
           <w:rPr>
             <w:lang w:val="en-US"/>
@@ -8179,7 +8201,7 @@
           <w:t xml:space="preserve"> </w:t>
         </w:r>
       </w:ins>
-      <w:ins w:id="55" w:author="Pitkänen Juho" w:date="2026-03-03T16:08:00Z" w16du:dateUtc="2026-03-03T15:08:00Z">
+      <w:ins w:id="60" w:author="Pitkänen Juho" w:date="2026-03-03T16:08:00Z" w16du:dateUtc="2026-03-03T15:08:00Z">
         <w:r>
           <w:rPr>
             <w:lang w:val="en-US"/>
@@ -8193,16 +8215,16 @@
         <w:pStyle w:val="BodyText"/>
         <w:spacing w:before="120"/>
         <w:rPr>
-          <w:ins w:id="56" w:author="Pitkänen Juho" w:date="2026-03-03T16:07:00Z" w16du:dateUtc="2026-03-03T15:07:00Z"/>
-          <w:lang w:val="en-US"/>
-          <w:rPrChange w:id="57" w:author="Pitkänen Juho" w:date="2026-03-03T16:07:00Z" w16du:dateUtc="2026-03-03T15:07:00Z">
+          <w:ins w:id="61" w:author="Pitkänen Juho" w:date="2026-03-03T16:07:00Z" w16du:dateUtc="2026-03-03T15:07:00Z"/>
+          <w:lang w:val="en-US"/>
+          <w:rPrChange w:id="62" w:author="Pitkänen Juho" w:date="2026-03-03T16:07:00Z" w16du:dateUtc="2026-03-03T15:07:00Z">
             <w:rPr>
-              <w:ins w:id="58" w:author="Pitkänen Juho" w:date="2026-03-03T16:07:00Z" w16du:dateUtc="2026-03-03T15:07:00Z"/>
+              <w:ins w:id="63" w:author="Pitkänen Juho" w:date="2026-03-03T16:07:00Z" w16du:dateUtc="2026-03-03T15:07:00Z"/>
             </w:rPr>
           </w:rPrChange>
         </w:rPr>
       </w:pPr>
-      <w:ins w:id="59" w:author="Pitkänen Juho" w:date="2026-03-03T16:08:00Z" w16du:dateUtc="2026-03-03T15:08:00Z">
+      <w:ins w:id="64" w:author="Pitkänen Juho" w:date="2026-03-03T16:08:00Z" w16du:dateUtc="2026-03-03T15:08:00Z">
         <w:r>
           <w:rPr>
             <w:lang w:val="en-US"/>
@@ -8210,7 +8232,7 @@
           <w:t>See IALA G1191 f</w:t>
         </w:r>
       </w:ins>
-      <w:ins w:id="60" w:author="Pitkänen Juho" w:date="2026-03-03T16:09:00Z" w16du:dateUtc="2026-03-03T15:09:00Z">
+      <w:ins w:id="65" w:author="Pitkänen Juho" w:date="2026-03-03T16:09:00Z" w16du:dateUtc="2026-03-03T15:09:00Z">
         <w:r>
           <w:rPr>
             <w:lang w:val="en-US"/>
@@ -8318,7 +8340,7 @@
       <w:pPr>
         <w:pStyle w:val="Caption"/>
       </w:pPr>
-      <w:bookmarkStart w:id="61" w:name="_Toc196547570"/>
+      <w:bookmarkStart w:id="66" w:name="_Toc196547570"/>
       <w:r>
         <w:t xml:space="preserve">Figure </w:t>
       </w:r>
@@ -8333,7 +8355,7 @@
       <w:r>
         <w:t xml:space="preserve"> Traffic Clearance dataflow</w:t>
       </w:r>
-      <w:bookmarkEnd w:id="61"/>
+      <w:bookmarkEnd w:id="66"/>
     </w:p>
     <w:p>
       <w:pPr>
@@ -8343,7 +8365,7 @@
           <w:lang w:val="en-US"/>
         </w:rPr>
       </w:pPr>
-      <w:bookmarkStart w:id="62" w:name="_Toc196547465"/>
+      <w:bookmarkStart w:id="67" w:name="_Toc196547465"/>
       <w:r>
         <w:rPr>
           <w:lang w:val="en-US"/>
@@ -8351,7 +8373,7 @@
         <w:lastRenderedPageBreak/>
         <w:t>The business process of a traffic clearance request</w:t>
       </w:r>
-      <w:bookmarkEnd w:id="62"/>
+      <w:bookmarkEnd w:id="67"/>
     </w:p>
     <w:p>
       <w:pPr>
@@ -8438,7 +8460,7 @@
       <w:pPr>
         <w:pStyle w:val="Caption"/>
       </w:pPr>
-      <w:bookmarkStart w:id="63" w:name="_Toc196547571"/>
+      <w:bookmarkStart w:id="68" w:name="_Toc196547571"/>
       <w:r>
         <w:t xml:space="preserve">Figure </w:t>
       </w:r>
@@ -8453,7 +8475,7 @@
       <w:r>
         <w:t xml:space="preserve"> Traffic Clearance Business Process</w:t>
       </w:r>
-      <w:bookmarkEnd w:id="63"/>
+      <w:bookmarkEnd w:id="68"/>
     </w:p>
     <w:p>
       <w:pPr>
@@ -8462,14 +8484,14 @@
           <w:lang w:val="en-US"/>
         </w:rPr>
       </w:pPr>
-      <w:bookmarkStart w:id="64" w:name="_Toc196547466"/>
+      <w:bookmarkStart w:id="69" w:name="_Toc196547466"/>
       <w:r>
         <w:rPr>
           <w:lang w:val="en-US"/>
         </w:rPr>
         <w:t>Functional and non-functional requirements</w:t>
       </w:r>
-      <w:bookmarkEnd w:id="64"/>
+      <w:bookmarkEnd w:id="69"/>
     </w:p>
     <w:p>
       <w:pPr>
@@ -8500,7 +8522,7 @@
           <w:lang w:val="en-US"/>
         </w:rPr>
       </w:pPr>
-      <w:bookmarkStart w:id="65" w:name="_Toc196547467"/>
+      <w:bookmarkStart w:id="70" w:name="_Toc196547467"/>
       <w:r>
         <w:rPr>
           <w:lang w:val="en-US"/>
@@ -8508,7 +8530,7 @@
         <w:lastRenderedPageBreak/>
         <w:t>Functional requirements</w:t>
       </w:r>
-      <w:bookmarkEnd w:id="65"/>
+      <w:bookmarkEnd w:id="70"/>
     </w:p>
     <w:tbl>
       <w:tblPr>
@@ -11004,11 +11026,11 @@
     <w:p>
       <w:pPr>
         <w:rPr>
-          <w:ins w:id="66" w:author="Ramin Miraftabi" w:date="2026-03-05T10:05:00Z" w16du:dateUtc="2026-03-05T09:05:00Z"/>
-          <w:lang w:val="en-US"/>
-        </w:rPr>
-      </w:pPr>
-      <w:bookmarkStart w:id="67" w:name="_Toc196547468"/>
+          <w:ins w:id="71" w:author="Ramin Miraftabi" w:date="2026-03-05T10:05:00Z" w16du:dateUtc="2026-03-05T09:05:00Z"/>
+          <w:lang w:val="en-US"/>
+        </w:rPr>
+      </w:pPr>
+      <w:bookmarkStart w:id="72" w:name="_Toc196547468"/>
     </w:p>
     <w:tbl>
       <w:tblPr>
@@ -11023,7 +11045,7 @@
       </w:tblGrid>
       <w:tr>
         <w:trPr>
-          <w:ins w:id="68" w:author="Ramin Miraftabi" w:date="2026-03-05T10:06:00Z" w16du:dateUtc="2026-03-05T09:06:00Z"/>
+          <w:ins w:id="73" w:author="Ramin Miraftabi" w:date="2026-03-05T10:06:00Z" w16du:dateUtc="2026-03-05T09:06:00Z"/>
         </w:trPr>
         <w:tc>
           <w:tcPr>
@@ -11039,14 +11061,14 @@
               </w:numPr>
               <w:spacing w:line="240" w:lineRule="auto"/>
               <w:rPr>
-                <w:ins w:id="69" w:author="Ramin Miraftabi" w:date="2026-03-05T10:06:00Z" w16du:dateUtc="2026-03-05T09:06:00Z"/>
+                <w:ins w:id="74" w:author="Ramin Miraftabi" w:date="2026-03-05T10:06:00Z" w16du:dateUtc="2026-03-05T09:06:00Z"/>
                 <w:b/>
                 <w:bCs/>
                 <w:color w:val="00558C"/>
               </w:rPr>
             </w:pPr>
-            <w:bookmarkStart w:id="70" w:name="_Hlk196460357"/>
-            <w:ins w:id="71" w:author="Ramin Miraftabi" w:date="2026-03-05T10:06:00Z" w16du:dateUtc="2026-03-05T09:06:00Z">
+            <w:bookmarkStart w:id="75" w:name="_Hlk196460357"/>
+            <w:ins w:id="76" w:author="Ramin Miraftabi" w:date="2026-03-05T10:06:00Z" w16du:dateUtc="2026-03-05T09:06:00Z">
               <w:r>
                 <w:rPr>
                   <w:b/>
@@ -11073,10 +11095,10 @@
               </w:numPr>
               <w:spacing w:line="240" w:lineRule="auto"/>
               <w:rPr>
-                <w:ins w:id="72" w:author="Ramin Miraftabi" w:date="2026-03-05T10:06:00Z" w16du:dateUtc="2026-03-05T09:06:00Z"/>
-              </w:rPr>
-            </w:pPr>
-            <w:ins w:id="73" w:author="Ramin Miraftabi" w:date="2026-03-05T10:06:00Z" w16du:dateUtc="2026-03-05T09:06:00Z">
+                <w:ins w:id="77" w:author="Ramin Miraftabi" w:date="2026-03-05T10:06:00Z" w16du:dateUtc="2026-03-05T09:06:00Z"/>
+              </w:rPr>
+            </w:pPr>
+            <w:ins w:id="78" w:author="Ramin Miraftabi" w:date="2026-03-05T10:06:00Z" w16du:dateUtc="2026-03-05T09:06:00Z">
               <w:r>
                 <w:t>TCS</w:t>
               </w:r>
@@ -11085,66 +11107,6 @@
               </w:r>
               <w:r>
                 <w:t>11</w:t>
-              </w:r>
-            </w:ins>
-          </w:p>
-        </w:tc>
-      </w:tr>
-      <w:tr>
-        <w:trPr>
-          <w:ins w:id="74" w:author="Ramin Miraftabi" w:date="2026-03-05T10:06:00Z" w16du:dateUtc="2026-03-05T09:06:00Z"/>
-        </w:trPr>
-        <w:tc>
-          <w:tcPr>
-            <w:tcW w:w="2405" w:type="dxa"/>
-            <w:vAlign w:val="center"/>
-          </w:tcPr>
-          <w:p>
-            <w:pPr>
-              <w:pStyle w:val="Bullet1"/>
-              <w:numPr>
-                <w:ilvl w:val="0"/>
-                <w:numId w:val="0"/>
-              </w:numPr>
-              <w:spacing w:line="240" w:lineRule="auto"/>
-              <w:rPr>
-                <w:ins w:id="75" w:author="Ramin Miraftabi" w:date="2026-03-05T10:06:00Z" w16du:dateUtc="2026-03-05T09:06:00Z"/>
-                <w:b/>
-                <w:bCs/>
-                <w:color w:val="00558C"/>
-              </w:rPr>
-            </w:pPr>
-            <w:ins w:id="76" w:author="Ramin Miraftabi" w:date="2026-03-05T10:06:00Z" w16du:dateUtc="2026-03-05T09:06:00Z">
-              <w:r>
-                <w:rPr>
-                  <w:b/>
-                  <w:bCs/>
-                  <w:color w:val="00558C"/>
-                </w:rPr>
-                <w:t>Requirement Name</w:t>
-              </w:r>
-            </w:ins>
-          </w:p>
-        </w:tc>
-        <w:tc>
-          <w:tcPr>
-            <w:tcW w:w="7336" w:type="dxa"/>
-          </w:tcPr>
-          <w:p>
-            <w:pPr>
-              <w:pStyle w:val="Bullet1"/>
-              <w:numPr>
-                <w:ilvl w:val="0"/>
-                <w:numId w:val="0"/>
-              </w:numPr>
-              <w:spacing w:line="240" w:lineRule="auto"/>
-              <w:rPr>
-                <w:ins w:id="77" w:author="Ramin Miraftabi" w:date="2026-03-05T10:06:00Z" w16du:dateUtc="2026-03-05T09:06:00Z"/>
-              </w:rPr>
-            </w:pPr>
-            <w:ins w:id="78" w:author="Ramin Miraftabi" w:date="2026-03-05T10:06:00Z" w16du:dateUtc="2026-03-05T09:06:00Z">
-              <w:r>
-                <w:t>Requirements for identities</w:t>
               </w:r>
             </w:ins>
           </w:p>
@@ -11181,7 +11143,7 @@
                   <w:bCs/>
                   <w:color w:val="00558C"/>
                 </w:rPr>
-                <w:t>Requirement Text</w:t>
+                <w:t>Requirement Name</w:t>
               </w:r>
             </w:ins>
           </w:p>
@@ -11203,6 +11165,66 @@
               </w:rPr>
             </w:pPr>
             <w:ins w:id="83" w:author="Ramin Miraftabi" w:date="2026-03-05T10:06:00Z" w16du:dateUtc="2026-03-05T09:06:00Z">
+              <w:r>
+                <w:t>Requirements for identities</w:t>
+              </w:r>
+            </w:ins>
+          </w:p>
+        </w:tc>
+      </w:tr>
+      <w:tr>
+        <w:trPr>
+          <w:ins w:id="84" w:author="Ramin Miraftabi" w:date="2026-03-05T10:06:00Z" w16du:dateUtc="2026-03-05T09:06:00Z"/>
+        </w:trPr>
+        <w:tc>
+          <w:tcPr>
+            <w:tcW w:w="2405" w:type="dxa"/>
+            <w:vAlign w:val="center"/>
+          </w:tcPr>
+          <w:p>
+            <w:pPr>
+              <w:pStyle w:val="Bullet1"/>
+              <w:numPr>
+                <w:ilvl w:val="0"/>
+                <w:numId w:val="0"/>
+              </w:numPr>
+              <w:spacing w:line="240" w:lineRule="auto"/>
+              <w:rPr>
+                <w:ins w:id="85" w:author="Ramin Miraftabi" w:date="2026-03-05T10:06:00Z" w16du:dateUtc="2026-03-05T09:06:00Z"/>
+                <w:b/>
+                <w:bCs/>
+                <w:color w:val="00558C"/>
+              </w:rPr>
+            </w:pPr>
+            <w:ins w:id="86" w:author="Ramin Miraftabi" w:date="2026-03-05T10:06:00Z" w16du:dateUtc="2026-03-05T09:06:00Z">
+              <w:r>
+                <w:rPr>
+                  <w:b/>
+                  <w:bCs/>
+                  <w:color w:val="00558C"/>
+                </w:rPr>
+                <w:t>Requirement Text</w:t>
+              </w:r>
+            </w:ins>
+          </w:p>
+        </w:tc>
+        <w:tc>
+          <w:tcPr>
+            <w:tcW w:w="7336" w:type="dxa"/>
+          </w:tcPr>
+          <w:p>
+            <w:pPr>
+              <w:pStyle w:val="Bullet1"/>
+              <w:numPr>
+                <w:ilvl w:val="0"/>
+                <w:numId w:val="0"/>
+              </w:numPr>
+              <w:spacing w:line="240" w:lineRule="auto"/>
+              <w:rPr>
+                <w:ins w:id="87" w:author="Ramin Miraftabi" w:date="2026-03-05T10:06:00Z" w16du:dateUtc="2026-03-05T09:06:00Z"/>
+              </w:rPr>
+            </w:pPr>
+            <w:ins w:id="88" w:author="Ramin Miraftabi" w:date="2026-03-05T10:06:00Z" w16du:dateUtc="2026-03-05T09:06:00Z">
               <w:r>
                 <w:t xml:space="preserve">The service must have a valid maritime identity. See Guideline G1183 </w:t>
               </w:r>
@@ -11232,10 +11254,10 @@
               </w:numPr>
               <w:spacing w:line="240" w:lineRule="auto"/>
               <w:rPr>
-                <w:ins w:id="84" w:author="Ramin Miraftabi" w:date="2026-03-05T10:06:00Z" w16du:dateUtc="2026-03-05T09:06:00Z"/>
-              </w:rPr>
-            </w:pPr>
-            <w:ins w:id="85" w:author="Ramin Miraftabi" w:date="2026-03-05T10:06:00Z" w16du:dateUtc="2026-03-05T09:06:00Z">
+                <w:ins w:id="89" w:author="Ramin Miraftabi" w:date="2026-03-05T10:06:00Z" w16du:dateUtc="2026-03-05T09:06:00Z"/>
+              </w:rPr>
+            </w:pPr>
+            <w:ins w:id="90" w:author="Ramin Miraftabi" w:date="2026-03-05T10:06:00Z" w16du:dateUtc="2026-03-05T09:06:00Z">
               <w:r>
                 <w:t xml:space="preserve">A consumer must have a valid maritime identity. </w:t>
               </w:r>
@@ -11250,25 +11272,25 @@
               </w:numPr>
               <w:spacing w:line="240" w:lineRule="auto"/>
               <w:rPr>
-                <w:ins w:id="86" w:author="Ramin Miraftabi" w:date="2026-03-05T10:06:00Z" w16du:dateUtc="2026-03-05T09:06:00Z"/>
-              </w:rPr>
-            </w:pPr>
-            <w:ins w:id="87" w:author="Ramin Miraftabi" w:date="2026-03-05T10:06:00Z" w16du:dateUtc="2026-03-05T09:06:00Z">
+                <w:ins w:id="91" w:author="Ramin Miraftabi" w:date="2026-03-05T10:06:00Z" w16du:dateUtc="2026-03-05T09:06:00Z"/>
+              </w:rPr>
+            </w:pPr>
+            <w:ins w:id="92" w:author="Ramin Miraftabi" w:date="2026-03-05T10:06:00Z" w16du:dateUtc="2026-03-05T09:06:00Z">
               <w:r>
                 <w:t>The maritime identity certificate must include the vessel’s MMSI and IMO number and they must match with t</w:t>
               </w:r>
             </w:ins>
-            <w:ins w:id="88" w:author="Ramin Miraftabi" w:date="2026-03-05T10:08:00Z" w16du:dateUtc="2026-03-05T09:08:00Z">
+            <w:ins w:id="93" w:author="Ramin Miraftabi" w:date="2026-03-05T10:08:00Z" w16du:dateUtc="2026-03-05T09:08:00Z">
               <w:r>
                 <w:t xml:space="preserve">he </w:t>
               </w:r>
             </w:ins>
-            <w:ins w:id="89" w:author="Ramin Miraftabi" w:date="2026-03-05T10:06:00Z" w16du:dateUtc="2026-03-05T09:06:00Z">
+            <w:ins w:id="94" w:author="Ramin Miraftabi" w:date="2026-03-05T10:06:00Z" w16du:dateUtc="2026-03-05T09:06:00Z">
               <w:r>
                 <w:t xml:space="preserve">IMO number </w:t>
               </w:r>
             </w:ins>
-            <w:ins w:id="90" w:author="Ramin Miraftabi" w:date="2026-03-05T10:07:00Z" w16du:dateUtc="2026-03-05T09:07:00Z">
+            <w:ins w:id="95" w:author="Ramin Miraftabi" w:date="2026-03-05T10:07:00Z" w16du:dateUtc="2026-03-05T09:07:00Z">
               <w:r>
                 <w:t xml:space="preserve">specified in the MRN set to the </w:t>
               </w:r>
@@ -11278,12 +11300,12 @@
               </w:r>
             </w:ins>
             <w:proofErr w:type="spellEnd"/>
-            <w:ins w:id="91" w:author="Ramin Miraftabi" w:date="2026-03-05T10:08:00Z" w16du:dateUtc="2026-03-05T09:08:00Z">
+            <w:ins w:id="96" w:author="Ramin Miraftabi" w:date="2026-03-05T10:08:00Z" w16du:dateUtc="2026-03-05T09:08:00Z">
               <w:r>
                 <w:t xml:space="preserve"> attribute. </w:t>
               </w:r>
             </w:ins>
-            <w:ins w:id="92" w:author="Ramin Miraftabi" w:date="2026-03-05T10:06:00Z" w16du:dateUtc="2026-03-05T09:06:00Z">
+            <w:ins w:id="97" w:author="Ramin Miraftabi" w:date="2026-03-05T10:06:00Z" w16du:dateUtc="2026-03-05T09:06:00Z">
               <w:r>
                 <w:t xml:space="preserve">If vessel does not have an IMO </w:t>
               </w:r>
@@ -11296,38 +11318,38 @@
                 <w:t xml:space="preserve"> then</w:t>
               </w:r>
             </w:ins>
-            <w:ins w:id="93" w:author="Ramin Miraftabi" w:date="2026-03-05T10:08:00Z" w16du:dateUtc="2026-03-05T09:08:00Z">
+            <w:ins w:id="98" w:author="Ramin Miraftabi" w:date="2026-03-05T10:08:00Z" w16du:dateUtc="2026-03-05T09:08:00Z">
               <w:r>
                 <w:t xml:space="preserve"> </w:t>
               </w:r>
             </w:ins>
-            <w:ins w:id="94" w:author="Ramin Miraftabi" w:date="2026-03-05T10:06:00Z" w16du:dateUtc="2026-03-05T09:06:00Z">
+            <w:ins w:id="99" w:author="Ramin Miraftabi" w:date="2026-03-05T10:06:00Z" w16du:dateUtc="2026-03-05T09:06:00Z">
               <w:r>
                 <w:t xml:space="preserve">MMSI is </w:t>
               </w:r>
             </w:ins>
-            <w:ins w:id="95" w:author="Ramin Miraftabi" w:date="2026-03-05T10:08:00Z" w16du:dateUtc="2026-03-05T09:08:00Z">
+            <w:ins w:id="100" w:author="Ramin Miraftabi" w:date="2026-03-05T10:08:00Z" w16du:dateUtc="2026-03-05T09:08:00Z">
               <w:r>
                 <w:t>allowed to be used</w:t>
               </w:r>
             </w:ins>
-            <w:ins w:id="96" w:author="Ramin Miraftabi" w:date="2026-03-05T10:06:00Z" w16du:dateUtc="2026-03-05T09:06:00Z">
+            <w:ins w:id="101" w:author="Ramin Miraftabi" w:date="2026-03-05T10:06:00Z" w16du:dateUtc="2026-03-05T09:06:00Z">
               <w:r>
                 <w:t xml:space="preserve">. If the certificate information and the identifying information in the </w:t>
               </w:r>
             </w:ins>
-            <w:ins w:id="97" w:author="Ramin Miraftabi" w:date="2026-03-05T10:08:00Z" w16du:dateUtc="2026-03-05T09:08:00Z">
+            <w:ins w:id="102" w:author="Ramin Miraftabi" w:date="2026-03-05T10:08:00Z" w16du:dateUtc="2026-03-05T09:08:00Z">
               <w:r>
                 <w:t>clearance message</w:t>
               </w:r>
             </w:ins>
-            <w:ins w:id="98" w:author="Ramin Miraftabi" w:date="2026-03-05T10:06:00Z" w16du:dateUtc="2026-03-05T09:06:00Z">
+            <w:ins w:id="103" w:author="Ramin Miraftabi" w:date="2026-03-05T10:06:00Z" w16du:dateUtc="2026-03-05T09:06:00Z">
               <w:r>
                 <w:t xml:space="preserve"> do not match an error must be returned and no further processing of the </w:t>
               </w:r>
             </w:ins>
             <w:proofErr w:type="spellStart"/>
-            <w:ins w:id="99" w:author="Ramin Miraftabi" w:date="2026-03-05T10:08:00Z" w16du:dateUtc="2026-03-05T09:08:00Z">
+            <w:ins w:id="104" w:author="Ramin Miraftabi" w:date="2026-03-05T10:08:00Z" w16du:dateUtc="2026-03-05T09:08:00Z">
               <w:r>
                 <w:t>cleareance</w:t>
               </w:r>
@@ -11336,7 +11358,7 @@
                 <w:t xml:space="preserve"> message</w:t>
               </w:r>
             </w:ins>
-            <w:ins w:id="100" w:author="Ramin Miraftabi" w:date="2026-03-05T10:06:00Z" w16du:dateUtc="2026-03-05T09:06:00Z">
+            <w:ins w:id="105" w:author="Ramin Miraftabi" w:date="2026-03-05T10:06:00Z" w16du:dateUtc="2026-03-05T09:06:00Z">
               <w:r>
                 <w:t xml:space="preserve"> is allowed.</w:t>
               </w:r>
@@ -11346,7 +11368,7 @@
       </w:tr>
       <w:tr>
         <w:trPr>
-          <w:ins w:id="101" w:author="Ramin Miraftabi" w:date="2026-03-05T10:06:00Z" w16du:dateUtc="2026-03-05T09:06:00Z"/>
+          <w:ins w:id="106" w:author="Ramin Miraftabi" w:date="2026-03-05T10:06:00Z" w16du:dateUtc="2026-03-05T09:06:00Z"/>
         </w:trPr>
         <w:tc>
           <w:tcPr>
@@ -11362,13 +11384,13 @@
               </w:numPr>
               <w:spacing w:line="240" w:lineRule="auto"/>
               <w:rPr>
-                <w:ins w:id="102" w:author="Ramin Miraftabi" w:date="2026-03-05T10:06:00Z" w16du:dateUtc="2026-03-05T09:06:00Z"/>
+                <w:ins w:id="107" w:author="Ramin Miraftabi" w:date="2026-03-05T10:06:00Z" w16du:dateUtc="2026-03-05T09:06:00Z"/>
                 <w:b/>
                 <w:bCs/>
                 <w:color w:val="00558C"/>
               </w:rPr>
             </w:pPr>
-            <w:ins w:id="103" w:author="Ramin Miraftabi" w:date="2026-03-05T10:06:00Z" w16du:dateUtc="2026-03-05T09:06:00Z">
+            <w:ins w:id="108" w:author="Ramin Miraftabi" w:date="2026-03-05T10:06:00Z" w16du:dateUtc="2026-03-05T09:06:00Z">
               <w:r>
                 <w:rPr>
                   <w:b/>
@@ -11393,10 +11415,10 @@
               </w:numPr>
               <w:spacing w:line="240" w:lineRule="auto"/>
               <w:rPr>
-                <w:ins w:id="104" w:author="Ramin Miraftabi" w:date="2026-03-05T10:06:00Z" w16du:dateUtc="2026-03-05T09:06:00Z"/>
-              </w:rPr>
-            </w:pPr>
-            <w:ins w:id="105" w:author="Ramin Miraftabi" w:date="2026-03-05T10:06:00Z" w16du:dateUtc="2026-03-05T09:06:00Z">
+                <w:ins w:id="109" w:author="Ramin Miraftabi" w:date="2026-03-05T10:06:00Z" w16du:dateUtc="2026-03-05T09:06:00Z"/>
+              </w:rPr>
+            </w:pPr>
+            <w:ins w:id="110" w:author="Ramin Miraftabi" w:date="2026-03-05T10:06:00Z" w16du:dateUtc="2026-03-05T09:06:00Z">
               <w:r>
                 <w:t xml:space="preserve">The consumer must be able to verify the identity of the service and its provider. The consumer must reject any connections from a service that does not have a valid maritime identity. </w:t>
               </w:r>
@@ -11411,20 +11433,20 @@
               </w:numPr>
               <w:spacing w:line="240" w:lineRule="auto"/>
               <w:rPr>
-                <w:ins w:id="106" w:author="Ramin Miraftabi" w:date="2026-03-05T10:06:00Z" w16du:dateUtc="2026-03-05T09:06:00Z"/>
-              </w:rPr>
-            </w:pPr>
-            <w:ins w:id="107" w:author="Ramin Miraftabi" w:date="2026-03-05T10:06:00Z" w16du:dateUtc="2026-03-05T09:06:00Z">
+                <w:ins w:id="111" w:author="Ramin Miraftabi" w:date="2026-03-05T10:06:00Z" w16du:dateUtc="2026-03-05T09:06:00Z"/>
+              </w:rPr>
+            </w:pPr>
+            <w:ins w:id="112" w:author="Ramin Miraftabi" w:date="2026-03-05T10:06:00Z" w16du:dateUtc="2026-03-05T09:06:00Z">
               <w:r>
                 <w:t xml:space="preserve">The service must require verification of the identity of the consumer and must decline service if a valid identity is not provided or if the identity provided does not match the metadata of the </w:t>
               </w:r>
             </w:ins>
-            <w:ins w:id="108" w:author="Ramin Miraftabi" w:date="2026-03-05T10:09:00Z" w16du:dateUtc="2026-03-05T09:09:00Z">
+            <w:ins w:id="113" w:author="Ramin Miraftabi" w:date="2026-03-05T10:09:00Z" w16du:dateUtc="2026-03-05T09:09:00Z">
               <w:r>
                 <w:t>clearance message</w:t>
               </w:r>
             </w:ins>
-            <w:ins w:id="109" w:author="Ramin Miraftabi" w:date="2026-03-05T10:06:00Z" w16du:dateUtc="2026-03-05T09:06:00Z">
+            <w:ins w:id="114" w:author="Ramin Miraftabi" w:date="2026-03-05T10:06:00Z" w16du:dateUtc="2026-03-05T09:06:00Z">
               <w:r>
                 <w:t>.</w:t>
               </w:r>
@@ -11434,7 +11456,7 @@
       </w:tr>
       <w:tr>
         <w:trPr>
-          <w:ins w:id="110" w:author="Ramin Miraftabi" w:date="2026-03-05T10:06:00Z" w16du:dateUtc="2026-03-05T09:06:00Z"/>
+          <w:ins w:id="115" w:author="Ramin Miraftabi" w:date="2026-03-05T10:06:00Z" w16du:dateUtc="2026-03-05T09:06:00Z"/>
         </w:trPr>
         <w:tc>
           <w:tcPr>
@@ -11450,13 +11472,13 @@
               </w:numPr>
               <w:spacing w:line="240" w:lineRule="auto"/>
               <w:rPr>
-                <w:ins w:id="111" w:author="Ramin Miraftabi" w:date="2026-03-05T10:06:00Z" w16du:dateUtc="2026-03-05T09:06:00Z"/>
+                <w:ins w:id="116" w:author="Ramin Miraftabi" w:date="2026-03-05T10:06:00Z" w16du:dateUtc="2026-03-05T09:06:00Z"/>
                 <w:b/>
                 <w:bCs/>
                 <w:color w:val="00558C"/>
               </w:rPr>
             </w:pPr>
-            <w:ins w:id="112" w:author="Ramin Miraftabi" w:date="2026-03-05T10:06:00Z" w16du:dateUtc="2026-03-05T09:06:00Z">
+            <w:ins w:id="117" w:author="Ramin Miraftabi" w:date="2026-03-05T10:06:00Z" w16du:dateUtc="2026-03-05T09:06:00Z">
               <w:r>
                 <w:rPr>
                   <w:b/>
@@ -11482,19 +11504,19 @@
               </w:numPr>
               <w:spacing w:line="240" w:lineRule="auto"/>
               <w:rPr>
-                <w:ins w:id="113" w:author="Ramin Miraftabi" w:date="2026-03-05T10:06:00Z" w16du:dateUtc="2026-03-05T09:06:00Z"/>
+                <w:ins w:id="118" w:author="Ramin Miraftabi" w:date="2026-03-05T10:06:00Z" w16du:dateUtc="2026-03-05T09:06:00Z"/>
               </w:rPr>
             </w:pPr>
           </w:p>
         </w:tc>
       </w:tr>
-      <w:bookmarkEnd w:id="70"/>
+      <w:bookmarkEnd w:id="75"/>
     </w:tbl>
     <w:p>
       <w:pPr>
         <w:pStyle w:val="BodyText"/>
         <w:rPr>
-          <w:ins w:id="114" w:author="Ramin Miraftabi" w:date="2026-03-05T10:06:00Z" w16du:dateUtc="2026-03-05T09:06:00Z"/>
+          <w:ins w:id="119" w:author="Ramin Miraftabi" w:date="2026-03-05T10:06:00Z" w16du:dateUtc="2026-03-05T09:06:00Z"/>
         </w:rPr>
       </w:pPr>
     </w:p>
@@ -11511,7 +11533,7 @@
       </w:tblGrid>
       <w:tr>
         <w:trPr>
-          <w:ins w:id="115" w:author="Ramin Miraftabi" w:date="2026-03-05T10:06:00Z" w16du:dateUtc="2026-03-05T09:06:00Z"/>
+          <w:ins w:id="120" w:author="Ramin Miraftabi" w:date="2026-03-05T10:06:00Z" w16du:dateUtc="2026-03-05T09:06:00Z"/>
         </w:trPr>
         <w:tc>
           <w:tcPr>
@@ -11527,13 +11549,13 @@
               </w:numPr>
               <w:spacing w:line="240" w:lineRule="auto"/>
               <w:rPr>
-                <w:ins w:id="116" w:author="Ramin Miraftabi" w:date="2026-03-05T10:06:00Z" w16du:dateUtc="2026-03-05T09:06:00Z"/>
+                <w:ins w:id="121" w:author="Ramin Miraftabi" w:date="2026-03-05T10:06:00Z" w16du:dateUtc="2026-03-05T09:06:00Z"/>
                 <w:b/>
                 <w:bCs/>
                 <w:color w:val="00558C"/>
               </w:rPr>
             </w:pPr>
-            <w:ins w:id="117" w:author="Ramin Miraftabi" w:date="2026-03-05T10:06:00Z" w16du:dateUtc="2026-03-05T09:06:00Z">
+            <w:ins w:id="122" w:author="Ramin Miraftabi" w:date="2026-03-05T10:06:00Z" w16du:dateUtc="2026-03-05T09:06:00Z">
               <w:r>
                 <w:rPr>
                   <w:b/>
@@ -11559,15 +11581,15 @@
               </w:numPr>
               <w:spacing w:line="240" w:lineRule="auto"/>
               <w:rPr>
-                <w:ins w:id="118" w:author="Ramin Miraftabi" w:date="2026-03-05T10:06:00Z" w16du:dateUtc="2026-03-05T09:06:00Z"/>
-              </w:rPr>
-            </w:pPr>
-            <w:ins w:id="119" w:author="Ramin Miraftabi" w:date="2026-03-05T10:09:00Z" w16du:dateUtc="2026-03-05T09:09:00Z">
+                <w:ins w:id="123" w:author="Ramin Miraftabi" w:date="2026-03-05T10:06:00Z" w16du:dateUtc="2026-03-05T09:06:00Z"/>
+              </w:rPr>
+            </w:pPr>
+            <w:ins w:id="124" w:author="Ramin Miraftabi" w:date="2026-03-05T10:09:00Z" w16du:dateUtc="2026-03-05T09:09:00Z">
               <w:r>
                 <w:t>TCS</w:t>
               </w:r>
             </w:ins>
-            <w:ins w:id="120" w:author="Ramin Miraftabi" w:date="2026-03-05T10:06:00Z" w16du:dateUtc="2026-03-05T09:06:00Z">
+            <w:ins w:id="125" w:author="Ramin Miraftabi" w:date="2026-03-05T10:06:00Z" w16du:dateUtc="2026-03-05T09:06:00Z">
               <w:r>
                 <w:t>F0</w:t>
               </w:r>
@@ -11575,72 +11597,9 @@
                 <w:t>1</w:t>
               </w:r>
             </w:ins>
-            <w:ins w:id="121" w:author="Ramin Miraftabi" w:date="2026-03-05T10:09:00Z" w16du:dateUtc="2026-03-05T09:09:00Z">
+            <w:ins w:id="126" w:author="Ramin Miraftabi" w:date="2026-03-05T10:09:00Z" w16du:dateUtc="2026-03-05T09:09:00Z">
               <w:r>
                 <w:t>2</w:t>
-              </w:r>
-            </w:ins>
-          </w:p>
-        </w:tc>
-      </w:tr>
-      <w:tr>
-        <w:trPr>
-          <w:ins w:id="122" w:author="Ramin Miraftabi" w:date="2026-03-05T10:06:00Z" w16du:dateUtc="2026-03-05T09:06:00Z"/>
-        </w:trPr>
-        <w:tc>
-          <w:tcPr>
-            <w:tcW w:w="2405" w:type="dxa"/>
-            <w:vAlign w:val="center"/>
-          </w:tcPr>
-          <w:p>
-            <w:pPr>
-              <w:pStyle w:val="Bullet1"/>
-              <w:numPr>
-                <w:ilvl w:val="0"/>
-                <w:numId w:val="0"/>
-              </w:numPr>
-              <w:spacing w:line="240" w:lineRule="auto"/>
-              <w:rPr>
-                <w:ins w:id="123" w:author="Ramin Miraftabi" w:date="2026-03-05T10:06:00Z" w16du:dateUtc="2026-03-05T09:06:00Z"/>
-                <w:b/>
-                <w:bCs/>
-                <w:color w:val="00558C"/>
-              </w:rPr>
-            </w:pPr>
-            <w:ins w:id="124" w:author="Ramin Miraftabi" w:date="2026-03-05T10:06:00Z" w16du:dateUtc="2026-03-05T09:06:00Z">
-              <w:r>
-                <w:rPr>
-                  <w:b/>
-                  <w:bCs/>
-                  <w:color w:val="00558C"/>
-                </w:rPr>
-                <w:t>Requirement Name</w:t>
-              </w:r>
-            </w:ins>
-          </w:p>
-        </w:tc>
-        <w:tc>
-          <w:tcPr>
-            <w:tcW w:w="7336" w:type="dxa"/>
-          </w:tcPr>
-          <w:p>
-            <w:pPr>
-              <w:pStyle w:val="Bullet1"/>
-              <w:numPr>
-                <w:ilvl w:val="0"/>
-                <w:numId w:val="0"/>
-              </w:numPr>
-              <w:spacing w:line="240" w:lineRule="auto"/>
-              <w:rPr>
-                <w:ins w:id="125" w:author="Ramin Miraftabi" w:date="2026-03-05T10:06:00Z" w16du:dateUtc="2026-03-05T09:06:00Z"/>
-              </w:rPr>
-            </w:pPr>
-            <w:ins w:id="126" w:author="Ramin Miraftabi" w:date="2026-03-05T10:06:00Z" w16du:dateUtc="2026-03-05T09:06:00Z">
-              <w:r>
-                <w:rPr>
-                  <w:color w:val="000000" w:themeColor="text1"/>
-                </w:rPr>
-                <w:t>Requirements for authenticity</w:t>
               </w:r>
             </w:ins>
           </w:p>
@@ -11677,7 +11636,7 @@
                   <w:bCs/>
                   <w:color w:val="00558C"/>
                 </w:rPr>
-                <w:t>Requirement Text</w:t>
+                <w:t>Requirement Name</w:t>
               </w:r>
             </w:ins>
           </w:p>
@@ -11700,50 +11659,24 @@
             </w:pPr>
             <w:ins w:id="131" w:author="Ramin Miraftabi" w:date="2026-03-05T10:06:00Z" w16du:dateUtc="2026-03-05T09:06:00Z">
               <w:r>
-                <w:t xml:space="preserve">The consumer must be able to verify the authenticity of the </w:t>
+                <w:rPr>
+                  <w:color w:val="000000" w:themeColor="text1"/>
+                </w:rPr>
+                <w:t>Requirements for authenticity</w:t>
               </w:r>
             </w:ins>
-            <w:ins w:id="132" w:author="Ramin Miraftabi" w:date="2026-03-05T10:09:00Z" w16du:dateUtc="2026-03-05T09:09:00Z">
-              <w:r>
-                <w:t>clearance message</w:t>
-              </w:r>
-            </w:ins>
-            <w:ins w:id="133" w:author="Ramin Miraftabi" w:date="2026-03-05T10:06:00Z" w16du:dateUtc="2026-03-05T09:06:00Z">
-              <w:r>
-                <w:t xml:space="preserve"> from the originator of the </w:t>
-              </w:r>
-            </w:ins>
-            <w:ins w:id="134" w:author="Ramin Miraftabi" w:date="2026-03-05T10:09:00Z" w16du:dateUtc="2026-03-05T09:09:00Z">
-              <w:r>
-                <w:t>message</w:t>
-              </w:r>
-            </w:ins>
-            <w:ins w:id="135" w:author="Ramin Miraftabi" w:date="2026-03-05T10:06:00Z" w16du:dateUtc="2026-03-05T09:06:00Z">
-              <w:r>
-                <w:t xml:space="preserve"> (VTS system or this service) to the actual consumer application (e.g. </w:t>
-              </w:r>
-            </w:ins>
-            <w:ins w:id="136" w:author="Ramin Miraftabi" w:date="2026-03-05T10:09:00Z" w16du:dateUtc="2026-03-05T09:09:00Z">
-              <w:r>
-                <w:t>shipborne equipment</w:t>
-              </w:r>
-            </w:ins>
-            <w:ins w:id="137" w:author="Ramin Miraftabi" w:date="2026-03-05T10:06:00Z" w16du:dateUtc="2026-03-05T09:06:00Z">
-              <w:r>
-                <w:t xml:space="preserve">). This requires that if the communication between the service and the end-user application is not direct, the signature of the route is also delivered to the consumer application hand in hand with the </w:t>
-              </w:r>
-            </w:ins>
-            <w:ins w:id="138" w:author="Ramin Miraftabi" w:date="2026-03-05T10:10:00Z" w16du:dateUtc="2026-03-05T09:10:00Z">
-              <w:r>
-                <w:t>clearance message</w:t>
-              </w:r>
-            </w:ins>
-            <w:ins w:id="139" w:author="Ramin Miraftabi" w:date="2026-03-05T10:06:00Z" w16du:dateUtc="2026-03-05T09:06:00Z">
-              <w:r>
-                <w:t>.</w:t>
-              </w:r>
-            </w:ins>
-          </w:p>
+          </w:p>
+        </w:tc>
+      </w:tr>
+      <w:tr>
+        <w:trPr>
+          <w:ins w:id="132" w:author="Ramin Miraftabi" w:date="2026-03-05T10:06:00Z" w16du:dateUtc="2026-03-05T09:06:00Z"/>
+        </w:trPr>
+        <w:tc>
+          <w:tcPr>
+            <w:tcW w:w="2405" w:type="dxa"/>
+            <w:vAlign w:val="center"/>
+          </w:tcPr>
           <w:p>
             <w:pPr>
               <w:pStyle w:val="Bullet1"/>
@@ -11753,30 +11686,119 @@
               </w:numPr>
               <w:spacing w:line="240" w:lineRule="auto"/>
               <w:rPr>
-                <w:ins w:id="140" w:author="Ramin Miraftabi" w:date="2026-03-05T10:06:00Z" w16du:dateUtc="2026-03-05T09:06:00Z"/>
-              </w:rPr>
-            </w:pPr>
-            <w:ins w:id="141" w:author="Ramin Miraftabi" w:date="2026-03-05T10:06:00Z" w16du:dateUtc="2026-03-05T09:06:00Z">
+                <w:ins w:id="133" w:author="Ramin Miraftabi" w:date="2026-03-05T10:06:00Z" w16du:dateUtc="2026-03-05T09:06:00Z"/>
+                <w:b/>
+                <w:bCs/>
+                <w:color w:val="00558C"/>
+              </w:rPr>
+            </w:pPr>
+            <w:ins w:id="134" w:author="Ramin Miraftabi" w:date="2026-03-05T10:06:00Z" w16du:dateUtc="2026-03-05T09:06:00Z">
+              <w:r>
+                <w:rPr>
+                  <w:b/>
+                  <w:bCs/>
+                  <w:color w:val="00558C"/>
+                </w:rPr>
+                <w:t>Requirement Text</w:t>
+              </w:r>
+            </w:ins>
+          </w:p>
+        </w:tc>
+        <w:tc>
+          <w:tcPr>
+            <w:tcW w:w="7336" w:type="dxa"/>
+          </w:tcPr>
+          <w:p>
+            <w:pPr>
+              <w:pStyle w:val="Bullet1"/>
+              <w:numPr>
+                <w:ilvl w:val="0"/>
+                <w:numId w:val="0"/>
+              </w:numPr>
+              <w:spacing w:line="240" w:lineRule="auto"/>
+              <w:rPr>
+                <w:ins w:id="135" w:author="Ramin Miraftabi" w:date="2026-03-05T10:06:00Z" w16du:dateUtc="2026-03-05T09:06:00Z"/>
+              </w:rPr>
+            </w:pPr>
+            <w:ins w:id="136" w:author="Ramin Miraftabi" w:date="2026-03-05T10:06:00Z" w16du:dateUtc="2026-03-05T09:06:00Z">
+              <w:r>
+                <w:t xml:space="preserve">The consumer must be able to verify the authenticity of the </w:t>
+              </w:r>
+            </w:ins>
+            <w:ins w:id="137" w:author="Ramin Miraftabi" w:date="2026-03-05T10:09:00Z" w16du:dateUtc="2026-03-05T09:09:00Z">
+              <w:r>
+                <w:t>clearance message</w:t>
+              </w:r>
+            </w:ins>
+            <w:ins w:id="138" w:author="Ramin Miraftabi" w:date="2026-03-05T10:06:00Z" w16du:dateUtc="2026-03-05T09:06:00Z">
+              <w:r>
+                <w:t xml:space="preserve"> from the originator of the </w:t>
+              </w:r>
+            </w:ins>
+            <w:ins w:id="139" w:author="Ramin Miraftabi" w:date="2026-03-05T10:09:00Z" w16du:dateUtc="2026-03-05T09:09:00Z">
+              <w:r>
+                <w:t>message</w:t>
+              </w:r>
+            </w:ins>
+            <w:ins w:id="140" w:author="Ramin Miraftabi" w:date="2026-03-05T10:06:00Z" w16du:dateUtc="2026-03-05T09:06:00Z">
+              <w:r>
+                <w:t xml:space="preserve"> (VTS system or this service) to the actual consumer application (e.g. </w:t>
+              </w:r>
+            </w:ins>
+            <w:ins w:id="141" w:author="Ramin Miraftabi" w:date="2026-03-05T10:09:00Z" w16du:dateUtc="2026-03-05T09:09:00Z">
+              <w:r>
+                <w:t>shipborne equipment</w:t>
+              </w:r>
+            </w:ins>
+            <w:ins w:id="142" w:author="Ramin Miraftabi" w:date="2026-03-05T10:06:00Z" w16du:dateUtc="2026-03-05T09:06:00Z">
+              <w:r>
+                <w:t xml:space="preserve">). This requires that if the communication between the service and the end-user application is not direct, the signature of the route is also delivered to the consumer application hand in hand with the </w:t>
+              </w:r>
+            </w:ins>
+            <w:ins w:id="143" w:author="Ramin Miraftabi" w:date="2026-03-05T10:10:00Z" w16du:dateUtc="2026-03-05T09:10:00Z">
+              <w:r>
+                <w:t>clearance message</w:t>
+              </w:r>
+            </w:ins>
+            <w:ins w:id="144" w:author="Ramin Miraftabi" w:date="2026-03-05T10:06:00Z" w16du:dateUtc="2026-03-05T09:06:00Z">
+              <w:r>
+                <w:t>.</w:t>
+              </w:r>
+            </w:ins>
+          </w:p>
+          <w:p>
+            <w:pPr>
+              <w:pStyle w:val="Bullet1"/>
+              <w:numPr>
+                <w:ilvl w:val="0"/>
+                <w:numId w:val="0"/>
+              </w:numPr>
+              <w:spacing w:line="240" w:lineRule="auto"/>
+              <w:rPr>
+                <w:ins w:id="145" w:author="Ramin Miraftabi" w:date="2026-03-05T10:06:00Z" w16du:dateUtc="2026-03-05T09:06:00Z"/>
+              </w:rPr>
+            </w:pPr>
+            <w:ins w:id="146" w:author="Ramin Miraftabi" w:date="2026-03-05T10:06:00Z" w16du:dateUtc="2026-03-05T09:06:00Z">
               <w:r>
                 <w:t xml:space="preserve">The service must be able to verify the authenticity of the </w:t>
               </w:r>
             </w:ins>
-            <w:ins w:id="142" w:author="Ramin Miraftabi" w:date="2026-03-05T10:10:00Z" w16du:dateUtc="2026-03-05T09:10:00Z">
+            <w:ins w:id="147" w:author="Ramin Miraftabi" w:date="2026-03-05T10:10:00Z" w16du:dateUtc="2026-03-05T09:10:00Z">
               <w:r>
                 <w:t>clearance message</w:t>
               </w:r>
             </w:ins>
-            <w:ins w:id="143" w:author="Ramin Miraftabi" w:date="2026-03-05T10:06:00Z" w16du:dateUtc="2026-03-05T09:06:00Z">
+            <w:ins w:id="148" w:author="Ramin Miraftabi" w:date="2026-03-05T10:06:00Z" w16du:dateUtc="2026-03-05T09:06:00Z">
               <w:r>
                 <w:t xml:space="preserve"> from the actual vessel it identifies. Thus, the</w:t>
               </w:r>
             </w:ins>
-            <w:ins w:id="144" w:author="Ramin Miraftabi" w:date="2026-03-05T10:10:00Z" w16du:dateUtc="2026-03-05T09:10:00Z">
+            <w:ins w:id="149" w:author="Ramin Miraftabi" w:date="2026-03-05T10:10:00Z" w16du:dateUtc="2026-03-05T09:10:00Z">
               <w:r>
                 <w:t xml:space="preserve"> clearance message</w:t>
               </w:r>
             </w:ins>
-            <w:ins w:id="145" w:author="Ramin Miraftabi" w:date="2026-03-05T10:06:00Z" w16du:dateUtc="2026-03-05T09:06:00Z">
+            <w:ins w:id="150" w:author="Ramin Miraftabi" w:date="2026-03-05T10:06:00Z" w16du:dateUtc="2026-03-05T09:06:00Z">
               <w:r>
                 <w:t xml:space="preserve"> must be signed with the signature of the same vessel it is </w:t>
               </w:r>
@@ -11794,7 +11816,7 @@
       </w:tr>
       <w:tr>
         <w:trPr>
-          <w:ins w:id="146" w:author="Ramin Miraftabi" w:date="2026-03-05T10:06:00Z" w16du:dateUtc="2026-03-05T09:06:00Z"/>
+          <w:ins w:id="151" w:author="Ramin Miraftabi" w:date="2026-03-05T10:06:00Z" w16du:dateUtc="2026-03-05T09:06:00Z"/>
         </w:trPr>
         <w:tc>
           <w:tcPr>
@@ -11810,13 +11832,13 @@
               </w:numPr>
               <w:spacing w:line="240" w:lineRule="auto"/>
               <w:rPr>
-                <w:ins w:id="147" w:author="Ramin Miraftabi" w:date="2026-03-05T10:06:00Z" w16du:dateUtc="2026-03-05T09:06:00Z"/>
+                <w:ins w:id="152" w:author="Ramin Miraftabi" w:date="2026-03-05T10:06:00Z" w16du:dateUtc="2026-03-05T09:06:00Z"/>
                 <w:b/>
                 <w:bCs/>
                 <w:color w:val="00558C"/>
               </w:rPr>
             </w:pPr>
-            <w:ins w:id="148" w:author="Ramin Miraftabi" w:date="2026-03-05T10:06:00Z" w16du:dateUtc="2026-03-05T09:06:00Z">
+            <w:ins w:id="153" w:author="Ramin Miraftabi" w:date="2026-03-05T10:06:00Z" w16du:dateUtc="2026-03-05T09:06:00Z">
               <w:r>
                 <w:rPr>
                   <w:b/>
@@ -11841,27 +11863,27 @@
               </w:numPr>
               <w:spacing w:line="240" w:lineRule="auto"/>
               <w:rPr>
-                <w:ins w:id="149" w:author="Ramin Miraftabi" w:date="2026-03-05T10:06:00Z" w16du:dateUtc="2026-03-05T09:06:00Z"/>
-              </w:rPr>
-            </w:pPr>
-            <w:ins w:id="150" w:author="Ramin Miraftabi" w:date="2026-03-05T10:06:00Z" w16du:dateUtc="2026-03-05T09:06:00Z">
+                <w:ins w:id="154" w:author="Ramin Miraftabi" w:date="2026-03-05T10:06:00Z" w16du:dateUtc="2026-03-05T09:06:00Z"/>
+              </w:rPr>
+            </w:pPr>
+            <w:ins w:id="155" w:author="Ramin Miraftabi" w:date="2026-03-05T10:06:00Z" w16du:dateUtc="2026-03-05T09:06:00Z">
               <w:r>
                 <w:t xml:space="preserve">ECDIS is mandated to verify the authenticity of all incoming external data. </w:t>
               </w:r>
             </w:ins>
-            <w:ins w:id="151" w:author="Ramin Miraftabi" w:date="2026-03-05T10:10:00Z" w16du:dateUtc="2026-03-05T09:10:00Z">
+            <w:ins w:id="156" w:author="Ramin Miraftabi" w:date="2026-03-05T10:10:00Z" w16du:dateUtc="2026-03-05T09:10:00Z">
               <w:r>
                 <w:t>The same requirement generally applies to all devices in the protected ship n</w:t>
               </w:r>
             </w:ins>
-            <w:ins w:id="152" w:author="Ramin Miraftabi" w:date="2026-03-05T10:11:00Z" w16du:dateUtc="2026-03-05T09:11:00Z">
+            <w:ins w:id="157" w:author="Ramin Miraftabi" w:date="2026-03-05T10:11:00Z" w16du:dateUtc="2026-03-05T09:11:00Z">
               <w:r>
                 <w:t xml:space="preserve">etwork. </w:t>
               </w:r>
             </w:ins>
             <w:proofErr w:type="spellStart"/>
             <w:proofErr w:type="gramStart"/>
-            <w:ins w:id="153" w:author="Ramin Miraftabi" w:date="2026-03-05T10:06:00Z" w16du:dateUtc="2026-03-05T09:06:00Z">
+            <w:ins w:id="158" w:author="Ramin Miraftabi" w:date="2026-03-05T10:06:00Z" w16du:dateUtc="2026-03-05T09:06:00Z">
               <w:r>
                 <w:t>Thus</w:t>
               </w:r>
@@ -11871,32 +11893,32 @@
                 <w:t xml:space="preserve"> the signature of a received </w:t>
               </w:r>
             </w:ins>
-            <w:ins w:id="154" w:author="Ramin Miraftabi" w:date="2026-03-05T10:11:00Z" w16du:dateUtc="2026-03-05T09:11:00Z">
+            <w:ins w:id="159" w:author="Ramin Miraftabi" w:date="2026-03-05T10:11:00Z" w16du:dateUtc="2026-03-05T09:11:00Z">
               <w:r>
                 <w:t>clearance message</w:t>
               </w:r>
             </w:ins>
-            <w:ins w:id="155" w:author="Ramin Miraftabi" w:date="2026-03-05T10:06:00Z" w16du:dateUtc="2026-03-05T09:06:00Z">
+            <w:ins w:id="160" w:author="Ramin Miraftabi" w:date="2026-03-05T10:06:00Z" w16du:dateUtc="2026-03-05T09:06:00Z">
               <w:r>
                 <w:t xml:space="preserve"> must be delivered to the </w:t>
               </w:r>
             </w:ins>
-            <w:ins w:id="156" w:author="Ramin Miraftabi" w:date="2026-03-05T10:11:00Z" w16du:dateUtc="2026-03-05T09:11:00Z">
+            <w:ins w:id="161" w:author="Ramin Miraftabi" w:date="2026-03-05T10:11:00Z" w16du:dateUtc="2026-03-05T09:11:00Z">
               <w:r>
                 <w:t>shipborne equipment</w:t>
               </w:r>
             </w:ins>
-            <w:ins w:id="157" w:author="Ramin Miraftabi" w:date="2026-03-05T10:06:00Z" w16du:dateUtc="2026-03-05T09:06:00Z">
+            <w:ins w:id="162" w:author="Ramin Miraftabi" w:date="2026-03-05T10:06:00Z" w16du:dateUtc="2026-03-05T09:06:00Z">
               <w:r>
                 <w:t xml:space="preserve"> hand in hand with the </w:t>
               </w:r>
             </w:ins>
-            <w:ins w:id="158" w:author="Ramin Miraftabi" w:date="2026-03-05T10:11:00Z" w16du:dateUtc="2026-03-05T09:11:00Z">
+            <w:ins w:id="163" w:author="Ramin Miraftabi" w:date="2026-03-05T10:11:00Z" w16du:dateUtc="2026-03-05T09:11:00Z">
               <w:r>
                 <w:t>clearance message</w:t>
               </w:r>
             </w:ins>
-            <w:ins w:id="159" w:author="Ramin Miraftabi" w:date="2026-03-05T10:06:00Z" w16du:dateUtc="2026-03-05T09:06:00Z">
+            <w:ins w:id="164" w:author="Ramin Miraftabi" w:date="2026-03-05T10:06:00Z" w16du:dateUtc="2026-03-05T09:06:00Z">
               <w:r>
                 <w:t xml:space="preserve">. See IACS UR E27 section 4.2.6 </w:t>
               </w:r>
@@ -11926,30 +11948,30 @@
               </w:numPr>
               <w:spacing w:line="240" w:lineRule="auto"/>
               <w:rPr>
-                <w:ins w:id="160" w:author="Ramin Miraftabi" w:date="2026-03-05T10:06:00Z" w16du:dateUtc="2026-03-05T09:06:00Z"/>
-              </w:rPr>
-            </w:pPr>
-            <w:ins w:id="161" w:author="Ramin Miraftabi" w:date="2026-03-05T10:06:00Z" w16du:dateUtc="2026-03-05T09:06:00Z">
+                <w:ins w:id="165" w:author="Ramin Miraftabi" w:date="2026-03-05T10:06:00Z" w16du:dateUtc="2026-03-05T09:06:00Z"/>
+              </w:rPr>
+            </w:pPr>
+            <w:ins w:id="166" w:author="Ramin Miraftabi" w:date="2026-03-05T10:06:00Z" w16du:dateUtc="2026-03-05T09:06:00Z">
               <w:r>
                 <w:t xml:space="preserve">VTS systems and other end users of </w:t>
               </w:r>
             </w:ins>
-            <w:ins w:id="162" w:author="Ramin Miraftabi" w:date="2026-03-05T10:11:00Z" w16du:dateUtc="2026-03-05T09:11:00Z">
+            <w:ins w:id="167" w:author="Ramin Miraftabi" w:date="2026-03-05T10:11:00Z" w16du:dateUtc="2026-03-05T09:11:00Z">
               <w:r>
                 <w:t>clearance messages</w:t>
               </w:r>
             </w:ins>
-            <w:ins w:id="163" w:author="Ramin Miraftabi" w:date="2026-03-05T10:06:00Z" w16du:dateUtc="2026-03-05T09:06:00Z">
+            <w:ins w:id="168" w:author="Ramin Miraftabi" w:date="2026-03-05T10:06:00Z" w16du:dateUtc="2026-03-05T09:06:00Z">
               <w:r>
                 <w:t xml:space="preserve"> must also be able to verify that the </w:t>
               </w:r>
             </w:ins>
-            <w:ins w:id="164" w:author="Ramin Miraftabi" w:date="2026-03-05T10:11:00Z" w16du:dateUtc="2026-03-05T09:11:00Z">
+            <w:ins w:id="169" w:author="Ramin Miraftabi" w:date="2026-03-05T10:11:00Z" w16du:dateUtc="2026-03-05T09:11:00Z">
               <w:r>
                 <w:t>clearance message</w:t>
               </w:r>
             </w:ins>
-            <w:ins w:id="165" w:author="Ramin Miraftabi" w:date="2026-03-05T10:06:00Z" w16du:dateUtc="2026-03-05T09:06:00Z">
+            <w:ins w:id="170" w:author="Ramin Miraftabi" w:date="2026-03-05T10:06:00Z" w16du:dateUtc="2026-03-05T09:06:00Z">
               <w:r>
                 <w:t xml:space="preserve"> they receive </w:t>
               </w:r>
@@ -11967,7 +11989,7 @@
       </w:tr>
       <w:tr>
         <w:trPr>
-          <w:ins w:id="166" w:author="Ramin Miraftabi" w:date="2026-03-05T10:06:00Z" w16du:dateUtc="2026-03-05T09:06:00Z"/>
+          <w:ins w:id="171" w:author="Ramin Miraftabi" w:date="2026-03-05T10:06:00Z" w16du:dateUtc="2026-03-05T09:06:00Z"/>
         </w:trPr>
         <w:tc>
           <w:tcPr>
@@ -11983,13 +12005,13 @@
               </w:numPr>
               <w:spacing w:line="240" w:lineRule="auto"/>
               <w:rPr>
-                <w:ins w:id="167" w:author="Ramin Miraftabi" w:date="2026-03-05T10:06:00Z" w16du:dateUtc="2026-03-05T09:06:00Z"/>
+                <w:ins w:id="172" w:author="Ramin Miraftabi" w:date="2026-03-05T10:06:00Z" w16du:dateUtc="2026-03-05T09:06:00Z"/>
                 <w:b/>
                 <w:bCs/>
                 <w:color w:val="00558C"/>
               </w:rPr>
             </w:pPr>
-            <w:ins w:id="168" w:author="Ramin Miraftabi" w:date="2026-03-05T10:06:00Z" w16du:dateUtc="2026-03-05T09:06:00Z">
+            <w:ins w:id="173" w:author="Ramin Miraftabi" w:date="2026-03-05T10:06:00Z" w16du:dateUtc="2026-03-05T09:06:00Z">
               <w:r>
                 <w:rPr>
                   <w:b/>
@@ -12015,7 +12037,7 @@
               </w:numPr>
               <w:spacing w:line="240" w:lineRule="auto"/>
               <w:rPr>
-                <w:ins w:id="169" w:author="Ramin Miraftabi" w:date="2026-03-05T10:06:00Z" w16du:dateUtc="2026-03-05T09:06:00Z"/>
+                <w:ins w:id="174" w:author="Ramin Miraftabi" w:date="2026-03-05T10:06:00Z" w16du:dateUtc="2026-03-05T09:06:00Z"/>
               </w:rPr>
             </w:pPr>
           </w:p>
@@ -12026,7 +12048,7 @@
       <w:pPr>
         <w:pStyle w:val="BodyText"/>
         <w:rPr>
-          <w:ins w:id="170" w:author="Ramin Miraftabi" w:date="2026-03-05T10:06:00Z" w16du:dateUtc="2026-03-05T09:06:00Z"/>
+          <w:ins w:id="175" w:author="Ramin Miraftabi" w:date="2026-03-05T10:06:00Z" w16du:dateUtc="2026-03-05T09:06:00Z"/>
         </w:rPr>
       </w:pPr>
     </w:p>
@@ -12043,7 +12065,7 @@
       </w:tblGrid>
       <w:tr>
         <w:trPr>
-          <w:ins w:id="171" w:author="Ramin Miraftabi" w:date="2026-03-05T10:12:00Z" w16du:dateUtc="2026-03-05T09:12:00Z"/>
+          <w:ins w:id="176" w:author="Ramin Miraftabi" w:date="2026-03-05T10:12:00Z" w16du:dateUtc="2026-03-05T09:12:00Z"/>
         </w:trPr>
         <w:tc>
           <w:tcPr>
@@ -12059,13 +12081,13 @@
               </w:numPr>
               <w:spacing w:line="240" w:lineRule="auto"/>
               <w:rPr>
-                <w:ins w:id="172" w:author="Ramin Miraftabi" w:date="2026-03-05T10:12:00Z" w16du:dateUtc="2026-03-05T09:12:00Z"/>
+                <w:ins w:id="177" w:author="Ramin Miraftabi" w:date="2026-03-05T10:12:00Z" w16du:dateUtc="2026-03-05T09:12:00Z"/>
                 <w:b/>
                 <w:bCs/>
                 <w:color w:val="00558C"/>
               </w:rPr>
             </w:pPr>
-            <w:ins w:id="173" w:author="Ramin Miraftabi" w:date="2026-03-05T10:12:00Z" w16du:dateUtc="2026-03-05T09:12:00Z">
+            <w:ins w:id="178" w:author="Ramin Miraftabi" w:date="2026-03-05T10:12:00Z" w16du:dateUtc="2026-03-05T09:12:00Z">
               <w:r>
                 <w:rPr>
                   <w:b/>
@@ -12092,10 +12114,10 @@
               </w:numPr>
               <w:spacing w:line="240" w:lineRule="auto"/>
               <w:rPr>
-                <w:ins w:id="174" w:author="Ramin Miraftabi" w:date="2026-03-05T10:12:00Z" w16du:dateUtc="2026-03-05T09:12:00Z"/>
-              </w:rPr>
-            </w:pPr>
-            <w:ins w:id="175" w:author="Ramin Miraftabi" w:date="2026-03-05T10:12:00Z" w16du:dateUtc="2026-03-05T09:12:00Z">
+                <w:ins w:id="179" w:author="Ramin Miraftabi" w:date="2026-03-05T10:12:00Z" w16du:dateUtc="2026-03-05T09:12:00Z"/>
+              </w:rPr>
+            </w:pPr>
+            <w:ins w:id="180" w:author="Ramin Miraftabi" w:date="2026-03-05T10:12:00Z" w16du:dateUtc="2026-03-05T09:12:00Z">
               <w:r>
                 <w:t>TCS</w:t>
               </w:r>
@@ -12114,7 +12136,7 @@
       </w:tr>
       <w:tr>
         <w:trPr>
-          <w:ins w:id="176" w:author="Ramin Miraftabi" w:date="2026-03-05T10:12:00Z" w16du:dateUtc="2026-03-05T09:12:00Z"/>
+          <w:ins w:id="181" w:author="Ramin Miraftabi" w:date="2026-03-05T10:12:00Z" w16du:dateUtc="2026-03-05T09:12:00Z"/>
         </w:trPr>
         <w:tc>
           <w:tcPr>
@@ -12130,13 +12152,13 @@
               </w:numPr>
               <w:spacing w:line="240" w:lineRule="auto"/>
               <w:rPr>
-                <w:ins w:id="177" w:author="Ramin Miraftabi" w:date="2026-03-05T10:12:00Z" w16du:dateUtc="2026-03-05T09:12:00Z"/>
+                <w:ins w:id="182" w:author="Ramin Miraftabi" w:date="2026-03-05T10:12:00Z" w16du:dateUtc="2026-03-05T09:12:00Z"/>
                 <w:b/>
                 <w:bCs/>
                 <w:color w:val="00558C"/>
               </w:rPr>
             </w:pPr>
-            <w:ins w:id="178" w:author="Ramin Miraftabi" w:date="2026-03-05T10:12:00Z" w16du:dateUtc="2026-03-05T09:12:00Z">
+            <w:ins w:id="183" w:author="Ramin Miraftabi" w:date="2026-03-05T10:12:00Z" w16du:dateUtc="2026-03-05T09:12:00Z">
               <w:r>
                 <w:rPr>
                   <w:b/>
@@ -12161,10 +12183,10 @@
               </w:numPr>
               <w:spacing w:line="240" w:lineRule="auto"/>
               <w:rPr>
-                <w:ins w:id="179" w:author="Ramin Miraftabi" w:date="2026-03-05T10:12:00Z" w16du:dateUtc="2026-03-05T09:12:00Z"/>
-              </w:rPr>
-            </w:pPr>
-            <w:ins w:id="180" w:author="Ramin Miraftabi" w:date="2026-03-05T10:12:00Z" w16du:dateUtc="2026-03-05T09:12:00Z">
+                <w:ins w:id="184" w:author="Ramin Miraftabi" w:date="2026-03-05T10:12:00Z" w16du:dateUtc="2026-03-05T09:12:00Z"/>
+              </w:rPr>
+            </w:pPr>
+            <w:ins w:id="185" w:author="Ramin Miraftabi" w:date="2026-03-05T10:12:00Z" w16du:dateUtc="2026-03-05T09:12:00Z">
               <w:r>
                 <w:rPr>
                   <w:color w:val="000000" w:themeColor="text1"/>
@@ -12177,7 +12199,7 @@
       </w:tr>
       <w:tr>
         <w:trPr>
-          <w:ins w:id="181" w:author="Ramin Miraftabi" w:date="2026-03-05T10:12:00Z" w16du:dateUtc="2026-03-05T09:12:00Z"/>
+          <w:ins w:id="186" w:author="Ramin Miraftabi" w:date="2026-03-05T10:12:00Z" w16du:dateUtc="2026-03-05T09:12:00Z"/>
         </w:trPr>
         <w:tc>
           <w:tcPr>
@@ -12193,13 +12215,13 @@
               </w:numPr>
               <w:spacing w:line="240" w:lineRule="auto"/>
               <w:rPr>
-                <w:ins w:id="182" w:author="Ramin Miraftabi" w:date="2026-03-05T10:12:00Z" w16du:dateUtc="2026-03-05T09:12:00Z"/>
+                <w:ins w:id="187" w:author="Ramin Miraftabi" w:date="2026-03-05T10:12:00Z" w16du:dateUtc="2026-03-05T09:12:00Z"/>
                 <w:b/>
                 <w:bCs/>
                 <w:color w:val="00558C"/>
               </w:rPr>
             </w:pPr>
-            <w:ins w:id="183" w:author="Ramin Miraftabi" w:date="2026-03-05T10:12:00Z" w16du:dateUtc="2026-03-05T09:12:00Z">
+            <w:ins w:id="188" w:author="Ramin Miraftabi" w:date="2026-03-05T10:12:00Z" w16du:dateUtc="2026-03-05T09:12:00Z">
               <w:r>
                 <w:rPr>
                   <w:b/>
@@ -12224,10 +12246,10 @@
               </w:numPr>
               <w:spacing w:line="240" w:lineRule="auto"/>
               <w:rPr>
-                <w:ins w:id="184" w:author="Ramin Miraftabi" w:date="2026-03-05T10:12:00Z" w16du:dateUtc="2026-03-05T09:12:00Z"/>
-              </w:rPr>
-            </w:pPr>
-            <w:ins w:id="185" w:author="Ramin Miraftabi" w:date="2026-03-05T10:12:00Z" w16du:dateUtc="2026-03-05T09:12:00Z">
+                <w:ins w:id="189" w:author="Ramin Miraftabi" w:date="2026-03-05T10:12:00Z" w16du:dateUtc="2026-03-05T09:12:00Z"/>
+              </w:rPr>
+            </w:pPr>
+            <w:ins w:id="190" w:author="Ramin Miraftabi" w:date="2026-03-05T10:12:00Z" w16du:dateUtc="2026-03-05T09:12:00Z">
               <w:r>
                 <w:t xml:space="preserve">All sending of </w:t>
               </w:r>
@@ -12248,10 +12270,10 @@
               </w:numPr>
               <w:spacing w:line="240" w:lineRule="auto"/>
               <w:rPr>
-                <w:ins w:id="186" w:author="Ramin Miraftabi" w:date="2026-03-05T10:12:00Z" w16du:dateUtc="2026-03-05T09:12:00Z"/>
-              </w:rPr>
-            </w:pPr>
-            <w:ins w:id="187" w:author="Ramin Miraftabi" w:date="2026-03-05T10:12:00Z" w16du:dateUtc="2026-03-05T09:12:00Z">
+                <w:ins w:id="191" w:author="Ramin Miraftabi" w:date="2026-03-05T10:12:00Z" w16du:dateUtc="2026-03-05T09:12:00Z"/>
+              </w:rPr>
+            </w:pPr>
+            <w:ins w:id="192" w:author="Ramin Miraftabi" w:date="2026-03-05T10:12:00Z" w16du:dateUtc="2026-03-05T09:12:00Z">
               <w:r>
                 <w:t>This applies to both ship system and VTS system.</w:t>
               </w:r>
@@ -12266,10 +12288,10 @@
               </w:numPr>
               <w:spacing w:line="240" w:lineRule="auto"/>
               <w:rPr>
-                <w:ins w:id="188" w:author="Ramin Miraftabi" w:date="2026-03-05T10:12:00Z" w16du:dateUtc="2026-03-05T09:12:00Z"/>
-              </w:rPr>
-            </w:pPr>
-            <w:ins w:id="189" w:author="Ramin Miraftabi" w:date="2026-03-05T10:12:00Z" w16du:dateUtc="2026-03-05T09:12:00Z">
+                <w:ins w:id="193" w:author="Ramin Miraftabi" w:date="2026-03-05T10:12:00Z" w16du:dateUtc="2026-03-05T09:12:00Z"/>
+              </w:rPr>
+            </w:pPr>
+            <w:ins w:id="194" w:author="Ramin Miraftabi" w:date="2026-03-05T10:12:00Z" w16du:dateUtc="2026-03-05T09:12:00Z">
               <w:r>
                 <w:t>The actual frequencies and methods of retries are left to be defined in the service design.</w:t>
               </w:r>
@@ -12279,7 +12301,7 @@
       </w:tr>
       <w:tr>
         <w:trPr>
-          <w:ins w:id="190" w:author="Ramin Miraftabi" w:date="2026-03-05T10:12:00Z" w16du:dateUtc="2026-03-05T09:12:00Z"/>
+          <w:ins w:id="195" w:author="Ramin Miraftabi" w:date="2026-03-05T10:12:00Z" w16du:dateUtc="2026-03-05T09:12:00Z"/>
         </w:trPr>
         <w:tc>
           <w:tcPr>
@@ -12295,13 +12317,13 @@
               </w:numPr>
               <w:spacing w:line="240" w:lineRule="auto"/>
               <w:rPr>
-                <w:ins w:id="191" w:author="Ramin Miraftabi" w:date="2026-03-05T10:12:00Z" w16du:dateUtc="2026-03-05T09:12:00Z"/>
+                <w:ins w:id="196" w:author="Ramin Miraftabi" w:date="2026-03-05T10:12:00Z" w16du:dateUtc="2026-03-05T09:12:00Z"/>
                 <w:b/>
                 <w:bCs/>
                 <w:color w:val="00558C"/>
               </w:rPr>
             </w:pPr>
-            <w:ins w:id="192" w:author="Ramin Miraftabi" w:date="2026-03-05T10:12:00Z" w16du:dateUtc="2026-03-05T09:12:00Z">
+            <w:ins w:id="197" w:author="Ramin Miraftabi" w:date="2026-03-05T10:12:00Z" w16du:dateUtc="2026-03-05T09:12:00Z">
               <w:r>
                 <w:rPr>
                   <w:b/>
@@ -12326,10 +12348,10 @@
               </w:numPr>
               <w:spacing w:line="240" w:lineRule="auto"/>
               <w:rPr>
-                <w:ins w:id="193" w:author="Ramin Miraftabi" w:date="2026-03-05T10:12:00Z" w16du:dateUtc="2026-03-05T09:12:00Z"/>
-              </w:rPr>
-            </w:pPr>
-            <w:ins w:id="194" w:author="Ramin Miraftabi" w:date="2026-03-05T10:12:00Z" w16du:dateUtc="2026-03-05T09:12:00Z">
+                <w:ins w:id="198" w:author="Ramin Miraftabi" w:date="2026-03-05T10:12:00Z" w16du:dateUtc="2026-03-05T09:12:00Z"/>
+              </w:rPr>
+            </w:pPr>
+            <w:ins w:id="199" w:author="Ramin Miraftabi" w:date="2026-03-05T10:12:00Z" w16du:dateUtc="2026-03-05T09:12:00Z">
               <w:r>
                 <w:t xml:space="preserve">As </w:t>
               </w:r>
@@ -12343,12 +12365,12 @@
                 <w:t xml:space="preserve">clearance </w:t>
               </w:r>
             </w:ins>
-            <w:ins w:id="195" w:author="Ramin Miraftabi" w:date="2026-03-05T10:13:00Z" w16du:dateUtc="2026-03-05T09:13:00Z">
+            <w:ins w:id="200" w:author="Ramin Miraftabi" w:date="2026-03-05T10:13:00Z" w16du:dateUtc="2026-03-05T09:13:00Z">
               <w:r>
                 <w:t>messages</w:t>
               </w:r>
             </w:ins>
-            <w:ins w:id="196" w:author="Ramin Miraftabi" w:date="2026-03-05T10:12:00Z" w16du:dateUtc="2026-03-05T09:12:00Z">
+            <w:ins w:id="201" w:author="Ramin Miraftabi" w:date="2026-03-05T10:12:00Z" w16du:dateUtc="2026-03-05T09:12:00Z">
               <w:r>
                 <w:t xml:space="preserve"> and acknowledgments must be ensured.</w:t>
               </w:r>
@@ -12358,7 +12380,7 @@
       </w:tr>
       <w:tr>
         <w:trPr>
-          <w:ins w:id="197" w:author="Ramin Miraftabi" w:date="2026-03-05T10:12:00Z" w16du:dateUtc="2026-03-05T09:12:00Z"/>
+          <w:ins w:id="202" w:author="Ramin Miraftabi" w:date="2026-03-05T10:12:00Z" w16du:dateUtc="2026-03-05T09:12:00Z"/>
         </w:trPr>
         <w:tc>
           <w:tcPr>
@@ -12374,13 +12396,13 @@
               </w:numPr>
               <w:spacing w:line="240" w:lineRule="auto"/>
               <w:rPr>
-                <w:ins w:id="198" w:author="Ramin Miraftabi" w:date="2026-03-05T10:12:00Z" w16du:dateUtc="2026-03-05T09:12:00Z"/>
+                <w:ins w:id="203" w:author="Ramin Miraftabi" w:date="2026-03-05T10:12:00Z" w16du:dateUtc="2026-03-05T09:12:00Z"/>
                 <w:b/>
                 <w:bCs/>
                 <w:color w:val="00558C"/>
               </w:rPr>
             </w:pPr>
-            <w:ins w:id="199" w:author="Ramin Miraftabi" w:date="2026-03-05T10:12:00Z" w16du:dateUtc="2026-03-05T09:12:00Z">
+            <w:ins w:id="204" w:author="Ramin Miraftabi" w:date="2026-03-05T10:12:00Z" w16du:dateUtc="2026-03-05T09:12:00Z">
               <w:r>
                 <w:rPr>
                   <w:b/>
@@ -12406,7 +12428,7 @@
               </w:numPr>
               <w:spacing w:line="240" w:lineRule="auto"/>
               <w:rPr>
-                <w:ins w:id="200" w:author="Ramin Miraftabi" w:date="2026-03-05T10:12:00Z" w16du:dateUtc="2026-03-05T09:12:00Z"/>
+                <w:ins w:id="205" w:author="Ramin Miraftabi" w:date="2026-03-05T10:12:00Z" w16du:dateUtc="2026-03-05T09:12:00Z"/>
               </w:rPr>
             </w:pPr>
           </w:p>
@@ -12417,7 +12439,7 @@
       <w:pPr>
         <w:pStyle w:val="BodyText"/>
         <w:rPr>
-          <w:ins w:id="201" w:author="Ramin Miraftabi" w:date="2026-03-05T10:12:00Z" w16du:dateUtc="2026-03-05T09:12:00Z"/>
+          <w:ins w:id="206" w:author="Ramin Miraftabi" w:date="2026-03-05T10:12:00Z" w16du:dateUtc="2026-03-05T09:12:00Z"/>
         </w:rPr>
       </w:pPr>
     </w:p>
@@ -12434,7 +12456,7 @@
       </w:tblGrid>
       <w:tr>
         <w:trPr>
-          <w:ins w:id="202" w:author="Ramin Miraftabi" w:date="2026-03-05T10:12:00Z" w16du:dateUtc="2026-03-05T09:12:00Z"/>
+          <w:ins w:id="207" w:author="Ramin Miraftabi" w:date="2026-03-05T10:12:00Z" w16du:dateUtc="2026-03-05T09:12:00Z"/>
         </w:trPr>
         <w:tc>
           <w:tcPr>
@@ -12450,13 +12472,13 @@
               </w:numPr>
               <w:spacing w:line="240" w:lineRule="auto"/>
               <w:rPr>
-                <w:ins w:id="203" w:author="Ramin Miraftabi" w:date="2026-03-05T10:12:00Z" w16du:dateUtc="2026-03-05T09:12:00Z"/>
+                <w:ins w:id="208" w:author="Ramin Miraftabi" w:date="2026-03-05T10:12:00Z" w16du:dateUtc="2026-03-05T09:12:00Z"/>
                 <w:b/>
                 <w:bCs/>
                 <w:color w:val="00558C"/>
               </w:rPr>
             </w:pPr>
-            <w:ins w:id="204" w:author="Ramin Miraftabi" w:date="2026-03-05T10:12:00Z" w16du:dateUtc="2026-03-05T09:12:00Z">
+            <w:ins w:id="209" w:author="Ramin Miraftabi" w:date="2026-03-05T10:12:00Z" w16du:dateUtc="2026-03-05T09:12:00Z">
               <w:r>
                 <w:rPr>
                   <w:b/>
@@ -12482,10 +12504,10 @@
               </w:numPr>
               <w:spacing w:line="240" w:lineRule="auto"/>
               <w:rPr>
-                <w:ins w:id="205" w:author="Ramin Miraftabi" w:date="2026-03-05T10:12:00Z" w16du:dateUtc="2026-03-05T09:12:00Z"/>
-              </w:rPr>
-            </w:pPr>
-            <w:ins w:id="206" w:author="Ramin Miraftabi" w:date="2026-03-05T10:12:00Z" w16du:dateUtc="2026-03-05T09:12:00Z">
+                <w:ins w:id="210" w:author="Ramin Miraftabi" w:date="2026-03-05T10:12:00Z" w16du:dateUtc="2026-03-05T09:12:00Z"/>
+              </w:rPr>
+            </w:pPr>
+            <w:ins w:id="211" w:author="Ramin Miraftabi" w:date="2026-03-05T10:12:00Z" w16du:dateUtc="2026-03-05T09:12:00Z">
               <w:r>
                 <w:t>TCS</w:t>
               </w:r>
@@ -12504,7 +12526,7 @@
       </w:tr>
       <w:tr>
         <w:trPr>
-          <w:ins w:id="207" w:author="Ramin Miraftabi" w:date="2026-03-05T10:12:00Z" w16du:dateUtc="2026-03-05T09:12:00Z"/>
+          <w:ins w:id="212" w:author="Ramin Miraftabi" w:date="2026-03-05T10:12:00Z" w16du:dateUtc="2026-03-05T09:12:00Z"/>
         </w:trPr>
         <w:tc>
           <w:tcPr>
@@ -12520,13 +12542,13 @@
               </w:numPr>
               <w:spacing w:line="240" w:lineRule="auto"/>
               <w:rPr>
-                <w:ins w:id="208" w:author="Ramin Miraftabi" w:date="2026-03-05T10:12:00Z" w16du:dateUtc="2026-03-05T09:12:00Z"/>
+                <w:ins w:id="213" w:author="Ramin Miraftabi" w:date="2026-03-05T10:12:00Z" w16du:dateUtc="2026-03-05T09:12:00Z"/>
                 <w:b/>
                 <w:bCs/>
                 <w:color w:val="00558C"/>
               </w:rPr>
             </w:pPr>
-            <w:ins w:id="209" w:author="Ramin Miraftabi" w:date="2026-03-05T10:12:00Z" w16du:dateUtc="2026-03-05T09:12:00Z">
+            <w:ins w:id="214" w:author="Ramin Miraftabi" w:date="2026-03-05T10:12:00Z" w16du:dateUtc="2026-03-05T09:12:00Z">
               <w:r>
                 <w:rPr>
                   <w:b/>
@@ -12551,10 +12573,10 @@
               </w:numPr>
               <w:spacing w:line="240" w:lineRule="auto"/>
               <w:rPr>
-                <w:ins w:id="210" w:author="Ramin Miraftabi" w:date="2026-03-05T10:12:00Z" w16du:dateUtc="2026-03-05T09:12:00Z"/>
-              </w:rPr>
-            </w:pPr>
-            <w:ins w:id="211" w:author="Ramin Miraftabi" w:date="2026-03-05T10:12:00Z" w16du:dateUtc="2026-03-05T09:12:00Z">
+                <w:ins w:id="215" w:author="Ramin Miraftabi" w:date="2026-03-05T10:12:00Z" w16du:dateUtc="2026-03-05T09:12:00Z"/>
+              </w:rPr>
+            </w:pPr>
+            <w:ins w:id="216" w:author="Ramin Miraftabi" w:date="2026-03-05T10:12:00Z" w16du:dateUtc="2026-03-05T09:12:00Z">
               <w:r>
                 <w:rPr>
                   <w:color w:val="000000" w:themeColor="text1"/>
@@ -12567,7 +12589,7 @@
       </w:tr>
       <w:tr>
         <w:trPr>
-          <w:ins w:id="212" w:author="Ramin Miraftabi" w:date="2026-03-05T10:12:00Z" w16du:dateUtc="2026-03-05T09:12:00Z"/>
+          <w:ins w:id="217" w:author="Ramin Miraftabi" w:date="2026-03-05T10:12:00Z" w16du:dateUtc="2026-03-05T09:12:00Z"/>
         </w:trPr>
         <w:tc>
           <w:tcPr>
@@ -12583,13 +12605,13 @@
               </w:numPr>
               <w:spacing w:line="240" w:lineRule="auto"/>
               <w:rPr>
-                <w:ins w:id="213" w:author="Ramin Miraftabi" w:date="2026-03-05T10:12:00Z" w16du:dateUtc="2026-03-05T09:12:00Z"/>
+                <w:ins w:id="218" w:author="Ramin Miraftabi" w:date="2026-03-05T10:12:00Z" w16du:dateUtc="2026-03-05T09:12:00Z"/>
                 <w:b/>
                 <w:bCs/>
                 <w:color w:val="00558C"/>
               </w:rPr>
             </w:pPr>
-            <w:ins w:id="214" w:author="Ramin Miraftabi" w:date="2026-03-05T10:12:00Z" w16du:dateUtc="2026-03-05T09:12:00Z">
+            <w:ins w:id="219" w:author="Ramin Miraftabi" w:date="2026-03-05T10:12:00Z" w16du:dateUtc="2026-03-05T09:12:00Z">
               <w:r>
                 <w:rPr>
                   <w:b/>
@@ -12614,10 +12636,10 @@
               </w:numPr>
               <w:spacing w:line="240" w:lineRule="auto"/>
               <w:rPr>
-                <w:ins w:id="215" w:author="Ramin Miraftabi" w:date="2026-03-05T10:12:00Z" w16du:dateUtc="2026-03-05T09:12:00Z"/>
-              </w:rPr>
-            </w:pPr>
-            <w:ins w:id="216" w:author="Ramin Miraftabi" w:date="2026-03-05T10:12:00Z" w16du:dateUtc="2026-03-05T09:12:00Z">
+                <w:ins w:id="220" w:author="Ramin Miraftabi" w:date="2026-03-05T10:12:00Z" w16du:dateUtc="2026-03-05T09:12:00Z"/>
+              </w:rPr>
+            </w:pPr>
+            <w:ins w:id="221" w:author="Ramin Miraftabi" w:date="2026-03-05T10:12:00Z" w16du:dateUtc="2026-03-05T09:12:00Z">
               <w:r>
                 <w:t xml:space="preserve">All communication between service and consumer must be encrypted during transport (transport layer encryption). </w:t>
               </w:r>
@@ -12632,15 +12654,15 @@
               </w:numPr>
               <w:spacing w:line="240" w:lineRule="auto"/>
               <w:rPr>
-                <w:ins w:id="217" w:author="Ramin Miraftabi" w:date="2026-03-05T10:12:00Z" w16du:dateUtc="2026-03-05T09:12:00Z"/>
-              </w:rPr>
-            </w:pPr>
-            <w:ins w:id="218" w:author="Ramin Miraftabi" w:date="2026-03-05T10:13:00Z" w16du:dateUtc="2026-03-05T09:13:00Z">
+                <w:ins w:id="222" w:author="Ramin Miraftabi" w:date="2026-03-05T10:12:00Z" w16du:dateUtc="2026-03-05T09:12:00Z"/>
+              </w:rPr>
+            </w:pPr>
+            <w:ins w:id="223" w:author="Ramin Miraftabi" w:date="2026-03-05T10:13:00Z" w16du:dateUtc="2026-03-05T09:13:00Z">
               <w:r>
                 <w:t>Additional payload encryption is not supported in t</w:t>
               </w:r>
             </w:ins>
-            <w:ins w:id="219" w:author="Ramin Miraftabi" w:date="2026-03-05T10:14:00Z" w16du:dateUtc="2026-03-05T09:14:00Z">
+            <w:ins w:id="224" w:author="Ramin Miraftabi" w:date="2026-03-05T10:14:00Z" w16du:dateUtc="2026-03-05T09:14:00Z">
               <w:r>
                 <w:t>he context of this service.</w:t>
               </w:r>
@@ -12650,7 +12672,7 @@
       </w:tr>
       <w:tr>
         <w:trPr>
-          <w:ins w:id="220" w:author="Ramin Miraftabi" w:date="2026-03-05T10:12:00Z" w16du:dateUtc="2026-03-05T09:12:00Z"/>
+          <w:ins w:id="225" w:author="Ramin Miraftabi" w:date="2026-03-05T10:12:00Z" w16du:dateUtc="2026-03-05T09:12:00Z"/>
         </w:trPr>
         <w:tc>
           <w:tcPr>
@@ -12666,13 +12688,13 @@
               </w:numPr>
               <w:spacing w:line="240" w:lineRule="auto"/>
               <w:rPr>
-                <w:ins w:id="221" w:author="Ramin Miraftabi" w:date="2026-03-05T10:12:00Z" w16du:dateUtc="2026-03-05T09:12:00Z"/>
+                <w:ins w:id="226" w:author="Ramin Miraftabi" w:date="2026-03-05T10:12:00Z" w16du:dateUtc="2026-03-05T09:12:00Z"/>
                 <w:b/>
                 <w:bCs/>
                 <w:color w:val="00558C"/>
               </w:rPr>
             </w:pPr>
-            <w:ins w:id="222" w:author="Ramin Miraftabi" w:date="2026-03-05T10:12:00Z" w16du:dateUtc="2026-03-05T09:12:00Z">
+            <w:ins w:id="227" w:author="Ramin Miraftabi" w:date="2026-03-05T10:12:00Z" w16du:dateUtc="2026-03-05T09:12:00Z">
               <w:r>
                 <w:rPr>
                   <w:b/>
@@ -12697,10 +12719,10 @@
               </w:numPr>
               <w:spacing w:line="240" w:lineRule="auto"/>
               <w:rPr>
-                <w:ins w:id="223" w:author="Ramin Miraftabi" w:date="2026-03-05T10:12:00Z" w16du:dateUtc="2026-03-05T09:12:00Z"/>
-              </w:rPr>
-            </w:pPr>
-            <w:ins w:id="224" w:author="Ramin Miraftabi" w:date="2026-03-05T10:12:00Z" w16du:dateUtc="2026-03-05T09:12:00Z">
+                <w:ins w:id="228" w:author="Ramin Miraftabi" w:date="2026-03-05T10:12:00Z" w16du:dateUtc="2026-03-05T09:12:00Z"/>
+              </w:rPr>
+            </w:pPr>
+            <w:ins w:id="229" w:author="Ramin Miraftabi" w:date="2026-03-05T10:12:00Z" w16du:dateUtc="2026-03-05T09:12:00Z">
               <w:r>
                 <w:t xml:space="preserve">IACS UR E27 </w:t>
               </w:r>
@@ -12723,12 +12745,12 @@
                 <w:t xml:space="preserve"> requires the use of encryption between </w:t>
               </w:r>
             </w:ins>
-            <w:ins w:id="225" w:author="Ramin Miraftabi" w:date="2026-03-05T10:17:00Z" w16du:dateUtc="2026-03-05T09:17:00Z">
+            <w:ins w:id="230" w:author="Ramin Miraftabi" w:date="2026-03-05T10:17:00Z" w16du:dateUtc="2026-03-05T09:17:00Z">
               <w:r>
                 <w:t>shipborne equipment</w:t>
               </w:r>
             </w:ins>
-            <w:ins w:id="226" w:author="Ramin Miraftabi" w:date="2026-03-05T10:12:00Z" w16du:dateUtc="2026-03-05T09:12:00Z">
+            <w:ins w:id="231" w:author="Ramin Miraftabi" w:date="2026-03-05T10:12:00Z" w16du:dateUtc="2026-03-05T09:12:00Z">
               <w:r>
                 <w:t xml:space="preserve"> and shore-based systems.</w:t>
               </w:r>
@@ -12743,10 +12765,10 @@
               </w:numPr>
               <w:spacing w:line="240" w:lineRule="auto"/>
               <w:rPr>
-                <w:ins w:id="227" w:author="Ramin Miraftabi" w:date="2026-03-05T10:12:00Z" w16du:dateUtc="2026-03-05T09:12:00Z"/>
-              </w:rPr>
-            </w:pPr>
-            <w:ins w:id="228" w:author="Ramin Miraftabi" w:date="2026-03-05T10:17:00Z" w16du:dateUtc="2026-03-05T09:17:00Z">
+                <w:ins w:id="232" w:author="Ramin Miraftabi" w:date="2026-03-05T10:12:00Z" w16du:dateUtc="2026-03-05T09:12:00Z"/>
+              </w:rPr>
+            </w:pPr>
+            <w:ins w:id="233" w:author="Ramin Miraftabi" w:date="2026-03-05T10:17:00Z" w16du:dateUtc="2026-03-05T09:17:00Z">
               <w:r>
                 <w:t>Payload encryption is not required in the scope of traffic clearance messages.</w:t>
               </w:r>
@@ -12756,7 +12778,7 @@
       </w:tr>
       <w:tr>
         <w:trPr>
-          <w:ins w:id="229" w:author="Ramin Miraftabi" w:date="2026-03-05T10:12:00Z" w16du:dateUtc="2026-03-05T09:12:00Z"/>
+          <w:ins w:id="234" w:author="Ramin Miraftabi" w:date="2026-03-05T10:12:00Z" w16du:dateUtc="2026-03-05T09:12:00Z"/>
         </w:trPr>
         <w:tc>
           <w:tcPr>
@@ -12772,13 +12794,13 @@
               </w:numPr>
               <w:spacing w:line="240" w:lineRule="auto"/>
               <w:rPr>
-                <w:ins w:id="230" w:author="Ramin Miraftabi" w:date="2026-03-05T10:12:00Z" w16du:dateUtc="2026-03-05T09:12:00Z"/>
+                <w:ins w:id="235" w:author="Ramin Miraftabi" w:date="2026-03-05T10:12:00Z" w16du:dateUtc="2026-03-05T09:12:00Z"/>
                 <w:b/>
                 <w:bCs/>
                 <w:color w:val="00558C"/>
               </w:rPr>
             </w:pPr>
-            <w:ins w:id="231" w:author="Ramin Miraftabi" w:date="2026-03-05T10:12:00Z" w16du:dateUtc="2026-03-05T09:12:00Z">
+            <w:ins w:id="236" w:author="Ramin Miraftabi" w:date="2026-03-05T10:12:00Z" w16du:dateUtc="2026-03-05T09:12:00Z">
               <w:r>
                 <w:rPr>
                   <w:b/>
@@ -12804,7 +12826,7 @@
               </w:numPr>
               <w:spacing w:line="240" w:lineRule="auto"/>
               <w:rPr>
-                <w:ins w:id="232" w:author="Ramin Miraftabi" w:date="2026-03-05T10:12:00Z" w16du:dateUtc="2026-03-05T09:12:00Z"/>
+                <w:ins w:id="237" w:author="Ramin Miraftabi" w:date="2026-03-05T10:12:00Z" w16du:dateUtc="2026-03-05T09:12:00Z"/>
               </w:rPr>
             </w:pPr>
           </w:p>
@@ -12814,10 +12836,10 @@
     <w:p>
       <w:pPr>
         <w:rPr>
-          <w:ins w:id="233" w:author="Ramin Miraftabi" w:date="2026-03-05T10:05:00Z" w16du:dateUtc="2026-03-05T09:05:00Z"/>
-          <w:lang w:val="en-US"/>
-        </w:rPr>
-        <w:pPrChange w:id="234" w:author="Ramin Miraftabi" w:date="2026-03-05T10:05:00Z" w16du:dateUtc="2026-03-05T09:05:00Z">
+          <w:ins w:id="238" w:author="Ramin Miraftabi" w:date="2026-03-05T10:05:00Z" w16du:dateUtc="2026-03-05T09:05:00Z"/>
+          <w:lang w:val="en-US"/>
+        </w:rPr>
+        <w:pPrChange w:id="239" w:author="Ramin Miraftabi" w:date="2026-03-05T10:05:00Z" w16du:dateUtc="2026-03-05T09:05:00Z">
           <w:pPr>
             <w:pStyle w:val="Heading3"/>
             <w:spacing w:before="240"/>
@@ -12832,27 +12854,17 @@
         <w:spacing w:before="240"/>
         <w:ind w:left="856" w:hanging="856"/>
         <w:rPr>
-          <w:del w:id="235" w:author="Ramin Miraftabi" w:date="2026-03-05T10:17:00Z" w16du:dateUtc="2026-03-05T09:17:00Z"/>
-          <w:lang w:val="en-US"/>
-        </w:rPr>
-      </w:pPr>
-      <w:commentRangeStart w:id="236"/>
+          <w:del w:id="240" w:author="Ramin Miraftabi" w:date="2026-03-05T10:17:00Z" w16du:dateUtc="2026-03-05T09:17:00Z"/>
+          <w:lang w:val="en-US"/>
+        </w:rPr>
+      </w:pPr>
       <w:r>
         <w:rPr>
           <w:lang w:val="en-US"/>
         </w:rPr>
         <w:t>Non-functional requirements</w:t>
       </w:r>
-      <w:bookmarkEnd w:id="67"/>
-      <w:commentRangeEnd w:id="236"/>
-      <w:r>
-        <w:rPr>
-          <w:rStyle w:val="CommentReference"/>
-          <w:i w:val="0"/>
-          <w:color w:val="auto"/>
-        </w:rPr>
-        <w:commentReference w:id="236"/>
-      </w:r>
+      <w:bookmarkEnd w:id="72"/>
     </w:p>
     <w:p>
       <w:pPr>
@@ -12862,7 +12874,7 @@
         <w:rPr>
           <w:lang w:val="en-US"/>
         </w:rPr>
-        <w:pPrChange w:id="237" w:author="Ramin Miraftabi" w:date="2026-03-05T10:17:00Z" w16du:dateUtc="2026-03-05T09:17:00Z">
+        <w:pPrChange w:id="241" w:author="Ramin Miraftabi" w:date="2026-03-05T10:17:00Z" w16du:dateUtc="2026-03-05T09:17:00Z">
           <w:pPr>
             <w:pStyle w:val="BodyText"/>
           </w:pPr>
@@ -12929,12 +12941,12 @@
             <w:r>
               <w:t>TCSNF00</w:t>
             </w:r>
-            <w:ins w:id="238" w:author="Ramin Miraftabi" w:date="2026-03-05T10:17:00Z" w16du:dateUtc="2026-03-05T09:17:00Z">
+            <w:ins w:id="242" w:author="Ramin Miraftabi" w:date="2026-03-05T10:17:00Z" w16du:dateUtc="2026-03-05T09:17:00Z">
               <w:r>
                 <w:t>1</w:t>
               </w:r>
             </w:ins>
-            <w:del w:id="239" w:author="Ramin Miraftabi" w:date="2026-03-05T10:17:00Z" w16du:dateUtc="2026-03-05T09:17:00Z">
+            <w:del w:id="243" w:author="Ramin Miraftabi" w:date="2026-03-05T10:17:00Z" w16du:dateUtc="2026-03-05T09:17:00Z">
               <w:r>
                 <w:delText>2</w:delText>
               </w:r>
@@ -13214,12 +13226,12 @@
             <w:r>
               <w:t>TCSNF00</w:t>
             </w:r>
-            <w:ins w:id="240" w:author="Ramin Miraftabi" w:date="2026-03-05T10:17:00Z" w16du:dateUtc="2026-03-05T09:17:00Z">
+            <w:ins w:id="244" w:author="Ramin Miraftabi" w:date="2026-03-05T10:17:00Z" w16du:dateUtc="2026-03-05T09:17:00Z">
               <w:r>
                 <w:t>2</w:t>
               </w:r>
             </w:ins>
-            <w:del w:id="241" w:author="Ramin Miraftabi" w:date="2026-03-05T10:17:00Z" w16du:dateUtc="2026-03-05T09:17:00Z">
+            <w:del w:id="245" w:author="Ramin Miraftabi" w:date="2026-03-05T10:17:00Z" w16du:dateUtc="2026-03-05T09:17:00Z">
               <w:r>
                 <w:delText>3</w:delText>
               </w:r>
@@ -13501,12 +13513,12 @@
             <w:r>
               <w:t>TCSNF00</w:t>
             </w:r>
-            <w:ins w:id="242" w:author="Ramin Miraftabi" w:date="2026-03-05T10:17:00Z" w16du:dateUtc="2026-03-05T09:17:00Z">
+            <w:ins w:id="246" w:author="Ramin Miraftabi" w:date="2026-03-05T10:17:00Z" w16du:dateUtc="2026-03-05T09:17:00Z">
               <w:r>
                 <w:t>3</w:t>
               </w:r>
             </w:ins>
-            <w:del w:id="243" w:author="Ramin Miraftabi" w:date="2026-03-05T10:17:00Z" w16du:dateUtc="2026-03-05T09:17:00Z">
+            <w:del w:id="247" w:author="Ramin Miraftabi" w:date="2026-03-05T10:17:00Z" w16du:dateUtc="2026-03-05T09:17:00Z">
               <w:r>
                 <w:delText>4</w:delText>
               </w:r>
@@ -13724,7 +13736,7 @@
       <w:pPr>
         <w:pStyle w:val="BodyText"/>
         <w:rPr>
-          <w:del w:id="244" w:author="Ramin Miraftabi" w:date="2026-03-05T10:18:00Z" w16du:dateUtc="2026-03-05T09:18:00Z"/>
+          <w:del w:id="248" w:author="Ramin Miraftabi" w:date="2026-03-05T10:18:00Z" w16du:dateUtc="2026-03-05T09:18:00Z"/>
           <w:lang w:val="en-US"/>
         </w:rPr>
       </w:pPr>
@@ -13744,14 +13756,14 @@
           <w:lang w:val="en-US"/>
         </w:rPr>
       </w:pPr>
-      <w:bookmarkStart w:id="245" w:name="_Toc196547469"/>
+      <w:bookmarkStart w:id="249" w:name="_Toc196547469"/>
       <w:r>
         <w:rPr>
           <w:lang w:val="en-US"/>
         </w:rPr>
         <w:t>Other constraints</w:t>
       </w:r>
-      <w:bookmarkEnd w:id="245"/>
+      <w:bookmarkEnd w:id="249"/>
     </w:p>
     <w:p>
       <w:pPr>
@@ -13768,14 +13780,14 @@
           <w:lang w:val="en-US"/>
         </w:rPr>
       </w:pPr>
-      <w:bookmarkStart w:id="246" w:name="_Toc196547470"/>
+      <w:bookmarkStart w:id="250" w:name="_Toc196547470"/>
       <w:r>
         <w:rPr>
           <w:lang w:val="en-US"/>
         </w:rPr>
         <w:t>Relevant Industrial Standards</w:t>
       </w:r>
-      <w:bookmarkEnd w:id="246"/>
+      <w:bookmarkEnd w:id="250"/>
     </w:p>
     <w:p>
       <w:pPr>
@@ -13808,7 +13820,7 @@
         </w:rPr>
         <w:t>ED 1.</w:t>
       </w:r>
-      <w:ins w:id="247" w:author="Pitkänen Juho" w:date="2026-03-03T16:22:00Z" w16du:dateUtc="2026-03-03T15:22:00Z">
+      <w:ins w:id="251" w:author="Pitkänen Juho" w:date="2026-03-03T16:22:00Z" w16du:dateUtc="2026-03-03T15:22:00Z">
         <w:r>
           <w:rPr>
             <w:lang w:val="en-US"/>
@@ -13816,7 +13828,7 @@
           <w:t>7</w:t>
         </w:r>
       </w:ins>
-      <w:del w:id="248" w:author="Pitkänen Juho" w:date="2026-03-03T16:22:00Z" w16du:dateUtc="2026-03-03T15:22:00Z">
+      <w:del w:id="252" w:author="Pitkänen Juho" w:date="2026-03-03T16:22:00Z" w16du:dateUtc="2026-03-03T15:22:00Z">
         <w:r>
           <w:rPr>
             <w:lang w:val="en-US"/>
@@ -13894,7 +13906,7 @@
           <w:lang w:val="en-US"/>
         </w:rPr>
       </w:pPr>
-      <w:commentRangeStart w:id="249"/>
+      <w:commentRangeStart w:id="253"/>
       <w:r>
         <w:rPr>
           <w:lang w:val="en-US"/>
@@ -13942,14 +13954,14 @@
         <w:tab/>
         <w:t>0.7 (draft)</w:t>
       </w:r>
-      <w:commentRangeEnd w:id="249"/>
+      <w:commentRangeEnd w:id="253"/>
       <w:r>
         <w:rPr>
           <w:rStyle w:val="CommentReference"/>
           <w:sz w:val="22"/>
           <w:lang w:val="en-US"/>
         </w:rPr>
-        <w:commentReference w:id="249"/>
+        <w:commentReference w:id="253"/>
       </w:r>
       <w:r>
         <w:rPr>
@@ -13971,7 +13983,7 @@
           <w:lang w:val="en-US"/>
         </w:rPr>
       </w:pPr>
-      <w:commentRangeStart w:id="250"/>
+      <w:commentRangeStart w:id="254"/>
       <w:r>
         <w:rPr>
           <w:lang w:val="en-US"/>
@@ -14002,14 +14014,14 @@
         </w:rPr>
         <w:t>Route Plan based on S-100 (IEC 63173)</w:t>
       </w:r>
-      <w:commentRangeEnd w:id="250"/>
+      <w:commentRangeEnd w:id="254"/>
       <w:r>
         <w:rPr>
           <w:rStyle w:val="CommentReference"/>
           <w:sz w:val="22"/>
           <w:lang w:val="en-US"/>
         </w:rPr>
-        <w:commentReference w:id="250"/>
+        <w:commentReference w:id="254"/>
       </w:r>
     </w:p>
     <w:p>
@@ -14072,7 +14084,7 @@
           <w:lang w:val="en-US"/>
         </w:rPr>
       </w:pPr>
-      <w:commentRangeStart w:id="251"/>
+      <w:commentRangeStart w:id="255"/>
       <w:r>
         <w:rPr>
           <w:lang w:val="en-US"/>
@@ -14092,7 +14104,7 @@
         </w:rPr>
         <w:t>Unversioned</w:t>
       </w:r>
-      <w:commentRangeEnd w:id="251"/>
+      <w:commentRangeEnd w:id="255"/>
       <w:proofErr w:type="spellEnd"/>
       <w:r>
         <w:rPr>
@@ -14100,7 +14112,7 @@
           <w:sz w:val="22"/>
           <w:lang w:val="en-US"/>
         </w:rPr>
-        <w:commentReference w:id="251"/>
+        <w:commentReference w:id="255"/>
       </w:r>
       <w:r>
         <w:rPr>
@@ -14117,7 +14129,7 @@
           <w:lang w:val="en-US"/>
         </w:rPr>
       </w:pPr>
-      <w:bookmarkStart w:id="252" w:name="_Toc196547471"/>
+      <w:bookmarkStart w:id="256" w:name="_Toc196547471"/>
       <w:r>
         <w:rPr>
           <w:lang w:val="en-US"/>
@@ -14125,7 +14137,7 @@
         <w:lastRenderedPageBreak/>
         <w:t>Operational nodes</w:t>
       </w:r>
-      <w:bookmarkEnd w:id="252"/>
+      <w:bookmarkEnd w:id="256"/>
     </w:p>
     <w:tbl>
       <w:tblPr>
@@ -14137,7 +14149,7 @@
       <w:tblGrid>
         <w:gridCol w:w="2405"/>
         <w:gridCol w:w="7336"/>
-        <w:tblGridChange w:id="253">
+        <w:tblGridChange w:id="257">
           <w:tblGrid>
             <w:gridCol w:w="2405"/>
             <w:gridCol w:w="7336"/>
@@ -14239,7 +14251,7 @@
             <w:r>
               <w:t xml:space="preserve">sailing </w:t>
             </w:r>
-            <w:ins w:id="254" w:author="Ramin Miraftabi" w:date="2026-03-05T10:20:00Z" w16du:dateUtc="2026-03-05T09:20:00Z">
+            <w:ins w:id="258" w:author="Ramin Miraftabi" w:date="2026-03-05T10:20:00Z" w16du:dateUtc="2026-03-05T09:20:00Z">
               <w:r>
                 <w:t xml:space="preserve"> </w:t>
               </w:r>
@@ -14259,7 +14271,7 @@
       </w:tr>
       <w:tr>
         <w:trPr>
-          <w:del w:id="255" w:author="Ramin Miraftabi" w:date="2026-03-05T10:21:00Z" w16du:dateUtc="2026-03-05T09:21:00Z"/>
+          <w:del w:id="259" w:author="Ramin Miraftabi" w:date="2026-03-05T10:21:00Z" w16du:dateUtc="2026-03-05T09:21:00Z"/>
         </w:trPr>
         <w:tc>
           <w:tcPr>
@@ -14270,10 +14282,10 @@
             <w:pPr>
               <w:pStyle w:val="Tabletext"/>
               <w:rPr>
-                <w:del w:id="256" w:author="Ramin Miraftabi" w:date="2026-03-05T10:21:00Z" w16du:dateUtc="2026-03-05T09:21:00Z"/>
-              </w:rPr>
-            </w:pPr>
-            <w:del w:id="257" w:author="Ramin Miraftabi" w:date="2026-03-05T10:21:00Z" w16du:dateUtc="2026-03-05T09:21:00Z">
+                <w:del w:id="260" w:author="Ramin Miraftabi" w:date="2026-03-05T10:21:00Z" w16du:dateUtc="2026-03-05T09:21:00Z"/>
+              </w:rPr>
+            </w:pPr>
+            <w:del w:id="261" w:author="Ramin Miraftabi" w:date="2026-03-05T10:21:00Z" w16du:dateUtc="2026-03-05T09:21:00Z">
               <w:r>
                 <w:delText>VTS centre</w:delText>
               </w:r>
@@ -14289,10 +14301,10 @@
             <w:pPr>
               <w:pStyle w:val="Tabletext"/>
               <w:rPr>
-                <w:del w:id="258" w:author="Ramin Miraftabi" w:date="2026-03-05T10:21:00Z" w16du:dateUtc="2026-03-05T09:21:00Z"/>
-              </w:rPr>
-            </w:pPr>
-            <w:del w:id="259" w:author="Ramin Miraftabi" w:date="2026-03-05T10:21:00Z" w16du:dateUtc="2026-03-05T09:21:00Z">
+                <w:del w:id="262" w:author="Ramin Miraftabi" w:date="2026-03-05T10:21:00Z" w16du:dateUtc="2026-03-05T09:21:00Z"/>
+              </w:rPr>
+            </w:pPr>
+            <w:del w:id="263" w:author="Ramin Miraftabi" w:date="2026-03-05T10:21:00Z" w16du:dateUtc="2026-03-05T09:21:00Z">
               <w:r>
                 <w:delText>VTS centre responsible for a one or several VTS Areas for which the VTS provider is authorized to deliver vessel traffic services. A VTS centre is responsible for VTS traffic clearance service within its coverage area.</w:delText>
               </w:r>
@@ -14302,7 +14314,7 @@
       </w:tr>
       <w:tr>
         <w:trPr>
-          <w:ins w:id="260" w:author="Ramin Miraftabi" w:date="2026-03-05T10:20:00Z" w16du:dateUtc="2026-03-05T09:20:00Z"/>
+          <w:ins w:id="264" w:author="Ramin Miraftabi" w:date="2026-03-05T10:20:00Z" w16du:dateUtc="2026-03-05T09:20:00Z"/>
         </w:trPr>
         <w:tc>
           <w:tcPr>
@@ -14312,10 +14324,10 @@
             <w:pPr>
               <w:pStyle w:val="Tabletext"/>
               <w:rPr>
-                <w:ins w:id="261" w:author="Ramin Miraftabi" w:date="2026-03-05T10:20:00Z" w16du:dateUtc="2026-03-05T09:20:00Z"/>
-              </w:rPr>
-            </w:pPr>
-            <w:ins w:id="262" w:author="Ramin Miraftabi" w:date="2026-03-05T10:20:00Z" w16du:dateUtc="2026-03-05T09:20:00Z">
+                <w:ins w:id="265" w:author="Ramin Miraftabi" w:date="2026-03-05T10:20:00Z" w16du:dateUtc="2026-03-05T09:20:00Z"/>
+              </w:rPr>
+            </w:pPr>
+            <w:ins w:id="266" w:author="Ramin Miraftabi" w:date="2026-03-05T10:20:00Z" w16du:dateUtc="2026-03-05T09:20:00Z">
               <w:r>
                 <w:t>Mariner</w:t>
               </w:r>
@@ -14330,12 +14342,12 @@
             <w:pPr>
               <w:pStyle w:val="Tabletext"/>
               <w:rPr>
-                <w:ins w:id="263" w:author="Ramin Miraftabi" w:date="2026-03-05T10:20:00Z" w16du:dateUtc="2026-03-05T09:20:00Z"/>
+                <w:ins w:id="267" w:author="Ramin Miraftabi" w:date="2026-03-05T10:20:00Z" w16du:dateUtc="2026-03-05T09:20:00Z"/>
                 <w:i/>
                 <w:iCs/>
               </w:rPr>
             </w:pPr>
-            <w:ins w:id="264" w:author="Ramin Miraftabi" w:date="2026-03-05T10:20:00Z" w16du:dateUtc="2026-03-05T09:20:00Z">
+            <w:ins w:id="268" w:author="Ramin Miraftabi" w:date="2026-03-05T10:20:00Z" w16du:dateUtc="2026-03-05T09:20:00Z">
               <w:r>
                 <w:t>In this document mariner means a person who is part of the bridge team that is responsible for the navigation of the vessel.</w:t>
               </w:r>
@@ -14345,7 +14357,7 @@
       </w:tr>
       <w:tr>
         <w:trPr>
-          <w:ins w:id="265" w:author="Ramin Miraftabi" w:date="2026-03-05T10:20:00Z" w16du:dateUtc="2026-03-05T09:20:00Z"/>
+          <w:ins w:id="269" w:author="Ramin Miraftabi" w:date="2026-03-05T10:20:00Z" w16du:dateUtc="2026-03-05T09:20:00Z"/>
         </w:trPr>
         <w:tc>
           <w:tcPr>
@@ -14355,10 +14367,10 @@
             <w:pPr>
               <w:pStyle w:val="Tabletext"/>
               <w:rPr>
-                <w:ins w:id="266" w:author="Ramin Miraftabi" w:date="2026-03-05T10:20:00Z" w16du:dateUtc="2026-03-05T09:20:00Z"/>
-              </w:rPr>
-            </w:pPr>
-            <w:ins w:id="267" w:author="Ramin Miraftabi" w:date="2026-03-05T10:20:00Z" w16du:dateUtc="2026-03-05T09:20:00Z">
+                <w:ins w:id="270" w:author="Ramin Miraftabi" w:date="2026-03-05T10:20:00Z" w16du:dateUtc="2026-03-05T09:20:00Z"/>
+              </w:rPr>
+            </w:pPr>
+            <w:ins w:id="271" w:author="Ramin Miraftabi" w:date="2026-03-05T10:20:00Z" w16du:dateUtc="2026-03-05T09:20:00Z">
               <w:r>
                 <w:t>VTS</w:t>
               </w:r>
@@ -14373,10 +14385,10 @@
             <w:pPr>
               <w:pStyle w:val="Tabletext"/>
               <w:rPr>
-                <w:ins w:id="268" w:author="Ramin Miraftabi" w:date="2026-03-05T10:20:00Z" w16du:dateUtc="2026-03-05T09:20:00Z"/>
-              </w:rPr>
-            </w:pPr>
-            <w:ins w:id="269" w:author="Ramin Miraftabi" w:date="2026-03-05T10:20:00Z" w16du:dateUtc="2026-03-05T09:20:00Z">
+                <w:ins w:id="272" w:author="Ramin Miraftabi" w:date="2026-03-05T10:20:00Z" w16du:dateUtc="2026-03-05T09:20:00Z"/>
+              </w:rPr>
+            </w:pPr>
+            <w:ins w:id="273" w:author="Ramin Miraftabi" w:date="2026-03-05T10:20:00Z" w16du:dateUtc="2026-03-05T09:20:00Z">
               <w:r>
                 <w:rPr>
                   <w:i/>
@@ -14404,7 +14416,7 @@
       </w:tr>
       <w:tr>
         <w:trPr>
-          <w:ins w:id="270" w:author="Ramin Miraftabi" w:date="2026-03-05T10:20:00Z" w16du:dateUtc="2026-03-05T09:20:00Z"/>
+          <w:ins w:id="274" w:author="Ramin Miraftabi" w:date="2026-03-05T10:20:00Z" w16du:dateUtc="2026-03-05T09:20:00Z"/>
         </w:trPr>
         <w:tc>
           <w:tcPr>
@@ -14414,10 +14426,10 @@
             <w:pPr>
               <w:pStyle w:val="Tabletext"/>
               <w:rPr>
-                <w:ins w:id="271" w:author="Ramin Miraftabi" w:date="2026-03-05T10:20:00Z" w16du:dateUtc="2026-03-05T09:20:00Z"/>
-              </w:rPr>
-            </w:pPr>
-            <w:ins w:id="272" w:author="Ramin Miraftabi" w:date="2026-03-05T10:20:00Z" w16du:dateUtc="2026-03-05T09:20:00Z">
+                <w:ins w:id="275" w:author="Ramin Miraftabi" w:date="2026-03-05T10:20:00Z" w16du:dateUtc="2026-03-05T09:20:00Z"/>
+              </w:rPr>
+            </w:pPr>
+            <w:ins w:id="276" w:author="Ramin Miraftabi" w:date="2026-03-05T10:20:00Z" w16du:dateUtc="2026-03-05T09:20:00Z">
               <w:r>
                 <w:t>VTS centre</w:t>
               </w:r>
@@ -14432,12 +14444,12 @@
             <w:pPr>
               <w:pStyle w:val="Tabletext"/>
               <w:rPr>
-                <w:ins w:id="273" w:author="Ramin Miraftabi" w:date="2026-03-05T10:20:00Z" w16du:dateUtc="2026-03-05T09:20:00Z"/>
+                <w:ins w:id="277" w:author="Ramin Miraftabi" w:date="2026-03-05T10:20:00Z" w16du:dateUtc="2026-03-05T09:20:00Z"/>
                 <w:i/>
                 <w:iCs/>
               </w:rPr>
             </w:pPr>
-            <w:ins w:id="274" w:author="Ramin Miraftabi" w:date="2026-03-05T10:20:00Z" w16du:dateUtc="2026-03-05T09:20:00Z">
+            <w:ins w:id="278" w:author="Ramin Miraftabi" w:date="2026-03-05T10:20:00Z" w16du:dateUtc="2026-03-05T09:20:00Z">
               <w:r>
                 <w:rPr>
                   <w:i/>
@@ -14480,7 +14492,7 @@
       </w:tr>
       <w:tr>
         <w:trPr>
-          <w:ins w:id="275" w:author="Ramin Miraftabi" w:date="2026-03-05T10:20:00Z" w16du:dateUtc="2026-03-05T09:20:00Z"/>
+          <w:ins w:id="279" w:author="Ramin Miraftabi" w:date="2026-03-05T10:20:00Z" w16du:dateUtc="2026-03-05T09:20:00Z"/>
         </w:trPr>
         <w:tc>
           <w:tcPr>
@@ -14490,10 +14502,10 @@
             <w:pPr>
               <w:pStyle w:val="Tabletext"/>
               <w:rPr>
-                <w:ins w:id="276" w:author="Ramin Miraftabi" w:date="2026-03-05T10:20:00Z" w16du:dateUtc="2026-03-05T09:20:00Z"/>
-              </w:rPr>
-            </w:pPr>
-            <w:ins w:id="277" w:author="Ramin Miraftabi" w:date="2026-03-05T10:20:00Z" w16du:dateUtc="2026-03-05T09:20:00Z">
+                <w:ins w:id="280" w:author="Ramin Miraftabi" w:date="2026-03-05T10:20:00Z" w16du:dateUtc="2026-03-05T09:20:00Z"/>
+              </w:rPr>
+            </w:pPr>
+            <w:ins w:id="281" w:author="Ramin Miraftabi" w:date="2026-03-05T10:20:00Z" w16du:dateUtc="2026-03-05T09:20:00Z">
               <w:r>
                 <w:t>VTS operator</w:t>
               </w:r>
@@ -14508,12 +14520,12 @@
             <w:pPr>
               <w:pStyle w:val="Tabletext"/>
               <w:rPr>
-                <w:ins w:id="278" w:author="Ramin Miraftabi" w:date="2026-03-05T10:20:00Z" w16du:dateUtc="2026-03-05T09:20:00Z"/>
+                <w:ins w:id="282" w:author="Ramin Miraftabi" w:date="2026-03-05T10:20:00Z" w16du:dateUtc="2026-03-05T09:20:00Z"/>
                 <w:i/>
                 <w:iCs/>
               </w:rPr>
             </w:pPr>
-            <w:ins w:id="279" w:author="Ramin Miraftabi" w:date="2026-03-05T10:20:00Z" w16du:dateUtc="2026-03-05T09:20:00Z">
+            <w:ins w:id="283" w:author="Ramin Miraftabi" w:date="2026-03-05T10:20:00Z" w16du:dateUtc="2026-03-05T09:20:00Z">
               <w:r>
                 <w:rPr>
                   <w:i/>
@@ -14530,7 +14542,7 @@
       </w:tr>
       <w:tr>
         <w:trPr>
-          <w:ins w:id="280" w:author="Ramin Miraftabi" w:date="2026-03-05T10:20:00Z" w16du:dateUtc="2026-03-05T09:20:00Z"/>
+          <w:ins w:id="284" w:author="Ramin Miraftabi" w:date="2026-03-05T10:20:00Z" w16du:dateUtc="2026-03-05T09:20:00Z"/>
         </w:trPr>
         <w:tc>
           <w:tcPr>
@@ -14540,10 +14552,10 @@
             <w:pPr>
               <w:pStyle w:val="Tabletext"/>
               <w:rPr>
-                <w:ins w:id="281" w:author="Ramin Miraftabi" w:date="2026-03-05T10:20:00Z" w16du:dateUtc="2026-03-05T09:20:00Z"/>
-              </w:rPr>
-            </w:pPr>
-            <w:ins w:id="282" w:author="Ramin Miraftabi" w:date="2026-03-05T10:20:00Z" w16du:dateUtc="2026-03-05T09:20:00Z">
+                <w:ins w:id="285" w:author="Ramin Miraftabi" w:date="2026-03-05T10:20:00Z" w16du:dateUtc="2026-03-05T09:20:00Z"/>
+              </w:rPr>
+            </w:pPr>
+            <w:ins w:id="286" w:author="Ramin Miraftabi" w:date="2026-03-05T10:20:00Z" w16du:dateUtc="2026-03-05T09:20:00Z">
               <w:r>
                 <w:t>VTS system</w:t>
               </w:r>
@@ -14558,12 +14570,12 @@
             <w:pPr>
               <w:pStyle w:val="Tabletext"/>
               <w:rPr>
-                <w:ins w:id="283" w:author="Ramin Miraftabi" w:date="2026-03-05T10:20:00Z" w16du:dateUtc="2026-03-05T09:20:00Z"/>
+                <w:ins w:id="287" w:author="Ramin Miraftabi" w:date="2026-03-05T10:20:00Z" w16du:dateUtc="2026-03-05T09:20:00Z"/>
                 <w:i/>
                 <w:iCs/>
               </w:rPr>
             </w:pPr>
-            <w:ins w:id="284" w:author="Ramin Miraftabi" w:date="2026-03-05T10:20:00Z" w16du:dateUtc="2026-03-05T09:20:00Z">
+            <w:ins w:id="288" w:author="Ramin Miraftabi" w:date="2026-03-05T10:20:00Z" w16du:dateUtc="2026-03-05T09:20:00Z">
               <w:r>
                 <w:rPr>
                   <w:i/>
@@ -14592,7 +14604,7 @@
       </w:tr>
       <w:tr>
         <w:trPr>
-          <w:ins w:id="285" w:author="Ramin Miraftabi" w:date="2026-03-05T10:20:00Z" w16du:dateUtc="2026-03-05T09:20:00Z"/>
+          <w:ins w:id="289" w:author="Ramin Miraftabi" w:date="2026-03-05T10:20:00Z" w16du:dateUtc="2026-03-05T09:20:00Z"/>
         </w:trPr>
         <w:tc>
           <w:tcPr>
@@ -14602,10 +14614,10 @@
             <w:pPr>
               <w:pStyle w:val="Tabletext"/>
               <w:rPr>
-                <w:ins w:id="286" w:author="Ramin Miraftabi" w:date="2026-03-05T10:20:00Z" w16du:dateUtc="2026-03-05T09:20:00Z"/>
-              </w:rPr>
-            </w:pPr>
-            <w:ins w:id="287" w:author="Ramin Miraftabi" w:date="2026-03-05T10:20:00Z" w16du:dateUtc="2026-03-05T09:20:00Z">
+                <w:ins w:id="290" w:author="Ramin Miraftabi" w:date="2026-03-05T10:20:00Z" w16du:dateUtc="2026-03-05T09:20:00Z"/>
+              </w:rPr>
+            </w:pPr>
+            <w:ins w:id="291" w:author="Ramin Miraftabi" w:date="2026-03-05T10:20:00Z" w16du:dateUtc="2026-03-05T09:20:00Z">
               <w:r>
                 <w:t>Service</w:t>
               </w:r>
@@ -14620,13 +14632,13 @@
             <w:pPr>
               <w:pStyle w:val="Tabletext"/>
               <w:rPr>
-                <w:ins w:id="288" w:author="Ramin Miraftabi" w:date="2026-03-05T10:20:00Z" w16du:dateUtc="2026-03-05T09:20:00Z"/>
+                <w:ins w:id="292" w:author="Ramin Miraftabi" w:date="2026-03-05T10:20:00Z" w16du:dateUtc="2026-03-05T09:20:00Z"/>
                 <w:i/>
                 <w:iCs/>
                 <w:lang w:val="en-US"/>
               </w:rPr>
             </w:pPr>
-            <w:ins w:id="289" w:author="Ramin Miraftabi" w:date="2026-03-05T10:20:00Z" w16du:dateUtc="2026-03-05T09:20:00Z">
+            <w:ins w:id="293" w:author="Ramin Miraftabi" w:date="2026-03-05T10:20:00Z" w16du:dateUtc="2026-03-05T09:20:00Z">
               <w:r>
                 <w:rPr>
                   <w:i/>
@@ -14642,7 +14654,7 @@
                 <w:t xml:space="preserve">VTS </w:t>
               </w:r>
             </w:ins>
-            <w:ins w:id="290" w:author="Ramin Miraftabi" w:date="2026-03-05T10:21:00Z" w16du:dateUtc="2026-03-05T09:21:00Z">
+            <w:ins w:id="294" w:author="Ramin Miraftabi" w:date="2026-03-05T10:21:00Z" w16du:dateUtc="2026-03-05T09:21:00Z">
               <w:r>
                 <w:rPr>
                   <w:i/>
@@ -14651,7 +14663,7 @@
                 <w:t>Traffic Clearance</w:t>
               </w:r>
             </w:ins>
-            <w:ins w:id="291" w:author="Ramin Miraftabi" w:date="2026-03-05T10:20:00Z" w16du:dateUtc="2026-03-05T09:20:00Z">
+            <w:ins w:id="295" w:author="Ramin Miraftabi" w:date="2026-03-05T10:20:00Z" w16du:dateUtc="2026-03-05T09:20:00Z">
               <w:r>
                 <w:rPr>
                   <w:i/>
@@ -14668,7 +14680,7 @@
       </w:tr>
       <w:tr>
         <w:trPr>
-          <w:ins w:id="292" w:author="Ramin Miraftabi" w:date="2026-03-05T10:20:00Z" w16du:dateUtc="2026-03-05T09:20:00Z"/>
+          <w:ins w:id="296" w:author="Ramin Miraftabi" w:date="2026-03-05T10:20:00Z" w16du:dateUtc="2026-03-05T09:20:00Z"/>
         </w:trPr>
         <w:tc>
           <w:tcPr>
@@ -14678,10 +14690,10 @@
             <w:pPr>
               <w:pStyle w:val="Tabletext"/>
               <w:rPr>
-                <w:ins w:id="293" w:author="Ramin Miraftabi" w:date="2026-03-05T10:20:00Z" w16du:dateUtc="2026-03-05T09:20:00Z"/>
-              </w:rPr>
-            </w:pPr>
-            <w:ins w:id="294" w:author="Ramin Miraftabi" w:date="2026-03-05T10:20:00Z" w16du:dateUtc="2026-03-05T09:20:00Z">
+                <w:ins w:id="297" w:author="Ramin Miraftabi" w:date="2026-03-05T10:20:00Z" w16du:dateUtc="2026-03-05T09:20:00Z"/>
+              </w:rPr>
+            </w:pPr>
+            <w:ins w:id="298" w:author="Ramin Miraftabi" w:date="2026-03-05T10:20:00Z" w16du:dateUtc="2026-03-05T09:20:00Z">
               <w:r>
                 <w:t>Consumer</w:t>
               </w:r>
@@ -14696,12 +14708,12 @@
             <w:pPr>
               <w:pStyle w:val="Tabletext"/>
               <w:rPr>
-                <w:ins w:id="295" w:author="Ramin Miraftabi" w:date="2026-03-05T10:20:00Z" w16du:dateUtc="2026-03-05T09:20:00Z"/>
+                <w:ins w:id="299" w:author="Ramin Miraftabi" w:date="2026-03-05T10:20:00Z" w16du:dateUtc="2026-03-05T09:20:00Z"/>
                 <w:i/>
                 <w:iCs/>
               </w:rPr>
             </w:pPr>
-            <w:ins w:id="296" w:author="Ramin Miraftabi" w:date="2026-03-05T10:20:00Z" w16du:dateUtc="2026-03-05T09:20:00Z">
+            <w:ins w:id="300" w:author="Ramin Miraftabi" w:date="2026-03-05T10:20:00Z" w16du:dateUtc="2026-03-05T09:20:00Z">
               <w:r>
                 <w:rPr>
                   <w:i/>
@@ -14721,12 +14733,12 @@
       <w:pPr>
         <w:pStyle w:val="Heading1"/>
       </w:pPr>
-      <w:bookmarkStart w:id="297" w:name="_Toc196547472"/>
+      <w:bookmarkStart w:id="301" w:name="_Toc196547472"/>
       <w:r>
         <w:lastRenderedPageBreak/>
         <w:t>Service Overview</w:t>
       </w:r>
-      <w:bookmarkEnd w:id="297"/>
+      <w:bookmarkEnd w:id="301"/>
     </w:p>
     <w:p>
       <w:pPr>
@@ -14743,7 +14755,7 @@
           <w:lang w:val="en-US"/>
         </w:rPr>
       </w:pPr>
-      <w:bookmarkStart w:id="298" w:name="_Toc196547473"/>
+      <w:bookmarkStart w:id="302" w:name="_Toc196547473"/>
       <w:r>
         <w:rPr>
           <w:lang w:val="en-US"/>
@@ -14756,7 +14768,7 @@
         </w:rPr>
         <w:t>operations</w:t>
       </w:r>
-      <w:bookmarkEnd w:id="298"/>
+      <w:bookmarkEnd w:id="302"/>
     </w:p>
     <w:p>
       <w:pPr>
@@ -14785,19 +14797,47 @@
         <w:tblStyle w:val="TableGrid"/>
         <w:tblW w:w="0" w:type="auto"/>
         <w:tblLook w:val="04A0" w:firstRow="1" w:lastRow="0" w:firstColumn="1" w:lastColumn="0" w:noHBand="0" w:noVBand="1"/>
+        <w:tblPrChange w:id="303" w:author="Ramin Miraftabi" w:date="2026-03-05T12:01:00Z" w16du:dateUtc="2026-03-05T11:01:00Z">
+          <w:tblPr>
+            <w:tblStyle w:val="TableGrid"/>
+            <w:tblW w:w="0" w:type="auto"/>
+            <w:tblLook w:val="04A0" w:firstRow="1" w:lastRow="0" w:firstColumn="1" w:lastColumn="0" w:noHBand="0" w:noVBand="1"/>
+          </w:tblPr>
+        </w:tblPrChange>
       </w:tblPr>
       <w:tblGrid>
-        <w:gridCol w:w="2094"/>
-        <w:gridCol w:w="4879"/>
+        <w:gridCol w:w="2049"/>
+        <w:gridCol w:w="4288"/>
         <w:gridCol w:w="1434"/>
-        <w:gridCol w:w="1329"/>
+        <w:gridCol w:w="1608"/>
+        <w:gridCol w:w="357"/>
+        <w:tblGridChange w:id="304">
+          <w:tblGrid>
+            <w:gridCol w:w="2049"/>
+            <w:gridCol w:w="21"/>
+            <w:gridCol w:w="4267"/>
+            <w:gridCol w:w="292"/>
+            <w:gridCol w:w="1142"/>
+            <w:gridCol w:w="292"/>
+            <w:gridCol w:w="1316"/>
+            <w:gridCol w:w="357"/>
+          </w:tblGrid>
+        </w:tblGridChange>
       </w:tblGrid>
       <w:tr>
         <w:tc>
           <w:tcPr>
-            <w:tcW w:w="2094" w:type="dxa"/>
+            <w:tcW w:w="2070" w:type="dxa"/>
             <w:vMerge w:val="restart"/>
             <w:vAlign w:val="center"/>
+            <w:tcPrChange w:id="305" w:author="Ramin Miraftabi" w:date="2026-03-05T12:01:00Z" w16du:dateUtc="2026-03-05T11:01:00Z">
+              <w:tcPr>
+                <w:tcW w:w="2094" w:type="dxa"/>
+                <w:gridSpan w:val="2"/>
+                <w:vMerge w:val="restart"/>
+                <w:vAlign w:val="center"/>
+              </w:tcPr>
+            </w:tcPrChange>
           </w:tcPr>
           <w:p>
             <w:pPr>
@@ -14822,9 +14862,17 @@
         </w:tc>
         <w:tc>
           <w:tcPr>
-            <w:tcW w:w="4879" w:type="dxa"/>
+            <w:tcW w:w="4559" w:type="dxa"/>
             <w:vMerge w:val="restart"/>
             <w:vAlign w:val="center"/>
+            <w:tcPrChange w:id="306" w:author="Ramin Miraftabi" w:date="2026-03-05T12:01:00Z" w16du:dateUtc="2026-03-05T11:01:00Z">
+              <w:tcPr>
+                <w:tcW w:w="4879" w:type="dxa"/>
+                <w:gridSpan w:val="2"/>
+                <w:vMerge w:val="restart"/>
+                <w:vAlign w:val="center"/>
+              </w:tcPr>
+            </w:tcPrChange>
           </w:tcPr>
           <w:p>
             <w:pPr>
@@ -14849,9 +14897,16 @@
         </w:tc>
         <w:tc>
           <w:tcPr>
-            <w:tcW w:w="2763" w:type="dxa"/>
-            <w:gridSpan w:val="2"/>
+            <w:tcW w:w="3107" w:type="dxa"/>
+            <w:gridSpan w:val="3"/>
             <w:vAlign w:val="center"/>
+            <w:tcPrChange w:id="307" w:author="Ramin Miraftabi" w:date="2026-03-05T12:01:00Z" w16du:dateUtc="2026-03-05T11:01:00Z">
+              <w:tcPr>
+                <w:tcW w:w="2763" w:type="dxa"/>
+                <w:gridSpan w:val="4"/>
+                <w:vAlign w:val="center"/>
+              </w:tcPr>
+            </w:tcPrChange>
           </w:tcPr>
           <w:p>
             <w:pPr>
@@ -14878,8 +14933,15 @@
       <w:tr>
         <w:tc>
           <w:tcPr>
-            <w:tcW w:w="2094" w:type="dxa"/>
+            <w:tcW w:w="2070" w:type="dxa"/>
             <w:vMerge/>
+            <w:tcPrChange w:id="308" w:author="Ramin Miraftabi" w:date="2026-03-05T12:01:00Z" w16du:dateUtc="2026-03-05T11:01:00Z">
+              <w:tcPr>
+                <w:tcW w:w="2094" w:type="dxa"/>
+                <w:gridSpan w:val="2"/>
+                <w:vMerge/>
+              </w:tcPr>
+            </w:tcPrChange>
           </w:tcPr>
           <w:p>
             <w:pPr>
@@ -14891,8 +14953,15 @@
         </w:tc>
         <w:tc>
           <w:tcPr>
-            <w:tcW w:w="4879" w:type="dxa"/>
+            <w:tcW w:w="4559" w:type="dxa"/>
             <w:vMerge/>
+            <w:tcPrChange w:id="309" w:author="Ramin Miraftabi" w:date="2026-03-05T12:01:00Z" w16du:dateUtc="2026-03-05T11:01:00Z">
+              <w:tcPr>
+                <w:tcW w:w="4879" w:type="dxa"/>
+                <w:gridSpan w:val="2"/>
+                <w:vMerge/>
+              </w:tcPr>
+            </w:tcPrChange>
           </w:tcPr>
           <w:p>
             <w:pPr>
@@ -14906,6 +14975,13 @@
           <w:tcPr>
             <w:tcW w:w="1434" w:type="dxa"/>
             <w:vAlign w:val="center"/>
+            <w:tcPrChange w:id="310" w:author="Ramin Miraftabi" w:date="2026-03-05T12:01:00Z" w16du:dateUtc="2026-03-05T11:01:00Z">
+              <w:tcPr>
+                <w:tcW w:w="1434" w:type="dxa"/>
+                <w:gridSpan w:val="2"/>
+                <w:vAlign w:val="center"/>
+              </w:tcPr>
+            </w:tcPrChange>
           </w:tcPr>
           <w:p>
             <w:pPr>
@@ -14917,7 +14993,7 @@
                 <w:lang w:val="en-US"/>
               </w:rPr>
             </w:pPr>
-            <w:ins w:id="299" w:author="Ramin Miraftabi" w:date="2026-03-05T10:21:00Z" w16du:dateUtc="2026-03-05T09:21:00Z">
+            <w:ins w:id="311" w:author="Ramin Miraftabi" w:date="2026-03-05T10:21:00Z" w16du:dateUtc="2026-03-05T09:21:00Z">
               <w:r>
                 <w:rPr>
                   <w:b/>
@@ -14928,7 +15004,7 @@
                 <w:t>Service</w:t>
               </w:r>
             </w:ins>
-            <w:del w:id="300" w:author="Ramin Miraftabi" w:date="2026-03-05T10:21:00Z" w16du:dateUtc="2026-03-05T09:21:00Z">
+            <w:del w:id="312" w:author="Ramin Miraftabi" w:date="2026-03-05T10:21:00Z" w16du:dateUtc="2026-03-05T09:21:00Z">
               <w:r>
                 <w:rPr>
                   <w:b/>
@@ -14961,8 +15037,16 @@
         </w:tc>
         <w:tc>
           <w:tcPr>
-            <w:tcW w:w="1329" w:type="dxa"/>
+            <w:tcW w:w="1673" w:type="dxa"/>
+            <w:gridSpan w:val="2"/>
             <w:vAlign w:val="center"/>
+            <w:tcPrChange w:id="313" w:author="Ramin Miraftabi" w:date="2026-03-05T12:01:00Z" w16du:dateUtc="2026-03-05T11:01:00Z">
+              <w:tcPr>
+                <w:tcW w:w="1329" w:type="dxa"/>
+                <w:gridSpan w:val="2"/>
+                <w:vAlign w:val="center"/>
+              </w:tcPr>
+            </w:tcPrChange>
           </w:tcPr>
           <w:p>
             <w:pPr>
@@ -14974,7 +15058,7 @@
                 <w:lang w:val="en-US"/>
               </w:rPr>
             </w:pPr>
-            <w:del w:id="301" w:author="Ramin Miraftabi" w:date="2026-03-05T10:21:00Z" w16du:dateUtc="2026-03-05T09:21:00Z">
+            <w:del w:id="314" w:author="Ramin Miraftabi" w:date="2026-03-05T10:21:00Z" w16du:dateUtc="2026-03-05T09:21:00Z">
               <w:r>
                 <w:rPr>
                   <w:b/>
@@ -15003,7 +15087,7 @@
                 <w:delText>]</w:delText>
               </w:r>
             </w:del>
-            <w:ins w:id="302" w:author="Ramin Miraftabi" w:date="2026-03-05T10:21:00Z" w16du:dateUtc="2026-03-05T09:21:00Z">
+            <w:ins w:id="315" w:author="Ramin Miraftabi" w:date="2026-03-05T10:21:00Z" w16du:dateUtc="2026-03-05T09:21:00Z">
               <w:r>
                 <w:rPr>
                   <w:b/>
@@ -15020,7 +15104,13 @@
       <w:tr>
         <w:tc>
           <w:tcPr>
-            <w:tcW w:w="2094" w:type="dxa"/>
+            <w:tcW w:w="2070" w:type="dxa"/>
+            <w:tcPrChange w:id="316" w:author="Ramin Miraftabi" w:date="2026-03-05T12:01:00Z" w16du:dateUtc="2026-03-05T11:01:00Z">
+              <w:tcPr>
+                <w:tcW w:w="2094" w:type="dxa"/>
+                <w:gridSpan w:val="2"/>
+              </w:tcPr>
+            </w:tcPrChange>
           </w:tcPr>
           <w:p>
             <w:pPr>
@@ -15039,7 +15129,13 @@
         </w:tc>
         <w:tc>
           <w:tcPr>
-            <w:tcW w:w="4879" w:type="dxa"/>
+            <w:tcW w:w="4559" w:type="dxa"/>
+            <w:tcPrChange w:id="317" w:author="Ramin Miraftabi" w:date="2026-03-05T12:01:00Z" w16du:dateUtc="2026-03-05T11:01:00Z">
+              <w:tcPr>
+                <w:tcW w:w="4879" w:type="dxa"/>
+                <w:gridSpan w:val="2"/>
+              </w:tcPr>
+            </w:tcPrChange>
           </w:tcPr>
           <w:p>
             <w:pPr>
@@ -15059,6 +15155,12 @@
         <w:tc>
           <w:tcPr>
             <w:tcW w:w="1434" w:type="dxa"/>
+            <w:tcPrChange w:id="318" w:author="Ramin Miraftabi" w:date="2026-03-05T12:01:00Z" w16du:dateUtc="2026-03-05T11:01:00Z">
+              <w:tcPr>
+                <w:tcW w:w="1434" w:type="dxa"/>
+                <w:gridSpan w:val="2"/>
+              </w:tcPr>
+            </w:tcPrChange>
           </w:tcPr>
           <w:p>
             <w:pPr>
@@ -15077,7 +15179,14 @@
         </w:tc>
         <w:tc>
           <w:tcPr>
-            <w:tcW w:w="1329" w:type="dxa"/>
+            <w:tcW w:w="1673" w:type="dxa"/>
+            <w:gridSpan w:val="2"/>
+            <w:tcPrChange w:id="319" w:author="Ramin Miraftabi" w:date="2026-03-05T12:01:00Z" w16du:dateUtc="2026-03-05T11:01:00Z">
+              <w:tcPr>
+                <w:tcW w:w="1329" w:type="dxa"/>
+                <w:gridSpan w:val="2"/>
+              </w:tcPr>
+            </w:tcPrChange>
           </w:tcPr>
           <w:p>
             <w:pPr>
@@ -15098,7 +15207,13 @@
       <w:tr>
         <w:tc>
           <w:tcPr>
-            <w:tcW w:w="2094" w:type="dxa"/>
+            <w:tcW w:w="2070" w:type="dxa"/>
+            <w:tcPrChange w:id="320" w:author="Ramin Miraftabi" w:date="2026-03-05T12:01:00Z" w16du:dateUtc="2026-03-05T11:01:00Z">
+              <w:tcPr>
+                <w:tcW w:w="2094" w:type="dxa"/>
+                <w:gridSpan w:val="2"/>
+              </w:tcPr>
+            </w:tcPrChange>
           </w:tcPr>
           <w:p>
             <w:pPr>
@@ -15117,7 +15232,13 @@
         </w:tc>
         <w:tc>
           <w:tcPr>
-            <w:tcW w:w="4879" w:type="dxa"/>
+            <w:tcW w:w="4559" w:type="dxa"/>
+            <w:tcPrChange w:id="321" w:author="Ramin Miraftabi" w:date="2026-03-05T12:01:00Z" w16du:dateUtc="2026-03-05T11:01:00Z">
+              <w:tcPr>
+                <w:tcW w:w="4879" w:type="dxa"/>
+                <w:gridSpan w:val="2"/>
+              </w:tcPr>
+            </w:tcPrChange>
           </w:tcPr>
           <w:p>
             <w:pPr>
@@ -15137,6 +15258,12 @@
         <w:tc>
           <w:tcPr>
             <w:tcW w:w="1434" w:type="dxa"/>
+            <w:tcPrChange w:id="322" w:author="Ramin Miraftabi" w:date="2026-03-05T12:01:00Z" w16du:dateUtc="2026-03-05T11:01:00Z">
+              <w:tcPr>
+                <w:tcW w:w="1434" w:type="dxa"/>
+                <w:gridSpan w:val="2"/>
+              </w:tcPr>
+            </w:tcPrChange>
           </w:tcPr>
           <w:p>
             <w:pPr>
@@ -15155,7 +15282,14 @@
         </w:tc>
         <w:tc>
           <w:tcPr>
-            <w:tcW w:w="1329" w:type="dxa"/>
+            <w:tcW w:w="1673" w:type="dxa"/>
+            <w:gridSpan w:val="2"/>
+            <w:tcPrChange w:id="323" w:author="Ramin Miraftabi" w:date="2026-03-05T12:01:00Z" w16du:dateUtc="2026-03-05T11:01:00Z">
+              <w:tcPr>
+                <w:tcW w:w="1329" w:type="dxa"/>
+                <w:gridSpan w:val="2"/>
+              </w:tcPr>
+            </w:tcPrChange>
           </w:tcPr>
           <w:p>
             <w:pPr>
@@ -15176,7 +15310,13 @@
       <w:tr>
         <w:tc>
           <w:tcPr>
-            <w:tcW w:w="2094" w:type="dxa"/>
+            <w:tcW w:w="2070" w:type="dxa"/>
+            <w:tcPrChange w:id="324" w:author="Ramin Miraftabi" w:date="2026-03-05T12:01:00Z" w16du:dateUtc="2026-03-05T11:01:00Z">
+              <w:tcPr>
+                <w:tcW w:w="2094" w:type="dxa"/>
+                <w:gridSpan w:val="2"/>
+              </w:tcPr>
+            </w:tcPrChange>
           </w:tcPr>
           <w:p>
             <w:pPr>
@@ -15185,7 +15325,7 @@
                 <w:lang w:val="en-US"/>
               </w:rPr>
             </w:pPr>
-            <w:ins w:id="303" w:author="Ramin Miraftabi" w:date="2026-03-05T10:30:00Z" w16du:dateUtc="2026-03-05T09:30:00Z">
+            <w:ins w:id="325" w:author="Ramin Miraftabi" w:date="2026-03-05T10:30:00Z" w16du:dateUtc="2026-03-05T09:30:00Z">
               <w:r>
                 <w:rPr>
                   <w:lang w:val="en-US"/>
@@ -15203,7 +15343,13 @@
         </w:tc>
         <w:tc>
           <w:tcPr>
-            <w:tcW w:w="4879" w:type="dxa"/>
+            <w:tcW w:w="4559" w:type="dxa"/>
+            <w:tcPrChange w:id="326" w:author="Ramin Miraftabi" w:date="2026-03-05T12:01:00Z" w16du:dateUtc="2026-03-05T11:01:00Z">
+              <w:tcPr>
+                <w:tcW w:w="4879" w:type="dxa"/>
+                <w:gridSpan w:val="2"/>
+              </w:tcPr>
+            </w:tcPrChange>
           </w:tcPr>
           <w:p>
             <w:pPr>
@@ -15215,6 +15361,101 @@
             <w:r>
               <w:t>An operation that allows the reception of an acknowledgement.</w:t>
             </w:r>
+          </w:p>
+        </w:tc>
+        <w:tc>
+          <w:tcPr>
+            <w:tcW w:w="1434" w:type="dxa"/>
+            <w:tcPrChange w:id="327" w:author="Ramin Miraftabi" w:date="2026-03-05T12:01:00Z" w16du:dateUtc="2026-03-05T11:01:00Z">
+              <w:tcPr>
+                <w:tcW w:w="1434" w:type="dxa"/>
+                <w:gridSpan w:val="2"/>
+              </w:tcPr>
+            </w:tcPrChange>
+          </w:tcPr>
+          <w:p>
+            <w:pPr>
+              <w:jc w:val="center"/>
+              <w:rPr>
+                <w:lang w:val="en-US"/>
+              </w:rPr>
+            </w:pPr>
+            <w:r>
+              <w:rPr>
+                <w:lang w:val="en-US"/>
+              </w:rPr>
+              <w:t>X</w:t>
+            </w:r>
+          </w:p>
+        </w:tc>
+        <w:tc>
+          <w:tcPr>
+            <w:tcW w:w="1673" w:type="dxa"/>
+            <w:gridSpan w:val="2"/>
+            <w:tcPrChange w:id="328" w:author="Ramin Miraftabi" w:date="2026-03-05T12:01:00Z" w16du:dateUtc="2026-03-05T11:01:00Z">
+              <w:tcPr>
+                <w:tcW w:w="1329" w:type="dxa"/>
+                <w:gridSpan w:val="2"/>
+              </w:tcPr>
+            </w:tcPrChange>
+          </w:tcPr>
+          <w:p>
+            <w:pPr>
+              <w:jc w:val="center"/>
+              <w:rPr>
+                <w:lang w:val="en-US"/>
+              </w:rPr>
+            </w:pPr>
+            <w:r>
+              <w:rPr>
+                <w:lang w:val="en-US"/>
+              </w:rPr>
+              <w:t>X</w:t>
+            </w:r>
+          </w:p>
+        </w:tc>
+      </w:tr>
+      <w:tr>
+        <w:trPr>
+          <w:gridAfter w:val="1"/>
+          <w:wAfter w:w="386" w:type="dxa"/>
+          <w:ins w:id="329" w:author="Ramin Miraftabi" w:date="2026-03-05T10:23:00Z" w16du:dateUtc="2026-03-05T09:23:00Z"/>
+        </w:trPr>
+        <w:tc>
+          <w:tcPr>
+            <w:tcW w:w="2070" w:type="dxa"/>
+          </w:tcPr>
+          <w:p>
+            <w:pPr>
+              <w:pStyle w:val="Tabletext"/>
+              <w:rPr>
+                <w:ins w:id="330" w:author="Ramin Miraftabi" w:date="2026-03-05T10:23:00Z" w16du:dateUtc="2026-03-05T09:23:00Z"/>
+                <w:lang w:val="en-US"/>
+              </w:rPr>
+            </w:pPr>
+            <w:ins w:id="331" w:author="Ramin Miraftabi" w:date="2026-03-05T10:23:00Z" w16du:dateUtc="2026-03-05T09:23:00Z">
+              <w:r>
+                <w:t>System status</w:t>
+              </w:r>
+            </w:ins>
+          </w:p>
+        </w:tc>
+        <w:tc>
+          <w:tcPr>
+            <w:tcW w:w="4559" w:type="dxa"/>
+          </w:tcPr>
+          <w:p>
+            <w:pPr>
+              <w:pStyle w:val="Tabletext"/>
+              <w:rPr>
+                <w:ins w:id="332" w:author="Ramin Miraftabi" w:date="2026-03-05T10:23:00Z" w16du:dateUtc="2026-03-05T09:23:00Z"/>
+              </w:rPr>
+            </w:pPr>
+            <w:ins w:id="333" w:author="Ramin Miraftabi" w:date="2026-03-05T10:23:00Z" w16du:dateUtc="2026-03-05T09:23:00Z">
+              <w:r>
+                <w:t>For service registries and service consumers to be able to check if service is up an interface must be defined that allows the checking of service without sending a valid message.</w:t>
+              </w:r>
+            </w:ins>
           </w:p>
         </w:tc>
         <w:tc>
@@ -15225,74 +15466,75 @@
             <w:pPr>
               <w:jc w:val="center"/>
               <w:rPr>
+                <w:ins w:id="334" w:author="Ramin Miraftabi" w:date="2026-03-05T10:23:00Z" w16du:dateUtc="2026-03-05T09:23:00Z"/>
                 <w:lang w:val="en-US"/>
               </w:rPr>
             </w:pPr>
-            <w:r>
-              <w:rPr>
-                <w:lang w:val="en-US"/>
-              </w:rPr>
-              <w:t>X</w:t>
-            </w:r>
+            <w:ins w:id="335" w:author="Ramin Miraftabi" w:date="2026-03-05T10:23:00Z" w16du:dateUtc="2026-03-05T09:23:00Z">
+              <w:r>
+                <w:t>x</w:t>
+              </w:r>
+            </w:ins>
           </w:p>
         </w:tc>
         <w:tc>
           <w:tcPr>
-            <w:tcW w:w="1329" w:type="dxa"/>
+            <w:tcW w:w="1652" w:type="dxa"/>
           </w:tcPr>
           <w:p>
             <w:pPr>
               <w:jc w:val="center"/>
               <w:rPr>
+                <w:ins w:id="336" w:author="Ramin Miraftabi" w:date="2026-03-05T10:23:00Z" w16du:dateUtc="2026-03-05T09:23:00Z"/>
                 <w:lang w:val="en-US"/>
               </w:rPr>
             </w:pPr>
-            <w:r>
-              <w:rPr>
-                <w:lang w:val="en-US"/>
-              </w:rPr>
-              <w:t>X</w:t>
-            </w:r>
+            <w:ins w:id="337" w:author="Ramin Miraftabi" w:date="2026-03-05T10:23:00Z" w16du:dateUtc="2026-03-05T09:23:00Z">
+              <w:r>
+                <w:t>x</w:t>
+              </w:r>
+            </w:ins>
           </w:p>
         </w:tc>
       </w:tr>
       <w:tr>
         <w:trPr>
-          <w:ins w:id="304" w:author="Ramin Miraftabi" w:date="2026-03-05T10:23:00Z" w16du:dateUtc="2026-03-05T09:23:00Z"/>
+          <w:gridAfter w:val="1"/>
+          <w:wAfter w:w="386" w:type="dxa"/>
+          <w:ins w:id="338" w:author="Ramin Miraftabi" w:date="2026-03-05T10:23:00Z" w16du:dateUtc="2026-03-05T09:23:00Z"/>
         </w:trPr>
         <w:tc>
           <w:tcPr>
-            <w:tcW w:w="2094" w:type="dxa"/>
+            <w:tcW w:w="2070" w:type="dxa"/>
           </w:tcPr>
           <w:p>
             <w:pPr>
               <w:pStyle w:val="Tabletext"/>
               <w:rPr>
-                <w:ins w:id="305" w:author="Ramin Miraftabi" w:date="2026-03-05T10:23:00Z" w16du:dateUtc="2026-03-05T09:23:00Z"/>
-                <w:lang w:val="en-US"/>
-              </w:rPr>
-            </w:pPr>
-            <w:ins w:id="306" w:author="Ramin Miraftabi" w:date="2026-03-05T10:23:00Z" w16du:dateUtc="2026-03-05T09:23:00Z">
+                <w:ins w:id="339" w:author="Ramin Miraftabi" w:date="2026-03-05T10:23:00Z" w16du:dateUtc="2026-03-05T09:23:00Z"/>
+              </w:rPr>
+            </w:pPr>
+            <w:ins w:id="340" w:author="Ramin Miraftabi" w:date="2026-03-05T10:23:00Z" w16du:dateUtc="2026-03-05T09:23:00Z">
               <w:r>
-                <w:t>System status</w:t>
+                <w:t>Service registry updates</w:t>
               </w:r>
             </w:ins>
           </w:p>
         </w:tc>
         <w:tc>
           <w:tcPr>
-            <w:tcW w:w="4879" w:type="dxa"/>
+            <w:tcW w:w="4559" w:type="dxa"/>
           </w:tcPr>
           <w:p>
             <w:pPr>
               <w:pStyle w:val="Tabletext"/>
               <w:rPr>
-                <w:ins w:id="307" w:author="Ramin Miraftabi" w:date="2026-03-05T10:23:00Z" w16du:dateUtc="2026-03-05T09:23:00Z"/>
-              </w:rPr>
-            </w:pPr>
-            <w:ins w:id="308" w:author="Ramin Miraftabi" w:date="2026-03-05T10:23:00Z" w16du:dateUtc="2026-03-05T09:23:00Z">
+                <w:ins w:id="341" w:author="Ramin Miraftabi" w:date="2026-03-05T10:23:00Z" w16du:dateUtc="2026-03-05T09:23:00Z"/>
+              </w:rPr>
+            </w:pPr>
+            <w:ins w:id="342" w:author="Ramin Miraftabi" w:date="2026-03-05T10:23:00Z" w16du:dateUtc="2026-03-05T09:23:00Z">
               <w:r>
-                <w:t>For service registries and service consumers to be able to check if service is up an interface must be defined that allows the checking of service without sending a valid message.</w:t>
+                <w:t>The service must be able to update its own metadata in the service registry according to the service registry definitions. This is required to maintain updated certificates in the service registry as well as to allow other automatic updates to service information.</w:t>
               </w:r>
             </w:ins>
           </w:p>
@@ -15305,11 +15547,10 @@
             <w:pPr>
               <w:jc w:val="center"/>
               <w:rPr>
-                <w:ins w:id="309" w:author="Ramin Miraftabi" w:date="2026-03-05T10:23:00Z" w16du:dateUtc="2026-03-05T09:23:00Z"/>
-                <w:lang w:val="en-US"/>
-              </w:rPr>
-            </w:pPr>
-            <w:ins w:id="310" w:author="Ramin Miraftabi" w:date="2026-03-05T10:23:00Z" w16du:dateUtc="2026-03-05T09:23:00Z">
+                <w:ins w:id="343" w:author="Ramin Miraftabi" w:date="2026-03-05T10:23:00Z" w16du:dateUtc="2026-03-05T09:23:00Z"/>
+              </w:rPr>
+            </w:pPr>
+            <w:ins w:id="344" w:author="Ramin Miraftabi" w:date="2026-03-05T10:23:00Z" w16du:dateUtc="2026-03-05T09:23:00Z">
               <w:r>
                 <w:t>x</w:t>
               </w:r>
@@ -15318,112 +15559,36 @@
         </w:tc>
         <w:tc>
           <w:tcPr>
-            <w:tcW w:w="1329" w:type="dxa"/>
+            <w:tcW w:w="1652" w:type="dxa"/>
           </w:tcPr>
           <w:p>
             <w:pPr>
               <w:jc w:val="center"/>
               <w:rPr>
-                <w:ins w:id="311" w:author="Ramin Miraftabi" w:date="2026-03-05T10:23:00Z" w16du:dateUtc="2026-03-05T09:23:00Z"/>
-                <w:lang w:val="en-US"/>
-              </w:rPr>
-            </w:pPr>
-            <w:ins w:id="312" w:author="Ramin Miraftabi" w:date="2026-03-05T10:23:00Z" w16du:dateUtc="2026-03-05T09:23:00Z">
-              <w:r>
-                <w:t>x</w:t>
-              </w:r>
-            </w:ins>
+                <w:ins w:id="345" w:author="Ramin Miraftabi" w:date="2026-03-05T10:23:00Z" w16du:dateUtc="2026-03-05T09:23:00Z"/>
+              </w:rPr>
+            </w:pPr>
           </w:p>
         </w:tc>
       </w:tr>
       <w:tr>
         <w:trPr>
-          <w:ins w:id="313" w:author="Ramin Miraftabi" w:date="2026-03-05T10:23:00Z" w16du:dateUtc="2026-03-05T09:23:00Z"/>
+          <w:gridAfter w:val="1"/>
+          <w:wAfter w:w="386" w:type="dxa"/>
+          <w:ins w:id="346" w:author="Ramin Miraftabi" w:date="2026-03-05T10:23:00Z" w16du:dateUtc="2026-03-05T09:23:00Z"/>
         </w:trPr>
         <w:tc>
           <w:tcPr>
-            <w:tcW w:w="2094" w:type="dxa"/>
+            <w:tcW w:w="2070" w:type="dxa"/>
           </w:tcPr>
           <w:p>
             <w:pPr>
               <w:pStyle w:val="Tabletext"/>
               <w:rPr>
-                <w:ins w:id="314" w:author="Ramin Miraftabi" w:date="2026-03-05T10:23:00Z" w16du:dateUtc="2026-03-05T09:23:00Z"/>
-              </w:rPr>
-            </w:pPr>
-            <w:ins w:id="315" w:author="Ramin Miraftabi" w:date="2026-03-05T10:23:00Z" w16du:dateUtc="2026-03-05T09:23:00Z">
-              <w:r>
-                <w:t>Service registry updates</w:t>
-              </w:r>
-            </w:ins>
-          </w:p>
-        </w:tc>
-        <w:tc>
-          <w:tcPr>
-            <w:tcW w:w="4879" w:type="dxa"/>
-          </w:tcPr>
-          <w:p>
-            <w:pPr>
-              <w:pStyle w:val="Tabletext"/>
-              <w:rPr>
-                <w:ins w:id="316" w:author="Ramin Miraftabi" w:date="2026-03-05T10:23:00Z" w16du:dateUtc="2026-03-05T09:23:00Z"/>
-              </w:rPr>
-            </w:pPr>
-            <w:ins w:id="317" w:author="Ramin Miraftabi" w:date="2026-03-05T10:23:00Z" w16du:dateUtc="2026-03-05T09:23:00Z">
-              <w:r>
-                <w:t>The service must be able to update its own metadata in the service registry according to the service registry definitions. This is required to maintain updated certificates in the service registry as well as to allow other automatic updates to service information.</w:t>
-              </w:r>
-            </w:ins>
-          </w:p>
-        </w:tc>
-        <w:tc>
-          <w:tcPr>
-            <w:tcW w:w="1434" w:type="dxa"/>
-          </w:tcPr>
-          <w:p>
-            <w:pPr>
-              <w:jc w:val="center"/>
-              <w:rPr>
-                <w:ins w:id="318" w:author="Ramin Miraftabi" w:date="2026-03-05T10:23:00Z" w16du:dateUtc="2026-03-05T09:23:00Z"/>
-              </w:rPr>
-            </w:pPr>
-            <w:ins w:id="319" w:author="Ramin Miraftabi" w:date="2026-03-05T10:23:00Z" w16du:dateUtc="2026-03-05T09:23:00Z">
-              <w:r>
-                <w:t>x</w:t>
-              </w:r>
-            </w:ins>
-          </w:p>
-        </w:tc>
-        <w:tc>
-          <w:tcPr>
-            <w:tcW w:w="1329" w:type="dxa"/>
-          </w:tcPr>
-          <w:p>
-            <w:pPr>
-              <w:jc w:val="center"/>
-              <w:rPr>
-                <w:ins w:id="320" w:author="Ramin Miraftabi" w:date="2026-03-05T10:23:00Z" w16du:dateUtc="2026-03-05T09:23:00Z"/>
-              </w:rPr>
-            </w:pPr>
-          </w:p>
-        </w:tc>
-      </w:tr>
-      <w:tr>
-        <w:trPr>
-          <w:ins w:id="321" w:author="Ramin Miraftabi" w:date="2026-03-05T10:23:00Z" w16du:dateUtc="2026-03-05T09:23:00Z"/>
-        </w:trPr>
-        <w:tc>
-          <w:tcPr>
-            <w:tcW w:w="2094" w:type="dxa"/>
-          </w:tcPr>
-          <w:p>
-            <w:pPr>
-              <w:pStyle w:val="Tabletext"/>
-              <w:rPr>
-                <w:ins w:id="322" w:author="Ramin Miraftabi" w:date="2026-03-05T10:23:00Z" w16du:dateUtc="2026-03-05T09:23:00Z"/>
-              </w:rPr>
-            </w:pPr>
-            <w:ins w:id="323" w:author="Ramin Miraftabi" w:date="2026-03-05T10:23:00Z" w16du:dateUtc="2026-03-05T09:23:00Z">
+                <w:ins w:id="347" w:author="Ramin Miraftabi" w:date="2026-03-05T10:23:00Z" w16du:dateUtc="2026-03-05T09:23:00Z"/>
+              </w:rPr>
+            </w:pPr>
+            <w:ins w:id="348" w:author="Ramin Miraftabi" w:date="2026-03-05T10:23:00Z" w16du:dateUtc="2026-03-05T09:23:00Z">
               <w:r>
                 <w:t>Search service registry</w:t>
               </w:r>
@@ -15432,7 +15597,7 @@
         </w:tc>
         <w:tc>
           <w:tcPr>
-            <w:tcW w:w="4879" w:type="dxa"/>
+            <w:tcW w:w="4559" w:type="dxa"/>
           </w:tcPr>
           <w:p>
             <w:pPr>
@@ -15443,15 +15608,15 @@
               </w:numPr>
               <w:spacing w:line="240" w:lineRule="auto"/>
               <w:rPr>
-                <w:ins w:id="324" w:author="Ramin Miraftabi" w:date="2026-03-05T10:23:00Z" w16du:dateUtc="2026-03-05T09:23:00Z"/>
-              </w:rPr>
-              <w:pPrChange w:id="325" w:author="Ramin Miraftabi" w:date="2026-03-05T10:24:00Z" w16du:dateUtc="2026-03-05T09:24:00Z">
+                <w:ins w:id="349" w:author="Ramin Miraftabi" w:date="2026-03-05T10:23:00Z" w16du:dateUtc="2026-03-05T09:23:00Z"/>
+              </w:rPr>
+              <w:pPrChange w:id="350" w:author="Ramin Miraftabi" w:date="2026-03-05T10:24:00Z" w16du:dateUtc="2026-03-05T09:24:00Z">
                 <w:pPr>
                   <w:pStyle w:val="Tabletext"/>
                 </w:pPr>
               </w:pPrChange>
             </w:pPr>
-            <w:ins w:id="326" w:author="Ramin Miraftabi" w:date="2026-03-05T10:23:00Z" w16du:dateUtc="2026-03-05T09:23:00Z">
+            <w:ins w:id="351" w:author="Ramin Miraftabi" w:date="2026-03-05T10:23:00Z" w16du:dateUtc="2026-03-05T09:23:00Z">
               <w:r>
                 <w:t xml:space="preserve">The consumer must have a way to search a maritime service registry for route exchange services that it is compatible with its area of interest. </w:t>
               </w:r>
@@ -15466,23 +15631,23 @@
             <w:pPr>
               <w:jc w:val="center"/>
               <w:rPr>
-                <w:ins w:id="327" w:author="Ramin Miraftabi" w:date="2026-03-05T10:23:00Z" w16du:dateUtc="2026-03-05T09:23:00Z"/>
+                <w:ins w:id="352" w:author="Ramin Miraftabi" w:date="2026-03-05T10:23:00Z" w16du:dateUtc="2026-03-05T09:23:00Z"/>
               </w:rPr>
             </w:pPr>
           </w:p>
         </w:tc>
         <w:tc>
           <w:tcPr>
-            <w:tcW w:w="1329" w:type="dxa"/>
+            <w:tcW w:w="1652" w:type="dxa"/>
           </w:tcPr>
           <w:p>
             <w:pPr>
               <w:jc w:val="center"/>
               <w:rPr>
-                <w:ins w:id="328" w:author="Ramin Miraftabi" w:date="2026-03-05T10:23:00Z" w16du:dateUtc="2026-03-05T09:23:00Z"/>
-              </w:rPr>
-            </w:pPr>
-            <w:ins w:id="329" w:author="Ramin Miraftabi" w:date="2026-03-05T10:23:00Z" w16du:dateUtc="2026-03-05T09:23:00Z">
+                <w:ins w:id="353" w:author="Ramin Miraftabi" w:date="2026-03-05T10:23:00Z" w16du:dateUtc="2026-03-05T09:23:00Z"/>
+              </w:rPr>
+            </w:pPr>
+            <w:ins w:id="354" w:author="Ramin Miraftabi" w:date="2026-03-05T10:23:00Z" w16du:dateUtc="2026-03-05T09:23:00Z">
               <w:r>
                 <w:t>x</w:t>
               </w:r>
@@ -15501,7 +15666,7 @@
     <w:p>
       <w:pPr>
         <w:rPr>
-          <w:ins w:id="330" w:author="Ramin Miraftabi" w:date="2026-03-05T10:30:00Z" w16du:dateUtc="2026-03-05T09:30:00Z"/>
+          <w:ins w:id="355" w:author="Ramin Miraftabi" w:date="2026-03-05T10:30:00Z" w16du:dateUtc="2026-03-05T09:30:00Z"/>
           <w:lang w:val="en-US"/>
         </w:rPr>
       </w:pPr>
@@ -15537,7 +15702,7 @@
     <w:p>
       <w:pPr>
         <w:rPr>
-          <w:ins w:id="331" w:author="Ramin Miraftabi" w:date="2026-03-05T10:30:00Z" w16du:dateUtc="2026-03-05T09:30:00Z"/>
+          <w:ins w:id="356" w:author="Ramin Miraftabi" w:date="2026-03-05T10:30:00Z" w16du:dateUtc="2026-03-05T09:30:00Z"/>
           <w:lang w:val="en-US"/>
         </w:rPr>
       </w:pPr>
@@ -15546,19 +15711,19 @@
       <w:pPr>
         <w:pStyle w:val="Heading3"/>
         <w:rPr>
-          <w:ins w:id="332" w:author="Ramin Miraftabi" w:date="2026-03-05T10:30:00Z" w16du:dateUtc="2026-03-05T09:30:00Z"/>
-          <w:lang w:val="en-US"/>
-        </w:rPr>
-      </w:pPr>
-      <w:bookmarkStart w:id="333" w:name="_Toc196502210"/>
-      <w:ins w:id="334" w:author="Ramin Miraftabi" w:date="2026-03-05T10:30:00Z" w16du:dateUtc="2026-03-05T09:30:00Z">
+          <w:ins w:id="357" w:author="Ramin Miraftabi" w:date="2026-03-05T10:30:00Z" w16du:dateUtc="2026-03-05T09:30:00Z"/>
+          <w:lang w:val="en-US"/>
+        </w:rPr>
+      </w:pPr>
+      <w:bookmarkStart w:id="358" w:name="_Toc196502210"/>
+      <w:ins w:id="359" w:author="Ramin Miraftabi" w:date="2026-03-05T10:30:00Z" w16du:dateUtc="2026-03-05T09:30:00Z">
         <w:r>
           <w:rPr>
             <w:lang w:val="en-US"/>
           </w:rPr>
           <w:t>Send and receive acknowledgment</w:t>
         </w:r>
-        <w:bookmarkEnd w:id="333"/>
+        <w:bookmarkEnd w:id="358"/>
       </w:ins>
     </w:p>
     <w:p>
@@ -15567,7 +15732,7 @@
           <w:lang w:val="en-US"/>
         </w:rPr>
       </w:pPr>
-      <w:ins w:id="335" w:author="Ramin Miraftabi" w:date="2026-03-05T10:30:00Z" w16du:dateUtc="2026-03-05T09:30:00Z">
+      <w:ins w:id="360" w:author="Ramin Miraftabi" w:date="2026-03-05T10:30:00Z" w16du:dateUtc="2026-03-05T09:30:00Z">
         <w:r>
           <w:rPr>
             <w:lang w:val="en-US"/>
@@ -15575,7 +15740,7 @@
           <w:t>Both the service and consumer must have a method of sending and receiving acknowledgments of delivery to end systems. As many of the operations are asynchronous and may depend on multiple intermediate systems there is a need to be able to show to the end users of the systems the status of message delivery that exceeds the technical status of the initial message transfer. This interface must require the presence of the message identifier (see</w:t>
         </w:r>
       </w:ins>
-      <w:ins w:id="336" w:author="Ramin Miraftabi" w:date="2026-03-05T10:31:00Z" w16du:dateUtc="2026-03-05T09:31:00Z">
+      <w:ins w:id="361" w:author="Ramin Miraftabi" w:date="2026-03-05T10:31:00Z" w16du:dateUtc="2026-03-05T09:31:00Z">
         <w:r>
           <w:rPr>
             <w:lang w:val="en-US"/>
@@ -15618,7 +15783,7 @@
           <w:fldChar w:fldCharType="end"/>
         </w:r>
       </w:ins>
-      <w:ins w:id="337" w:author="Ramin Miraftabi" w:date="2026-03-05T10:30:00Z" w16du:dateUtc="2026-03-05T09:30:00Z">
+      <w:ins w:id="362" w:author="Ramin Miraftabi" w:date="2026-03-05T10:30:00Z" w16du:dateUtc="2026-03-05T09:30:00Z">
         <w:r>
           <w:rPr>
             <w:lang w:val="en-US"/>
@@ -15626,7 +15791,7 @@
           <w:t>)</w:t>
         </w:r>
       </w:ins>
-      <w:ins w:id="338" w:author="Ramin Miraftabi" w:date="2026-03-05T10:31:00Z" w16du:dateUtc="2026-03-05T09:31:00Z">
+      <w:ins w:id="363" w:author="Ramin Miraftabi" w:date="2026-03-05T10:31:00Z" w16du:dateUtc="2026-03-05T09:31:00Z">
         <w:r>
           <w:rPr>
             <w:lang w:val="en-US"/>
@@ -15642,7 +15807,7 @@
           <w:lang w:val="en-US"/>
         </w:rPr>
       </w:pPr>
-      <w:bookmarkStart w:id="339" w:name="_Toc196547474"/>
+      <w:bookmarkStart w:id="364" w:name="_Toc196547474"/>
       <w:r>
         <w:rPr>
           <w:lang w:val="en-US"/>
@@ -15650,7 +15815,7 @@
         <w:lastRenderedPageBreak/>
         <w:t>Logical parameters</w:t>
       </w:r>
-      <w:bookmarkEnd w:id="339"/>
+      <w:bookmarkEnd w:id="364"/>
     </w:p>
     <w:p>
       <w:pPr>
@@ -15663,7 +15828,7 @@
     <w:p>
       <w:pPr>
         <w:rPr>
-          <w:ins w:id="340" w:author="Ramin Miraftabi" w:date="2026-03-05T10:25:00Z" w16du:dateUtc="2026-03-05T09:25:00Z"/>
+          <w:ins w:id="365" w:author="Ramin Miraftabi" w:date="2026-03-05T10:25:00Z" w16du:dateUtc="2026-03-05T09:25:00Z"/>
           <w:lang w:val="en-US"/>
         </w:rPr>
       </w:pPr>
@@ -15673,7 +15838,7 @@
         </w:rPr>
         <w:t xml:space="preserve">As the logical operations are very abstract the logical parameters and response contents </w:t>
       </w:r>
-      <w:ins w:id="341" w:author="Pitkänen Juho" w:date="2026-03-03T16:47:00Z" w16du:dateUtc="2026-03-03T15:47:00Z">
+      <w:ins w:id="366" w:author="Pitkänen Juho" w:date="2026-03-03T16:47:00Z" w16du:dateUtc="2026-03-03T15:47:00Z">
         <w:r>
           <w:rPr>
             <w:lang w:val="en-US"/>
@@ -15687,7 +15852,7 @@
         </w:rPr>
         <w:t xml:space="preserve">will be described </w:t>
       </w:r>
-      <w:del w:id="342" w:author="Pitkänen Juho" w:date="2026-03-03T16:48:00Z" w16du:dateUtc="2026-03-03T15:48:00Z">
+      <w:del w:id="367" w:author="Pitkänen Juho" w:date="2026-03-03T16:48:00Z" w16du:dateUtc="2026-03-03T15:48:00Z">
         <w:r>
           <w:rPr>
             <w:lang w:val="en-US"/>
@@ -15701,7 +15866,7 @@
         </w:rPr>
         <w:t>in</w:t>
       </w:r>
-      <w:del w:id="343" w:author="Ramin Miraftabi" w:date="2026-03-05T10:25:00Z" w16du:dateUtc="2026-03-05T09:25:00Z">
+      <w:del w:id="368" w:author="Ramin Miraftabi" w:date="2026-03-05T10:25:00Z" w16du:dateUtc="2026-03-05T09:25:00Z">
         <w:r>
           <w:rPr>
             <w:lang w:val="en-US"/>
@@ -15715,7 +15880,7 @@
         </w:rPr>
         <w:t xml:space="preserve"> </w:t>
       </w:r>
-      <w:ins w:id="344" w:author="Ramin Miraftabi" w:date="2026-03-05T10:25:00Z" w16du:dateUtc="2026-03-05T09:25:00Z">
+      <w:ins w:id="369" w:author="Ramin Miraftabi" w:date="2026-03-05T10:25:00Z" w16du:dateUtc="2026-03-05T09:25:00Z">
         <w:r>
           <w:rPr>
             <w:lang w:val="en-US"/>
@@ -15752,7 +15917,7 @@
           <w:fldChar w:fldCharType="end"/>
         </w:r>
       </w:ins>
-      <w:del w:id="345" w:author="Pitkänen Juho" w:date="2026-03-03T16:47:00Z" w16du:dateUtc="2026-03-03T15:47:00Z">
+      <w:del w:id="370" w:author="Pitkänen Juho" w:date="2026-03-03T16:47:00Z" w16du:dateUtc="2026-03-03T15:47:00Z">
         <w:r>
           <w:rPr>
             <w:lang w:val="en-US"/>
@@ -15760,8 +15925,8 @@
           <w:delText>document</w:delText>
         </w:r>
       </w:del>
-      <w:ins w:id="346" w:author="Pitkänen Juho" w:date="2026-03-03T16:48:00Z" w16du:dateUtc="2026-03-03T15:48:00Z">
-        <w:del w:id="347" w:author="Ramin Miraftabi" w:date="2026-03-05T10:24:00Z" w16du:dateUtc="2026-03-05T09:24:00Z">
+      <w:ins w:id="371" w:author="Pitkänen Juho" w:date="2026-03-03T16:48:00Z" w16du:dateUtc="2026-03-03T15:48:00Z">
+        <w:del w:id="372" w:author="Ramin Miraftabi" w:date="2026-03-05T10:24:00Z" w16du:dateUtc="2026-03-05T09:24:00Z">
           <w:r>
             <w:rPr>
               <w:lang w:val="en-US"/>
@@ -15770,8 +15935,8 @@
           </w:r>
         </w:del>
       </w:ins>
-      <w:ins w:id="348" w:author="Pitkänen Juho" w:date="2026-03-03T16:47:00Z" w16du:dateUtc="2026-03-03T15:47:00Z">
-        <w:del w:id="349" w:author="Ramin Miraftabi" w:date="2026-03-05T10:24:00Z" w16du:dateUtc="2026-03-05T09:24:00Z">
+      <w:ins w:id="373" w:author="Pitkänen Juho" w:date="2026-03-03T16:47:00Z" w16du:dateUtc="2026-03-03T15:47:00Z">
+        <w:del w:id="374" w:author="Ramin Miraftabi" w:date="2026-03-05T10:24:00Z" w16du:dateUtc="2026-03-05T09:24:00Z">
           <w:r>
             <w:rPr>
               <w:lang w:val="en-US"/>
@@ -15803,32 +15968,32 @@
       <w:pPr>
         <w:pStyle w:val="Heading3"/>
         <w:rPr>
-          <w:ins w:id="350" w:author="Ramin Miraftabi" w:date="2026-03-05T10:26:00Z" w16du:dateUtc="2026-03-05T09:26:00Z"/>
-          <w:lang w:val="en-US"/>
-        </w:rPr>
-      </w:pPr>
-      <w:bookmarkStart w:id="351" w:name="_Ref196501451"/>
-      <w:bookmarkStart w:id="352" w:name="_Toc196502217"/>
-      <w:ins w:id="353" w:author="Ramin Miraftabi" w:date="2026-03-05T10:26:00Z" w16du:dateUtc="2026-03-05T09:26:00Z">
+          <w:ins w:id="375" w:author="Ramin Miraftabi" w:date="2026-03-05T10:26:00Z" w16du:dateUtc="2026-03-05T09:26:00Z"/>
+          <w:lang w:val="en-US"/>
+        </w:rPr>
+      </w:pPr>
+      <w:bookmarkStart w:id="376" w:name="_Ref196501451"/>
+      <w:bookmarkStart w:id="377" w:name="_Toc196502217"/>
+      <w:ins w:id="378" w:author="Ramin Miraftabi" w:date="2026-03-05T10:26:00Z" w16du:dateUtc="2026-03-05T09:26:00Z">
         <w:r>
           <w:rPr>
             <w:lang w:val="en-US"/>
           </w:rPr>
           <w:t>Callback</w:t>
         </w:r>
-        <w:bookmarkEnd w:id="351"/>
-        <w:bookmarkEnd w:id="352"/>
+        <w:bookmarkEnd w:id="376"/>
+        <w:bookmarkEnd w:id="377"/>
       </w:ins>
     </w:p>
     <w:p>
       <w:pPr>
         <w:pStyle w:val="BodyText"/>
         <w:rPr>
-          <w:ins w:id="354" w:author="Ramin Miraftabi" w:date="2026-03-05T10:31:00Z" w16du:dateUtc="2026-03-05T09:31:00Z"/>
-          <w:lang w:val="en-US"/>
-        </w:rPr>
-      </w:pPr>
-      <w:ins w:id="355" w:author="Ramin Miraftabi" w:date="2026-03-05T10:26:00Z" w16du:dateUtc="2026-03-05T09:26:00Z">
+          <w:ins w:id="379" w:author="Ramin Miraftabi" w:date="2026-03-05T10:31:00Z" w16du:dateUtc="2026-03-05T09:31:00Z"/>
+          <w:lang w:val="en-US"/>
+        </w:rPr>
+      </w:pPr>
+      <w:ins w:id="380" w:author="Ramin Miraftabi" w:date="2026-03-05T10:26:00Z" w16du:dateUtc="2026-03-05T09:26:00Z">
         <w:r>
           <w:rPr>
             <w:lang w:val="en-US"/>
@@ -15853,21 +16018,21 @@
       <w:pPr>
         <w:pStyle w:val="Heading3"/>
         <w:rPr>
-          <w:ins w:id="356" w:author="Ramin Miraftabi" w:date="2026-03-05T10:31:00Z" w16du:dateUtc="2026-03-05T09:31:00Z"/>
-          <w:lang w:val="en-US"/>
-        </w:rPr>
-      </w:pPr>
-      <w:bookmarkStart w:id="357" w:name="_Ref196501493"/>
-      <w:bookmarkStart w:id="358" w:name="_Toc196502220"/>
-      <w:ins w:id="359" w:author="Ramin Miraftabi" w:date="2026-03-05T10:31:00Z" w16du:dateUtc="2026-03-05T09:31:00Z">
+          <w:ins w:id="381" w:author="Ramin Miraftabi" w:date="2026-03-05T10:31:00Z" w16du:dateUtc="2026-03-05T09:31:00Z"/>
+          <w:lang w:val="en-US"/>
+        </w:rPr>
+      </w:pPr>
+      <w:bookmarkStart w:id="382" w:name="_Ref196501493"/>
+      <w:bookmarkStart w:id="383" w:name="_Toc196502220"/>
+      <w:ins w:id="384" w:author="Ramin Miraftabi" w:date="2026-03-05T10:31:00Z" w16du:dateUtc="2026-03-05T09:31:00Z">
         <w:r>
           <w:rPr>
             <w:lang w:val="en-US"/>
           </w:rPr>
           <w:t>Message identifier</w:t>
         </w:r>
-        <w:bookmarkEnd w:id="357"/>
-        <w:bookmarkEnd w:id="358"/>
+        <w:bookmarkEnd w:id="382"/>
+        <w:bookmarkEnd w:id="383"/>
       </w:ins>
     </w:p>
     <w:p>
@@ -15876,11 +16041,11 @@
         <w:rPr>
           <w:lang w:val="en-US"/>
         </w:rPr>
-        <w:pPrChange w:id="360" w:author="Ramin Miraftabi" w:date="2026-03-05T10:27:00Z" w16du:dateUtc="2026-03-05T09:27:00Z">
+        <w:pPrChange w:id="385" w:author="Ramin Miraftabi" w:date="2026-03-05T10:27:00Z" w16du:dateUtc="2026-03-05T09:27:00Z">
           <w:pPr/>
         </w:pPrChange>
       </w:pPr>
-      <w:ins w:id="361" w:author="Ramin Miraftabi" w:date="2026-03-05T10:31:00Z" w16du:dateUtc="2026-03-05T09:31:00Z">
+      <w:ins w:id="386" w:author="Ramin Miraftabi" w:date="2026-03-05T10:31:00Z" w16du:dateUtc="2026-03-05T09:31:00Z">
         <w:r>
           <w:rPr>
             <w:lang w:val="en-US"/>
@@ -15893,12 +16058,12 @@
       <w:pPr>
         <w:pStyle w:val="Heading1"/>
       </w:pPr>
-      <w:bookmarkStart w:id="362" w:name="_Toc196547475"/>
+      <w:bookmarkStart w:id="387" w:name="_Toc196547475"/>
       <w:r>
         <w:lastRenderedPageBreak/>
         <w:t>Service Data Model</w:t>
       </w:r>
-      <w:bookmarkEnd w:id="362"/>
+      <w:bookmarkEnd w:id="387"/>
     </w:p>
     <w:p>
       <w:pPr>
@@ -16085,7 +16250,7 @@
       <w:pPr>
         <w:pStyle w:val="Caption"/>
       </w:pPr>
-      <w:bookmarkStart w:id="363" w:name="_Toc196547572"/>
+      <w:bookmarkStart w:id="388" w:name="_Toc196547572"/>
       <w:r>
         <w:t xml:space="preserve">Figure </w:t>
       </w:r>
@@ -16100,18 +16265,18 @@
       <w:r>
         <w:t xml:space="preserve"> </w:t>
       </w:r>
-      <w:commentRangeStart w:id="364"/>
+      <w:commentRangeStart w:id="389"/>
       <w:r>
         <w:t>Traffic Clearance data model diagram</w:t>
       </w:r>
-      <w:bookmarkEnd w:id="363"/>
-      <w:commentRangeEnd w:id="364"/>
+      <w:bookmarkEnd w:id="388"/>
+      <w:commentRangeEnd w:id="389"/>
       <w:r>
         <w:rPr>
           <w:rStyle w:val="CommentReference"/>
           <w:sz w:val="20"/>
         </w:rPr>
-        <w:commentReference w:id="364"/>
+        <w:commentReference w:id="389"/>
       </w:r>
     </w:p>
     <w:p>
@@ -16476,7 +16641,7 @@
       <w:r>
         <w:t xml:space="preserve">1  </w:t>
       </w:r>
-      <w:ins w:id="365" w:author="Ramin Miraftabi" w:date="2026-03-05T10:28:00Z" w16du:dateUtc="2026-03-05T09:28:00Z">
+      <w:ins w:id="390" w:author="Ramin Miraftabi" w:date="2026-03-05T10:28:00Z" w16du:dateUtc="2026-03-05T09:28:00Z">
         <w:r>
           <w:t>to</w:t>
         </w:r>
@@ -16488,7 +16653,7 @@
       <w:r>
         <w:t>instance</w:t>
       </w:r>
-      <w:ins w:id="366" w:author="Ramin Miraftabi" w:date="2026-03-05T10:28:00Z" w16du:dateUtc="2026-03-05T09:28:00Z">
+      <w:ins w:id="391" w:author="Ramin Miraftabi" w:date="2026-03-05T10:28:00Z" w16du:dateUtc="2026-03-05T09:28:00Z">
         <w:r>
           <w:t>s</w:t>
         </w:r>
@@ -16585,14 +16750,14 @@
           <w:lang w:val="en-US"/>
         </w:rPr>
       </w:pPr>
-      <w:del w:id="367" w:author="Ramin Miraftabi" w:date="2026-03-05T10:27:00Z" w16du:dateUtc="2026-03-05T09:27:00Z">
+      <w:del w:id="392" w:author="Ramin Miraftabi" w:date="2026-03-05T10:27:00Z" w16du:dateUtc="2026-03-05T09:27:00Z">
         <w:r>
           <w:lastRenderedPageBreak/>
           <w:delText xml:space="preserve">locationType </w:delText>
         </w:r>
       </w:del>
       <w:proofErr w:type="spellStart"/>
-      <w:ins w:id="368" w:author="Ramin Miraftabi" w:date="2026-03-05T10:27:00Z" w16du:dateUtc="2026-03-05T09:27:00Z">
+      <w:ins w:id="393" w:author="Ramin Miraftabi" w:date="2026-03-05T10:27:00Z" w16du:dateUtc="2026-03-05T09:27:00Z">
         <w:r>
           <w:t>locationDirection</w:t>
         </w:r>
@@ -16604,12 +16769,12 @@
       <w:r>
         <w:t>– semantically correct option from enumeration.</w:t>
       </w:r>
-      <w:ins w:id="369" w:author="Ramin Miraftabi" w:date="2026-03-05T10:28:00Z" w16du:dateUtc="2026-03-05T09:28:00Z">
+      <w:ins w:id="394" w:author="Ramin Miraftabi" w:date="2026-03-05T10:28:00Z" w16du:dateUtc="2026-03-05T09:28:00Z">
         <w:r>
           <w:t xml:space="preserve"> When passing through a location the entry and exit locations of the area should be defined</w:t>
         </w:r>
       </w:ins>
-      <w:ins w:id="370" w:author="Ramin Miraftabi" w:date="2026-03-05T10:29:00Z" w16du:dateUtc="2026-03-05T09:29:00Z">
+      <w:ins w:id="395" w:author="Ramin Miraftabi" w:date="2026-03-05T10:29:00Z" w16du:dateUtc="2026-03-05T09:29:00Z">
         <w:r>
           <w:t>.</w:t>
         </w:r>
@@ -16619,14 +16784,14 @@
       <w:pPr>
         <w:pStyle w:val="Heading1"/>
       </w:pPr>
-      <w:bookmarkStart w:id="371" w:name="_Toc196547476"/>
-      <w:bookmarkStart w:id="372" w:name="_Ref223598755"/>
+      <w:bookmarkStart w:id="396" w:name="_Toc196547476"/>
+      <w:bookmarkStart w:id="397" w:name="_Ref223598755"/>
       <w:r>
         <w:lastRenderedPageBreak/>
         <w:t>Service Dynamic Behaviour</w:t>
       </w:r>
-      <w:bookmarkEnd w:id="371"/>
-      <w:bookmarkEnd w:id="372"/>
+      <w:bookmarkEnd w:id="396"/>
+      <w:bookmarkEnd w:id="397"/>
     </w:p>
     <w:p>
       <w:pPr>
@@ -16685,14 +16850,14 @@
           <w:lang w:val="en-US"/>
         </w:rPr>
       </w:pPr>
-      <w:bookmarkStart w:id="373" w:name="_Toc196547477"/>
+      <w:bookmarkStart w:id="398" w:name="_Toc196547477"/>
       <w:r>
         <w:rPr>
           <w:lang w:val="en-US"/>
         </w:rPr>
         <w:t>The allowed use of different clearance statuses</w:t>
       </w:r>
-      <w:bookmarkEnd w:id="373"/>
+      <w:bookmarkEnd w:id="398"/>
     </w:p>
     <w:p>
       <w:pPr>
@@ -16791,14 +16956,14 @@
           <w:lang w:val="en-US"/>
         </w:rPr>
       </w:pPr>
-      <w:bookmarkStart w:id="374" w:name="_Toc196547478"/>
+      <w:bookmarkStart w:id="399" w:name="_Toc196547478"/>
       <w:r>
         <w:rPr>
           <w:lang w:val="en-US"/>
         </w:rPr>
         <w:t>Multiple clearance messages in a single request</w:t>
       </w:r>
-      <w:bookmarkEnd w:id="374"/>
+      <w:bookmarkEnd w:id="399"/>
     </w:p>
     <w:p>
       <w:pPr>
@@ -16840,7 +17005,7 @@
       <w:pPr>
         <w:pStyle w:val="Bullet1"/>
         <w:rPr>
-          <w:ins w:id="375" w:author="Ramin Miraftabi" w:date="2026-03-05T10:32:00Z" w16du:dateUtc="2026-03-05T09:32:00Z"/>
+          <w:ins w:id="400" w:author="Ramin Miraftabi" w:date="2026-03-05T10:32:00Z" w16du:dateUtc="2026-03-05T09:32:00Z"/>
           <w:lang w:val="en-US"/>
         </w:rPr>
       </w:pPr>
@@ -16855,26 +17020,26 @@
       <w:pPr>
         <w:pStyle w:val="Heading2"/>
         <w:rPr>
-          <w:ins w:id="376" w:author="Ramin Miraftabi" w:date="2026-03-05T10:32:00Z" w16du:dateUtc="2026-03-05T09:32:00Z"/>
-          <w:lang w:val="en-US"/>
-        </w:rPr>
-      </w:pPr>
-      <w:bookmarkStart w:id="377" w:name="_Toc196502230"/>
-      <w:ins w:id="378" w:author="Ramin Miraftabi" w:date="2026-03-05T10:32:00Z" w16du:dateUtc="2026-03-05T09:32:00Z">
+          <w:ins w:id="401" w:author="Ramin Miraftabi" w:date="2026-03-05T10:32:00Z" w16du:dateUtc="2026-03-05T09:32:00Z"/>
+          <w:lang w:val="en-US"/>
+        </w:rPr>
+      </w:pPr>
+      <w:bookmarkStart w:id="402" w:name="_Toc196502230"/>
+      <w:ins w:id="403" w:author="Ramin Miraftabi" w:date="2026-03-05T10:32:00Z" w16du:dateUtc="2026-03-05T09:32:00Z">
         <w:r>
           <w:rPr>
             <w:lang w:val="en-US"/>
           </w:rPr>
           <w:t>Acknowledgement messages</w:t>
         </w:r>
-        <w:bookmarkEnd w:id="377"/>
+        <w:bookmarkEnd w:id="402"/>
       </w:ins>
     </w:p>
     <w:p>
       <w:pPr>
         <w:pStyle w:val="Heading2separationline"/>
         <w:rPr>
-          <w:ins w:id="379" w:author="Ramin Miraftabi" w:date="2026-03-05T10:32:00Z" w16du:dateUtc="2026-03-05T09:32:00Z"/>
+          <w:ins w:id="404" w:author="Ramin Miraftabi" w:date="2026-03-05T10:32:00Z" w16du:dateUtc="2026-03-05T09:32:00Z"/>
           <w:lang w:val="en-US"/>
         </w:rPr>
       </w:pPr>
@@ -16883,18 +17048,34 @@
       <w:pPr>
         <w:pStyle w:val="BodyText"/>
         <w:rPr>
-          <w:ins w:id="380" w:author="Ramin Miraftabi" w:date="2026-03-05T10:32:00Z" w16du:dateUtc="2026-03-05T09:32:00Z"/>
-          <w:lang w:val="en-US"/>
-        </w:rPr>
-      </w:pPr>
-      <w:ins w:id="381" w:author="Ramin Miraftabi" w:date="2026-03-05T10:32:00Z" w16du:dateUtc="2026-03-05T09:32:00Z">
+          <w:ins w:id="405" w:author="Ramin Miraftabi" w:date="2026-03-05T10:32:00Z" w16du:dateUtc="2026-03-05T09:32:00Z"/>
+          <w:lang w:val="en-US"/>
+        </w:rPr>
+      </w:pPr>
+      <w:ins w:id="406" w:author="Ramin Miraftabi" w:date="2026-03-05T10:32:00Z" w16du:dateUtc="2026-03-05T09:32:00Z">
         <w:r>
           <w:rPr>
             <w:lang w:val="en-US"/>
           </w:rPr>
-          <w:t xml:space="preserve">The sequence diagrams shown have multiple references to acknowledgments being sent of delivery to end systems (ship or VTS system) or opening of the message (route). This is due to the asynchronous and multi-hop nature of the communication where the technical transmission of a message from one component to another does not always signify the successful transmission of the message from one end system to another. </w:t>
+          <w:t>The sequence diagrams shown have multiple references to acknowledgments being sent of delivery to end systems (ship or VTS system) or opening of the message (</w:t>
         </w:r>
       </w:ins>
+      <w:ins w:id="407" w:author="Ramin Miraftabi" w:date="2026-03-05T12:03:00Z" w16du:dateUtc="2026-03-05T11:03:00Z">
+        <w:r>
+          <w:rPr>
+            <w:lang w:val="en-US"/>
+          </w:rPr>
+          <w:t>clearance message</w:t>
+        </w:r>
+      </w:ins>
+      <w:ins w:id="408" w:author="Ramin Miraftabi" w:date="2026-03-05T10:32:00Z" w16du:dateUtc="2026-03-05T09:32:00Z">
+        <w:r>
+          <w:rPr>
+            <w:lang w:val="en-US"/>
+          </w:rPr>
+          <w:t xml:space="preserve">). This is due to the asynchronous and multi-hop nature of the communication where the technical transmission of a message from one component to another does not always signify the successful transmission of the message from one end system to another. </w:t>
+        </w:r>
+      </w:ins>
     </w:p>
     <w:p>
       <w:pPr>
@@ -16902,20 +17083,84 @@
         <w:rPr>
           <w:lang w:val="en-US"/>
         </w:rPr>
-        <w:pPrChange w:id="382" w:author="Ramin Miraftabi" w:date="2026-03-05T10:32:00Z" w16du:dateUtc="2026-03-05T09:32:00Z">
+        <w:pPrChange w:id="409" w:author="Ramin Miraftabi" w:date="2026-03-05T10:32:00Z" w16du:dateUtc="2026-03-05T09:32:00Z">
           <w:pPr>
             <w:pStyle w:val="Bullet1"/>
           </w:pPr>
         </w:pPrChange>
       </w:pPr>
-      <w:ins w:id="383" w:author="Ramin Miraftabi" w:date="2026-03-05T10:32:00Z" w16du:dateUtc="2026-03-05T09:32:00Z">
+      <w:ins w:id="410" w:author="Ramin Miraftabi" w:date="2026-03-05T10:32:00Z" w16du:dateUtc="2026-03-05T09:32:00Z">
         <w:r>
           <w:rPr>
             <w:lang w:val="en-US"/>
           </w:rPr>
-          <w:t>Thus, the sequence diagrams show and prescribe when acknowledgments must be sent either on the successful delivery of the route to the end system or of the opening of the route by a user. If the received route is automatically displayed on VTS or ship systems, the opened acknowledgment can only be sent after the user has in some way interacted with the route.</w:t>
+          <w:t xml:space="preserve">Thus, the sequence diagrams show and prescribe when acknowledgments must be sent either on the successful delivery of the </w:t>
         </w:r>
       </w:ins>
+      <w:ins w:id="411" w:author="Ramin Miraftabi" w:date="2026-03-05T12:03:00Z" w16du:dateUtc="2026-03-05T11:03:00Z">
+        <w:r>
+          <w:rPr>
+            <w:lang w:val="en-US"/>
+          </w:rPr>
+          <w:t>clearance message</w:t>
+        </w:r>
+      </w:ins>
+      <w:ins w:id="412" w:author="Ramin Miraftabi" w:date="2026-03-05T10:32:00Z" w16du:dateUtc="2026-03-05T09:32:00Z">
+        <w:r>
+          <w:rPr>
+            <w:lang w:val="en-US"/>
+          </w:rPr>
+          <w:t xml:space="preserve"> to the end system or of the opening of the </w:t>
+        </w:r>
+      </w:ins>
+      <w:ins w:id="413" w:author="Ramin Miraftabi" w:date="2026-03-05T12:03:00Z" w16du:dateUtc="2026-03-05T11:03:00Z">
+        <w:r>
+          <w:rPr>
+            <w:lang w:val="en-US"/>
+          </w:rPr>
+          <w:t>clearance message</w:t>
+        </w:r>
+      </w:ins>
+      <w:ins w:id="414" w:author="Ramin Miraftabi" w:date="2026-03-05T10:32:00Z" w16du:dateUtc="2026-03-05T09:32:00Z">
+        <w:r>
+          <w:rPr>
+            <w:lang w:val="en-US"/>
+          </w:rPr>
+          <w:t xml:space="preserve"> by a user. If the received </w:t>
+        </w:r>
+      </w:ins>
+      <w:ins w:id="415" w:author="Ramin Miraftabi" w:date="2026-03-05T12:03:00Z" w16du:dateUtc="2026-03-05T11:03:00Z">
+        <w:r>
+          <w:rPr>
+            <w:lang w:val="en-US"/>
+          </w:rPr>
+          <w:t>clearance message</w:t>
+        </w:r>
+      </w:ins>
+      <w:ins w:id="416" w:author="Ramin Miraftabi" w:date="2026-03-05T10:32:00Z" w16du:dateUtc="2026-03-05T09:32:00Z">
+        <w:r>
+          <w:rPr>
+            <w:lang w:val="en-US"/>
+          </w:rPr>
+          <w:t xml:space="preserve"> is automatically displayed on VTS or ship systems, the opened acknowledgment can only be sent after the user has in some way interacted with the </w:t>
+        </w:r>
+      </w:ins>
+      <w:ins w:id="417" w:author="Ramin Miraftabi" w:date="2026-03-05T12:03:00Z" w16du:dateUtc="2026-03-05T11:03:00Z">
+        <w:r>
+          <w:rPr>
+            <w:lang w:val="en-US"/>
+          </w:rPr>
+          <w:t>clearance message</w:t>
+        </w:r>
+      </w:ins>
+      <w:ins w:id="418" w:author="Ramin Miraftabi" w:date="2026-03-05T10:32:00Z" w16du:dateUtc="2026-03-05T09:32:00Z">
+        <w:r>
+          <w:rPr>
+            <w:lang w:val="en-US"/>
+          </w:rPr>
+          <w:t>.</w:t>
+        </w:r>
+      </w:ins>
     </w:p>
     <w:p>
       <w:pPr>
@@ -16924,7 +17169,7 @@
           <w:lang w:val="en-US"/>
         </w:rPr>
       </w:pPr>
-      <w:bookmarkStart w:id="384" w:name="_Toc196547479"/>
+      <w:bookmarkStart w:id="419" w:name="_Toc196547479"/>
       <w:r>
         <w:rPr>
           <w:lang w:val="en-US"/>
@@ -16932,7 +17177,7 @@
         <w:lastRenderedPageBreak/>
         <w:t>Sequence diagrams</w:t>
       </w:r>
-      <w:bookmarkEnd w:id="384"/>
+      <w:bookmarkEnd w:id="419"/>
     </w:p>
     <w:p>
       <w:pPr>
@@ -17032,7 +17277,7 @@
       <w:pPr>
         <w:pStyle w:val="Caption"/>
       </w:pPr>
-      <w:bookmarkStart w:id="385" w:name="_Toc196547573"/>
+      <w:bookmarkStart w:id="420" w:name="_Toc196547573"/>
       <w:r>
         <w:t xml:space="preserve">Figure </w:t>
       </w:r>
@@ -17047,7 +17292,7 @@
       <w:r>
         <w:t xml:space="preserve"> Use case 1 sequence diagram</w:t>
       </w:r>
-      <w:bookmarkEnd w:id="385"/>
+      <w:bookmarkEnd w:id="420"/>
     </w:p>
     <w:p>
       <w:pPr>
@@ -17111,7 +17356,7 @@
       <w:pPr>
         <w:pStyle w:val="Caption"/>
       </w:pPr>
-      <w:bookmarkStart w:id="386" w:name="_Toc196547574"/>
+      <w:bookmarkStart w:id="421" w:name="_Toc196547574"/>
       <w:r>
         <w:t xml:space="preserve">Figure </w:t>
       </w:r>
@@ -17126,7 +17371,7 @@
       <w:r>
         <w:t xml:space="preserve"> Use Case 2 variation 1 sequence diagram</w:t>
       </w:r>
-      <w:bookmarkEnd w:id="386"/>
+      <w:bookmarkEnd w:id="421"/>
     </w:p>
     <w:p>
       <w:pPr>
@@ -17189,7 +17434,7 @@
       <w:pPr>
         <w:pStyle w:val="Caption"/>
       </w:pPr>
-      <w:bookmarkStart w:id="387" w:name="_Toc196547575"/>
+      <w:bookmarkStart w:id="422" w:name="_Toc196547575"/>
       <w:r>
         <w:t xml:space="preserve">Figure </w:t>
       </w:r>
@@ -17204,7 +17449,7 @@
       <w:r>
         <w:t xml:space="preserve"> Use Case 2 variation 2 sequence diagram</w:t>
       </w:r>
-      <w:bookmarkEnd w:id="387"/>
+      <w:bookmarkEnd w:id="422"/>
     </w:p>
     <w:p>
       <w:pPr>
@@ -17268,7 +17513,7 @@
       <w:pPr>
         <w:pStyle w:val="Caption"/>
       </w:pPr>
-      <w:bookmarkStart w:id="388" w:name="_Toc196547576"/>
+      <w:bookmarkStart w:id="423" w:name="_Toc196547576"/>
       <w:r>
         <w:t xml:space="preserve">Figure </w:t>
       </w:r>
@@ -17283,7 +17528,7 @@
       <w:r>
         <w:t xml:space="preserve"> Use Case 3 sequence diagram</w:t>
       </w:r>
-      <w:bookmarkEnd w:id="388"/>
+      <w:bookmarkEnd w:id="423"/>
     </w:p>
     <w:p>
       <w:pPr>
@@ -17347,7 +17592,7 @@
       <w:pPr>
         <w:pStyle w:val="Caption"/>
       </w:pPr>
-      <w:bookmarkStart w:id="389" w:name="_Toc196547577"/>
+      <w:bookmarkStart w:id="424" w:name="_Toc196547577"/>
       <w:r>
         <w:t xml:space="preserve">Figure </w:t>
       </w:r>
@@ -17362,7 +17607,7 @@
       <w:r>
         <w:t xml:space="preserve"> Use Case 4 sequence diagram</w:t>
       </w:r>
-      <w:bookmarkEnd w:id="389"/>
+      <w:bookmarkEnd w:id="424"/>
     </w:p>
     <w:p>
       <w:pPr>
@@ -17426,7 +17671,7 @@
       <w:pPr>
         <w:pStyle w:val="Caption"/>
       </w:pPr>
-      <w:bookmarkStart w:id="390" w:name="_Toc196547578"/>
+      <w:bookmarkStart w:id="425" w:name="_Toc196547578"/>
       <w:r>
         <w:t xml:space="preserve">Figure </w:t>
       </w:r>
@@ -17441,7 +17686,7 @@
       <w:r>
         <w:t xml:space="preserve"> Use Case 5 sequence diagram</w:t>
       </w:r>
-      <w:bookmarkEnd w:id="390"/>
+      <w:bookmarkEnd w:id="425"/>
     </w:p>
     <w:p>
       <w:pPr>
@@ -17520,7 +17765,7 @@
       <w:pPr>
         <w:pStyle w:val="Caption"/>
       </w:pPr>
-      <w:bookmarkStart w:id="391" w:name="_Toc196547579"/>
+      <w:bookmarkStart w:id="426" w:name="_Toc196547579"/>
       <w:r>
         <w:t xml:space="preserve">Figure </w:t>
       </w:r>
@@ -17535,18 +17780,18 @@
       <w:r>
         <w:t xml:space="preserve"> Use Case 6 sequence diagrams</w:t>
       </w:r>
-      <w:bookmarkEnd w:id="391"/>
+      <w:bookmarkEnd w:id="426"/>
     </w:p>
     <w:p>
       <w:pPr>
         <w:pStyle w:val="Heading1"/>
       </w:pPr>
-      <w:bookmarkStart w:id="392" w:name="_Toc196547480"/>
+      <w:bookmarkStart w:id="427" w:name="_Toc196547480"/>
       <w:r>
         <w:lastRenderedPageBreak/>
         <w:t>Definitions</w:t>
       </w:r>
-      <w:bookmarkEnd w:id="392"/>
+      <w:bookmarkEnd w:id="427"/>
     </w:p>
     <w:p>
       <w:pPr>
@@ -17824,12 +18069,12 @@
       <w:pPr>
         <w:pStyle w:val="Heading1"/>
       </w:pPr>
-      <w:bookmarkStart w:id="393" w:name="_Toc196547481"/>
+      <w:bookmarkStart w:id="428" w:name="_Toc196547481"/>
       <w:r>
         <w:lastRenderedPageBreak/>
         <w:t>Abbreviations</w:t>
       </w:r>
-      <w:bookmarkEnd w:id="393"/>
+      <w:bookmarkEnd w:id="428"/>
     </w:p>
     <w:p>
       <w:pPr>
@@ -18196,20 +18441,20 @@
       <w:pPr>
         <w:pStyle w:val="Heading1"/>
       </w:pPr>
-      <w:bookmarkStart w:id="394" w:name="_Toc196547482"/>
-      <w:commentRangeStart w:id="395"/>
+      <w:bookmarkStart w:id="429" w:name="_Toc196547482"/>
+      <w:commentRangeStart w:id="430"/>
       <w:r>
         <w:lastRenderedPageBreak/>
         <w:t>References</w:t>
       </w:r>
-      <w:bookmarkEnd w:id="394"/>
-      <w:commentRangeEnd w:id="395"/>
+      <w:bookmarkEnd w:id="429"/>
+      <w:commentRangeEnd w:id="430"/>
       <w:r>
         <w:rPr>
           <w:rStyle w:val="CommentReference"/>
           <w:sz w:val="24"/>
         </w:rPr>
-        <w:commentReference w:id="395"/>
+        <w:commentReference w:id="430"/>
       </w:r>
     </w:p>
     <w:p>
@@ -18227,7 +18472,7 @@
           <w:lang w:val="en-US"/>
         </w:rPr>
       </w:pPr>
-      <w:bookmarkStart w:id="396" w:name="_Ref196547598"/>
+      <w:bookmarkStart w:id="431" w:name="_Ref196547598"/>
       <w:r>
         <w:rPr>
           <w:lang w:val="en-US"/>
@@ -18252,7 +18497,7 @@
         </w:rPr>
         <w:t>Navigation Technical Services</w:t>
       </w:r>
-      <w:bookmarkEnd w:id="396"/>
+      <w:bookmarkEnd w:id="431"/>
     </w:p>
     <w:p>
       <w:pPr>
@@ -18261,7 +18506,7 @@
           <w:lang w:val="en-US"/>
         </w:rPr>
       </w:pPr>
-      <w:bookmarkStart w:id="397" w:name="_Ref196547616"/>
+      <w:bookmarkStart w:id="432" w:name="_Ref196547616"/>
       <w:r>
         <w:rPr>
           <w:lang w:val="en-US"/>
@@ -18286,7 +18531,7 @@
         </w:rPr>
         <w:t>Guidelines for Harmonized Communication and Electronic Exchange of Operational Data for Port Calls</w:t>
       </w:r>
-      <w:bookmarkEnd w:id="397"/>
+      <w:bookmarkEnd w:id="432"/>
     </w:p>
     <w:p>
       <w:pPr>
@@ -18295,7 +18540,7 @@
           <w:lang w:val="en-US"/>
         </w:rPr>
       </w:pPr>
-      <w:bookmarkStart w:id="398" w:name="_Ref196547797"/>
+      <w:bookmarkStart w:id="433" w:name="_Ref196547797"/>
       <w:r>
         <w:rPr>
           <w:lang w:val="en-US"/>
@@ -18308,7 +18553,7 @@
         </w:rPr>
         <w:t>2022. Res 1158(32) Guidelines for Vessel Traffic Services</w:t>
       </w:r>
-      <w:bookmarkEnd w:id="398"/>
+      <w:bookmarkEnd w:id="433"/>
     </w:p>
     <w:p>
       <w:pPr>
@@ -18317,7 +18562,7 @@
           <w:lang w:val="en-US"/>
         </w:rPr>
       </w:pPr>
-      <w:bookmarkStart w:id="399" w:name="_Ref196547820"/>
+      <w:bookmarkStart w:id="434" w:name="_Ref196547820"/>
       <w:r>
         <w:rPr>
           <w:lang w:val="en-US"/>
@@ -18342,7 +18587,7 @@
         </w:rPr>
         <w:t xml:space="preserve"> Provision of a VTS</w:t>
       </w:r>
-      <w:bookmarkEnd w:id="399"/>
+      <w:bookmarkEnd w:id="434"/>
     </w:p>
     <w:p>
       <w:pPr>
@@ -18410,11 +18655,11 @@
       <w:pPr>
         <w:pStyle w:val="Referencelist"/>
         <w:rPr>
-          <w:ins w:id="400" w:author="Pitkänen Juho" w:date="2026-03-03T17:03:00Z" w16du:dateUtc="2026-03-03T16:03:00Z"/>
-          <w:lang w:val="en-US"/>
-        </w:rPr>
-      </w:pPr>
-      <w:bookmarkStart w:id="401" w:name="_Ref196547935"/>
+          <w:ins w:id="435" w:author="Pitkänen Juho" w:date="2026-03-03T17:03:00Z" w16du:dateUtc="2026-03-03T16:03:00Z"/>
+          <w:lang w:val="en-US"/>
+        </w:rPr>
+      </w:pPr>
+      <w:bookmarkStart w:id="436" w:name="_Ref196547935"/>
       <w:r>
         <w:rPr>
           <w:lang w:val="en-US"/>
@@ -18445,14 +18690,14 @@
         </w:rPr>
         <w:t>IALA VTS Digital Information Service Product Specification</w:t>
       </w:r>
-      <w:bookmarkEnd w:id="401"/>
+      <w:bookmarkEnd w:id="436"/>
       <w:r>
         <w:rPr>
           <w:lang w:val="en-US"/>
         </w:rPr>
         <w:t xml:space="preserve"> </w:t>
       </w:r>
-      <w:ins w:id="402" w:author="Pitkänen Juho" w:date="2026-03-03T17:03:00Z" w16du:dateUtc="2026-03-03T16:03:00Z">
+      <w:ins w:id="437" w:author="Pitkänen Juho" w:date="2026-03-03T17:03:00Z" w16du:dateUtc="2026-03-03T16:03:00Z">
         <w:r>
           <w:rPr>
             <w:lang w:val="en-US"/>
@@ -18472,7 +18717,7 @@
         </w:rPr>
         <w:instrText>https://www.iala-aism.org/technical/data-modelling/iala-s-200-development-status/s-212/</w:instrText>
       </w:r>
-      <w:ins w:id="403" w:author="Pitkänen Juho" w:date="2026-03-03T17:03:00Z" w16du:dateUtc="2026-03-03T16:03:00Z">
+      <w:ins w:id="438" w:author="Pitkänen Juho" w:date="2026-03-03T17:03:00Z" w16du:dateUtc="2026-03-03T16:03:00Z">
         <w:r>
           <w:rPr>
             <w:lang w:val="en-US"/>
@@ -18498,7 +18743,7 @@
         </w:rPr>
         <w:t>https://www.iala-aism.org/technical/data-modelling/iala-s-200-development-status/s-212/</w:t>
       </w:r>
-      <w:ins w:id="404" w:author="Pitkänen Juho" w:date="2026-03-03T17:03:00Z" w16du:dateUtc="2026-03-03T16:03:00Z">
+      <w:ins w:id="439" w:author="Pitkänen Juho" w:date="2026-03-03T17:03:00Z" w16du:dateUtc="2026-03-03T16:03:00Z">
         <w:r>
           <w:rPr>
             <w:lang w:val="en-US"/>
@@ -18511,11 +18756,11 @@
       <w:pPr>
         <w:pStyle w:val="Referencelist"/>
         <w:rPr>
-          <w:ins w:id="405" w:author="Pitkänen Juho" w:date="2026-03-03T17:03:00Z" w16du:dateUtc="2026-03-03T16:03:00Z"/>
-          <w:lang w:val="en-US"/>
-        </w:rPr>
-      </w:pPr>
-      <w:ins w:id="406" w:author="Pitkänen Juho" w:date="2026-03-03T17:03:00Z">
+          <w:ins w:id="440" w:author="Pitkänen Juho" w:date="2026-03-03T17:03:00Z" w16du:dateUtc="2026-03-03T16:03:00Z"/>
+          <w:lang w:val="en-US"/>
+        </w:rPr>
+      </w:pPr>
+      <w:ins w:id="441" w:author="Pitkänen Juho" w:date="2026-03-03T17:03:00Z">
         <w:r>
           <w:rPr>
             <w:lang w:val="en-US"/>
@@ -18523,7 +18768,7 @@
           <w:t>IALA</w:t>
         </w:r>
       </w:ins>
-      <w:ins w:id="407" w:author="Pitkänen Juho" w:date="2026-03-03T17:03:00Z" w16du:dateUtc="2026-03-03T16:03:00Z">
+      <w:ins w:id="442" w:author="Pitkänen Juho" w:date="2026-03-03T17:03:00Z" w16du:dateUtc="2026-03-03T16:03:00Z">
         <w:r>
           <w:rPr>
             <w:lang w:val="en-US"/>
@@ -18531,7 +18776,7 @@
           <w:t>…</w:t>
         </w:r>
       </w:ins>
-      <w:ins w:id="408" w:author="Pitkänen Juho" w:date="2026-03-03T17:03:00Z">
+      <w:ins w:id="443" w:author="Pitkänen Juho" w:date="2026-03-03T17:03:00Z">
         <w:r>
           <w:rPr>
             <w:lang w:val="en-US"/>
@@ -18547,7 +18792,7 @@
           <w:lang w:val="en-US"/>
         </w:rPr>
       </w:pPr>
-      <w:ins w:id="409" w:author="Pitkänen Juho" w:date="2026-03-03T17:03:00Z" w16du:dateUtc="2026-03-03T16:03:00Z">
+      <w:ins w:id="444" w:author="Pitkänen Juho" w:date="2026-03-03T17:03:00Z" w16du:dateUtc="2026-03-03T16:03:00Z">
         <w:r>
           <w:rPr>
             <w:lang w:val="en-US"/>
@@ -18555,7 +18800,7 @@
           <w:t xml:space="preserve">IALA … </w:t>
         </w:r>
       </w:ins>
-      <w:ins w:id="410" w:author="Pitkänen Juho" w:date="2026-03-03T17:03:00Z">
+      <w:ins w:id="445" w:author="Pitkänen Juho" w:date="2026-03-03T17:03:00Z">
         <w:r>
           <w:rPr>
             <w:lang w:val="en-US"/>
@@ -18581,7 +18826,7 @@
 
 <file path=word/comments.xml><?xml version="1.0" encoding="utf-8"?>
 <w:comments xmlns:wpc="http://schemas.microsoft.com/office/word/2010/wordprocessingCanvas" xmlns:cx="http://schemas.microsoft.com/office/drawing/2014/chartex" xmlns:cx1="http://schemas.microsoft.com/office/drawing/2015/9/8/chartex" xmlns:cx2="http://schemas.microsoft.com/office/drawing/2015/10/21/chartex" xmlns:cx3="http://schemas.microsoft.com/office/drawing/2016/5/9/chartex" xmlns:cx4="http://schemas.microsoft.com/office/drawing/2016/5/10/chartex" xmlns:cx5="http://schemas.microsoft.com/office/drawing/2016/5/11/chartex" xmlns:cx6="http://schemas.microsoft.com/office/drawing/2016/5/12/chartex" xmlns:cx7="http://schemas.microsoft.com/office/drawing/2016/5/13/chartex" xmlns:cx8="http://schemas.microsoft.com/office/drawing/2016/5/14/chartex" xmlns:mc="http://schemas.openxmlformats.org/markup-compatibility/2006" xmlns:aink="http://schemas.microsoft.com/office/drawing/2016/ink" xmlns:am3d="http://schemas.microsoft.com/office/drawing/2017/model3d" xmlns:o="urn:schemas-microsoft-com:office:office" xmlns:oel="http://schemas.microsoft.com/office/2019/extlst" xmlns:r="http://schemas.openxmlformats.org/officeDocument/2006/relationships" xmlns:m="http://schemas.openxmlformats.org/officeDocument/2006/math" xmlns:v="urn:schemas-microsoft-com:vml" xmlns:wp14="http://schemas.microsoft.com/office/word/2010/wordprocessingDrawing" xmlns:wp="http://schemas.openxmlformats.org/drawingml/2006/wordprocessingDrawing" xmlns:w10="urn:schemas-microsoft-com:office:word" xmlns:w="http://schemas.openxmlformats.org/wordprocessingml/2006/main" xmlns:w14="http://schemas.microsoft.com/office/word/2010/wordml" xmlns:w15="http://schemas.microsoft.com/office/word/2012/wordml" xmlns:w16cex="http://schemas.microsoft.com/office/word/2018/wordml/cex" xmlns:w16cid="http://schemas.microsoft.com/office/word/2016/wordml/cid" xmlns:w16="http://schemas.microsoft.com/office/word/2018/wordml" xmlns:w16du="http://schemas.microsoft.com/office/word/2023/wordml/word16du" xmlns:w16sdtdh="http://schemas.microsoft.com/office/word/2020/wordml/sdtdatahash" xmlns:w16sdtfl="http://schemas.microsoft.com/office/word/2024/wordml/sdtformatlock" xmlns:w16se="http://schemas.microsoft.com/office/word/2015/wordml/symex" xmlns:wpg="http://schemas.microsoft.com/office/word/2010/wordprocessingGroup" xmlns:wpi="http://schemas.microsoft.com/office/word/2010/wordprocessingInk" xmlns:wne="http://schemas.microsoft.com/office/word/2006/wordml" xmlns:wps="http://schemas.microsoft.com/office/word/2010/wordprocessingShape" mc:Ignorable="w14 w15 w16se w16cid w16 w16cex w16sdtdh w16sdtfl w16du wp14">
-  <w:comment w:id="47" w:author="Ramin Miraftabi" w:date="2026-03-04T10:13:00Z" w:initials="RM">
+  <w:comment w:id="52" w:author="Ramin Miraftabi" w:date="2026-03-04T10:13:00Z" w:initials="RM">
     <w:p>
       <w:pPr>
         <w:jc w:val="left"/>
@@ -18601,7 +18846,7 @@
       </w:r>
     </w:p>
   </w:comment>
-  <w:comment w:id="48" w:author="Ramin Miraftabi" w:date="2026-03-04T10:16:00Z" w:initials="RM">
+  <w:comment w:id="53" w:author="Ramin Miraftabi" w:date="2026-03-04T10:16:00Z" w:initials="RM">
     <w:p>
       <w:pPr>
         <w:jc w:val="left"/>
@@ -18621,27 +18866,7 @@
       </w:r>
     </w:p>
   </w:comment>
-  <w:comment w:id="236" w:author="Ramin Miraftabi" w:date="2026-03-04T09:45:00Z" w:initials="RM">
-    <w:p>
-      <w:pPr>
-        <w:jc w:val="left"/>
-      </w:pPr>
-      <w:r>
-        <w:rPr>
-          <w:rStyle w:val="CommentReference"/>
-        </w:rPr>
-        <w:annotationRef/>
-      </w:r>
-      <w:r>
-        <w:rPr>
-          <w:color w:val="000000"/>
-          <w:sz w:val="20"/>
-        </w:rPr>
-        <w:t>NFR for what opened ack means</w:t>
-      </w:r>
-    </w:p>
-  </w:comment>
-  <w:comment w:id="249" w:author="Pitkänen Juho" w:date="2026-03-03T16:25:00Z" w:initials="JP">
+  <w:comment w:id="253" w:author="Pitkänen Juho" w:date="2026-03-03T16:25:00Z" w:initials="JP">
     <w:p>
       <w:pPr>
         <w:pStyle w:val="CommentText"/>
@@ -18658,7 +18883,7 @@
       </w:r>
     </w:p>
   </w:comment>
-  <w:comment w:id="250" w:author="Pitkänen Juho" w:date="2026-03-03T16:24:00Z" w:initials="JP">
+  <w:comment w:id="254" w:author="Pitkänen Juho" w:date="2026-03-03T16:24:00Z" w:initials="JP">
     <w:p>
       <w:pPr>
         <w:pStyle w:val="CommentText"/>
@@ -18675,7 +18900,7 @@
       </w:r>
     </w:p>
   </w:comment>
-  <w:comment w:id="251" w:author="Pitkänen Juho" w:date="2026-03-03T16:24:00Z" w:initials="JP">
+  <w:comment w:id="255" w:author="Pitkänen Juho" w:date="2026-03-03T16:24:00Z" w:initials="JP">
     <w:p>
       <w:pPr>
         <w:pStyle w:val="CommentText"/>
@@ -18692,7 +18917,7 @@
       </w:r>
     </w:p>
   </w:comment>
-  <w:comment w:id="364" w:author="Pitkänen Juho" w:date="2026-03-03T17:05:00Z" w:initials="JP">
+  <w:comment w:id="389" w:author="Pitkänen Juho" w:date="2026-03-03T17:05:00Z" w:initials="JP">
     <w:p>
       <w:pPr>
         <w:pStyle w:val="CommentText"/>
@@ -18709,7 +18934,7 @@
       </w:r>
     </w:p>
   </w:comment>
-  <w:comment w:id="395" w:author="Pitkänen Juho" w:date="2026-03-03T17:04:00Z" w:initials="JP">
+  <w:comment w:id="430" w:author="Pitkänen Juho" w:date="2026-03-03T17:04:00Z" w:initials="JP">
     <w:p>
       <w:pPr>
         <w:pStyle w:val="CommentText"/>
@@ -18733,7 +18958,6 @@
 <w15:commentsEx xmlns:wpc="http://schemas.microsoft.com/office/word/2010/wordprocessingCanvas" xmlns:cx="http://schemas.microsoft.com/office/drawing/2014/chartex" xmlns:cx1="http://schemas.microsoft.com/office/drawing/2015/9/8/chartex" xmlns:cx2="http://schemas.microsoft.com/office/drawing/2015/10/21/chartex" xmlns:cx3="http://schemas.microsoft.com/office/drawing/2016/5/9/chartex" xmlns:cx4="http://schemas.microsoft.com/office/drawing/2016/5/10/chartex" xmlns:cx5="http://schemas.microsoft.com/office/drawing/2016/5/11/chartex" xmlns:cx6="http://schemas.microsoft.com/office/drawing/2016/5/12/chartex" xmlns:cx7="http://schemas.microsoft.com/office/drawing/2016/5/13/chartex" xmlns:cx8="http://schemas.microsoft.com/office/drawing/2016/5/14/chartex" xmlns:mc="http://schemas.openxmlformats.org/markup-compatibility/2006" xmlns:aink="http://schemas.microsoft.com/office/drawing/2016/ink" xmlns:am3d="http://schemas.microsoft.com/office/drawing/2017/model3d" xmlns:o="urn:schemas-microsoft-com:office:office" xmlns:oel="http://schemas.microsoft.com/office/2019/extlst" xmlns:r="http://schemas.openxmlformats.org/officeDocument/2006/relationships" xmlns:m="http://schemas.openxmlformats.org/officeDocument/2006/math" xmlns:v="urn:schemas-microsoft-com:vml" xmlns:wp14="http://schemas.microsoft.com/office/word/2010/wordprocessingDrawing" xmlns:wp="http://schemas.openxmlformats.org/drawingml/2006/wordprocessingDrawing" xmlns:w10="urn:schemas-microsoft-com:office:word" xmlns:w="http://schemas.openxmlformats.org/wordprocessingml/2006/main" xmlns:w14="http://schemas.microsoft.com/office/word/2010/wordml" xmlns:w15="http://schemas.microsoft.com/office/word/2012/wordml" xmlns:w16cex="http://schemas.microsoft.com/office/word/2018/wordml/cex" xmlns:w16cid="http://schemas.microsoft.com/office/word/2016/wordml/cid" xmlns:w16="http://schemas.microsoft.com/office/word/2018/wordml" xmlns:w16du="http://schemas.microsoft.com/office/word/2023/wordml/word16du" xmlns:w16sdtdh="http://schemas.microsoft.com/office/word/2020/wordml/sdtdatahash" xmlns:w16sdtfl="http://schemas.microsoft.com/office/word/2024/wordml/sdtformatlock" xmlns:w16se="http://schemas.microsoft.com/office/word/2015/wordml/symex" xmlns:wpg="http://schemas.microsoft.com/office/word/2010/wordprocessingGroup" xmlns:wpi="http://schemas.microsoft.com/office/word/2010/wordprocessingInk" xmlns:wne="http://schemas.microsoft.com/office/word/2006/wordml" xmlns:wps="http://schemas.microsoft.com/office/word/2010/wordprocessingShape" mc:Ignorable="w14 w15 w16se w16cid w16 w16cex w16sdtdh w16sdtfl w16du wp14">
   <w15:commentEx w15:paraId="6822A636" w15:done="0"/>
   <w15:commentEx w15:paraId="536124A0" w15:paraIdParent="6822A636" w15:done="0"/>
-  <w15:commentEx w15:paraId="740760A7" w15:done="0"/>
   <w15:commentEx w15:paraId="7F4A2096" w15:done="0"/>
   <w15:commentEx w15:paraId="1F82E2EF" w15:done="0"/>
   <w15:commentEx w15:paraId="2F6978DB" w15:done="0"/>
@@ -18746,7 +18970,6 @@
 <w16cex:commentsExtensible xmlns:wpc="http://schemas.microsoft.com/office/word/2010/wordprocessingCanvas" xmlns:cx="http://schemas.microsoft.com/office/drawing/2014/chartex" xmlns:cx1="http://schemas.microsoft.com/office/drawing/2015/9/8/chartex" xmlns:cx2="http://schemas.microsoft.com/office/drawing/2015/10/21/chartex" xmlns:cx3="http://schemas.microsoft.com/office/drawing/2016/5/9/chartex" xmlns:cx4="http://schemas.microsoft.com/office/drawing/2016/5/10/chartex" xmlns:cx5="http://schemas.microsoft.com/office/drawing/2016/5/11/chartex" xmlns:cx6="http://schemas.microsoft.com/office/drawing/2016/5/12/chartex" xmlns:cx7="http://schemas.microsoft.com/office/drawing/2016/5/13/chartex" xmlns:cx8="http://schemas.microsoft.com/office/drawing/2016/5/14/chartex" xmlns:cr="http://schemas.microsoft.com/office/comments/2020/reactions" xmlns:mc="http://schemas.openxmlformats.org/markup-compatibility/2006" xmlns:aink="http://schemas.microsoft.com/office/drawing/2016/ink" xmlns:am3d="http://schemas.microsoft.com/office/drawing/2017/model3d" xmlns:o="urn:schemas-microsoft-com:office:office" xmlns:oel="http://schemas.microsoft.com/office/2019/extlst" xmlns:r="http://schemas.openxmlformats.org/officeDocument/2006/relationships" xmlns:m="http://schemas.openxmlformats.org/officeDocument/2006/math" xmlns:v="urn:schemas-microsoft-com:vml" xmlns:wp14="http://schemas.microsoft.com/office/word/2010/wordprocessingDrawing" xmlns:wp="http://schemas.openxmlformats.org/drawingml/2006/wordprocessingDrawing" xmlns:w10="urn:schemas-microsoft-com:office:word" xmlns:w="http://schemas.openxmlformats.org/wordprocessingml/2006/main" xmlns:w14="http://schemas.microsoft.com/office/word/2010/wordml" xmlns:w15="http://schemas.microsoft.com/office/word/2012/wordml" xmlns:w16cex="http://schemas.microsoft.com/office/word/2018/wordml/cex" xmlns:w16cid="http://schemas.microsoft.com/office/word/2016/wordml/cid" xmlns:w16="http://schemas.microsoft.com/office/word/2018/wordml" xmlns:w16du="http://schemas.microsoft.com/office/word/2023/wordml/word16du" xmlns:w16sdtdh="http://schemas.microsoft.com/office/word/2020/wordml/sdtdatahash" xmlns:w16sdtfl="http://schemas.microsoft.com/office/word/2024/wordml/sdtformatlock" xmlns:w16se="http://schemas.microsoft.com/office/word/2015/wordml/symex" xmlns:wpg="http://schemas.microsoft.com/office/word/2010/wordprocessingGroup" xmlns:wpi="http://schemas.microsoft.com/office/word/2010/wordprocessingInk" xmlns:wne="http://schemas.microsoft.com/office/word/2006/wordml" xmlns:wps="http://schemas.microsoft.com/office/word/2010/wordprocessingShape" mc:Ignorable="w14 w15 w16se w16cid w16 w16cex w16sdtdh w16sdtfl cr w16du wp14">
   <w16cex:commentExtensible w16cex:durableId="2245A1AC" w16cex:dateUtc="2026-03-04T09:13:00Z"/>
   <w16cex:commentExtensible w16cex:durableId="688C74B1" w16cex:dateUtc="2026-03-04T09:16:00Z"/>
-  <w16cex:commentExtensible w16cex:durableId="6F2792A9" w16cex:dateUtc="2026-03-04T08:45:00Z"/>
   <w16cex:commentExtensible w16cex:durableId="7AB72728" w16cex:dateUtc="2026-03-03T15:25:00Z"/>
   <w16cex:commentExtensible w16cex:durableId="67B3D12A" w16cex:dateUtc="2026-03-03T15:24:00Z"/>
   <w16cex:commentExtensible w16cex:durableId="1608721C" w16cex:dateUtc="2026-03-03T15:24:00Z"/>
@@ -18759,7 +18982,6 @@
 <w16cid:commentsIds xmlns:wpc="http://schemas.microsoft.com/office/word/2010/wordprocessingCanvas" xmlns:cx="http://schemas.microsoft.com/office/drawing/2014/chartex" xmlns:cx1="http://schemas.microsoft.com/office/drawing/2015/9/8/chartex" xmlns:cx2="http://schemas.microsoft.com/office/drawing/2015/10/21/chartex" xmlns:cx3="http://schemas.microsoft.com/office/drawing/2016/5/9/chartex" xmlns:cx4="http://schemas.microsoft.com/office/drawing/2016/5/10/chartex" xmlns:cx5="http://schemas.microsoft.com/office/drawing/2016/5/11/chartex" xmlns:cx6="http://schemas.microsoft.com/office/drawing/2016/5/12/chartex" xmlns:cx7="http://schemas.microsoft.com/office/drawing/2016/5/13/chartex" xmlns:cx8="http://schemas.microsoft.com/office/drawing/2016/5/14/chartex" xmlns:mc="http://schemas.openxmlformats.org/markup-compatibility/2006" xmlns:aink="http://schemas.microsoft.com/office/drawing/2016/ink" xmlns:am3d="http://schemas.microsoft.com/office/drawing/2017/model3d" xmlns:o="urn:schemas-microsoft-com:office:office" xmlns:oel="http://schemas.microsoft.com/office/2019/extlst" xmlns:r="http://schemas.openxmlformats.org/officeDocument/2006/relationships" xmlns:m="http://schemas.openxmlformats.org/officeDocument/2006/math" xmlns:v="urn:schemas-microsoft-com:vml" xmlns:wp14="http://schemas.microsoft.com/office/word/2010/wordprocessingDrawing" xmlns:wp="http://schemas.openxmlformats.org/drawingml/2006/wordprocessingDrawing" xmlns:w10="urn:schemas-microsoft-com:office:word" xmlns:w="http://schemas.openxmlformats.org/wordprocessingml/2006/main" xmlns:w14="http://schemas.microsoft.com/office/word/2010/wordml" xmlns:w15="http://schemas.microsoft.com/office/word/2012/wordml" xmlns:w16cex="http://schemas.microsoft.com/office/word/2018/wordml/cex" xmlns:w16cid="http://schemas.microsoft.com/office/word/2016/wordml/cid" xmlns:w16="http://schemas.microsoft.com/office/word/2018/wordml" xmlns:w16du="http://schemas.microsoft.com/office/word/2023/wordml/word16du" xmlns:w16sdtdh="http://schemas.microsoft.com/office/word/2020/wordml/sdtdatahash" xmlns:w16sdtfl="http://schemas.microsoft.com/office/word/2024/wordml/sdtformatlock" xmlns:w16se="http://schemas.microsoft.com/office/word/2015/wordml/symex" xmlns:wpg="http://schemas.microsoft.com/office/word/2010/wordprocessingGroup" xmlns:wpi="http://schemas.microsoft.com/office/word/2010/wordprocessingInk" xmlns:wne="http://schemas.microsoft.com/office/word/2006/wordml" xmlns:wps="http://schemas.microsoft.com/office/word/2010/wordprocessingShape" mc:Ignorable="w14 w15 w16se w16cid w16 w16cex w16sdtdh w16sdtfl w16du wp14">
   <w16cid:commentId w16cid:paraId="6822A636" w16cid:durableId="2245A1AC"/>
   <w16cid:commentId w16cid:paraId="536124A0" w16cid:durableId="688C74B1"/>
-  <w16cid:commentId w16cid:paraId="740760A7" w16cid:durableId="6F2792A9"/>
   <w16cid:commentId w16cid:paraId="7F4A2096" w16cid:durableId="7AB72728"/>
   <w16cid:commentId w16cid:paraId="1F82E2EF" w16cid:durableId="67B3D12A"/>
   <w16cid:commentId w16cid:paraId="2F6978DB" w16cid:durableId="1608721C"/>

</xml_diff>